<commit_message>
adding more problems module06 ex2,ex3
</commit_message>
<xml_diff>
--- a/subjects/subject_words/java06_es_subject.docx
+++ b/subjects/subject_words/java06_es_subject.docx
@@ -430,7 +430,7 @@
           </mc:Choice>
           <mc:Fallback>
             <w:pict>
-              <v:shape w14:anchorId="6581B1E4" id="Graphic 3" o:spid="_x0000_s1026" style="position:absolute;margin-left:86.45pt;margin-top:20.05pt;width:476.5pt;height:25.2pt;z-index:-251659264;visibility:visible;mso-wrap-style:square;mso-wrap-distance-left:0;mso-wrap-distance-top:0;mso-wrap-distance-right:0;mso-wrap-distance-bottom:0;mso-position-horizontal:absolute;mso-position-horizontal-relative:page;mso-position-vertical:absolute;mso-position-vertical-relative:text;v-text-anchor:top" coordsize="6051550,320040" o:gfxdata="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" path="m6051397,l5594197,,,12,,18605r5594197,l5594197,320040r457200,l6051397,xe" fillcolor="black" stroked="f">
+              <v:shape w14:anchorId="6495BBCE" id="Graphic 3" o:spid="_x0000_s1026" style="position:absolute;margin-left:86.45pt;margin-top:20.05pt;width:476.5pt;height:25.2pt;z-index:-251659264;visibility:visible;mso-wrap-style:square;mso-wrap-distance-left:0;mso-wrap-distance-top:0;mso-wrap-distance-right:0;mso-wrap-distance-bottom:0;mso-position-horizontal:absolute;mso-position-horizontal-relative:page;mso-position-vertical:absolute;mso-position-vertical-relative:text;v-text-anchor:top" coordsize="6051550,320040" o:gfxdata="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" path="m6051397,l5594197,,,12,,18605r5594197,l5594197,320040r457200,l6051397,xe" fillcolor="black" stroked="f">
                 <v:path arrowok="t"/>
                 <w10:wrap type="topAndBottom" anchorx="page"/>
               </v:shape>
@@ -916,23 +916,7 @@
                 <w:noProof/>
                 <w:w w:val="90"/>
               </w:rPr>
-              <w:t>El S</w:t>
-            </w:r>
-            <w:r>
-              <w:rPr>
-                <w:rStyle w:val="Hipervnculo"/>
-                <w:noProof/>
-                <w:w w:val="90"/>
-              </w:rPr>
-              <w:t>e</w:t>
-            </w:r>
-            <w:r>
-              <w:rPr>
-                <w:rStyle w:val="Hipervnculo"/>
-                <w:noProof/>
-                <w:w w:val="90"/>
-              </w:rPr>
-              <w:t>llo de Odín</w:t>
+              <w:t>El Sello de Odín</w:t>
             </w:r>
             <w:r>
               <w:rPr>
@@ -2038,7 +2022,7 @@
           <w:noProof/>
         </w:rPr>
         <w:drawing>
-          <wp:anchor distT="0" distB="0" distL="114300" distR="114300" simplePos="0" relativeHeight="251664384" behindDoc="0" locked="0" layoutInCell="1" allowOverlap="1" wp14:anchorId="23707DFA" wp14:editId="0C4B9D7F">
+          <wp:anchor distT="0" distB="0" distL="114300" distR="114300" simplePos="0" relativeHeight="251660288" behindDoc="0" locked="0" layoutInCell="1" allowOverlap="1" wp14:anchorId="23707DFA" wp14:editId="0C4B9D7F">
             <wp:simplePos x="0" y="0"/>
             <wp:positionH relativeFrom="column">
               <wp:posOffset>5081905</wp:posOffset>
@@ -3298,7 +3282,7 @@
           <w:noProof/>
         </w:rPr>
         <w:drawing>
-          <wp:anchor distT="0" distB="0" distL="114300" distR="114300" simplePos="0" relativeHeight="251650048" behindDoc="0" locked="0" layoutInCell="1" allowOverlap="1" wp14:anchorId="50D4895B" wp14:editId="7EFB4F3E">
+          <wp:anchor distT="0" distB="0" distL="114300" distR="114300" simplePos="0" relativeHeight="251654144" behindDoc="0" locked="0" layoutInCell="1" allowOverlap="1" wp14:anchorId="50D4895B" wp14:editId="7EFB4F3E">
             <wp:simplePos x="0" y="0"/>
             <wp:positionH relativeFrom="column">
               <wp:posOffset>3154680</wp:posOffset>
@@ -4499,7 +4483,7 @@
           </mc:Choice>
           <mc:Fallback>
             <w:pict>
-              <v:group w14:anchorId="4C6C4467" id="Group 15" o:spid="_x0000_s1026" style="width:442.05pt;height:1.6pt;mso-position-horizontal-relative:char;mso-position-vertical-relative:line" coordsize="56140,203" o:gfxdata="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">
+              <v:group w14:anchorId="35DBC4E5" id="Group 15" o:spid="_x0000_s1026" style="width:442.05pt;height:1.6pt;mso-position-horizontal-relative:char;mso-position-vertical-relative:line" coordsize="56140,203" o:gfxdata="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">
                 <v:shape id="Graphic 16" o:spid="_x0000_s1027" style="position:absolute;width:56127;height:196;visibility:visible;mso-wrap-style:square;v-text-anchor:top" coordsize="5612765,19685" o:gfxdata="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" path="m5612765,l,,,19685r5612765,l5612765,xe" fillcolor="#9f9f9f" stroked="f">
                   <v:path arrowok="t"/>
                 </v:shape>
@@ -5387,7 +5371,7 @@
         <mc:AlternateContent>
           <mc:Choice Requires="wps">
             <w:drawing>
-              <wp:anchor distT="0" distB="0" distL="114300" distR="114300" simplePos="0" relativeHeight="251645952" behindDoc="0" locked="0" layoutInCell="1" allowOverlap="1" wp14:anchorId="1C4D31BE" wp14:editId="21273C28">
+              <wp:anchor distT="0" distB="0" distL="114300" distR="114300" simplePos="0" relativeHeight="251652096" behindDoc="0" locked="0" layoutInCell="1" allowOverlap="1" wp14:anchorId="1C4D31BE" wp14:editId="21273C28">
                 <wp:simplePos x="0" y="0"/>
                 <wp:positionH relativeFrom="margin">
                   <wp:posOffset>400050</wp:posOffset>
@@ -5549,7 +5533,7 @@
           </mc:Choice>
           <mc:Fallback>
             <w:pict>
-              <v:rect w14:anchorId="1C4D31BE" id="Rectángulo 2" o:spid="_x0000_s1026" style="position:absolute;left:0;text-align:left;margin-left:31.5pt;margin-top:6pt;width:434.25pt;height:33pt;z-index:251645952;visibility:visible;mso-wrap-style:square;mso-width-percent:0;mso-height-percent:0;mso-wrap-distance-left:9pt;mso-wrap-distance-top:0;mso-wrap-distance-right:9pt;mso-wrap-distance-bottom:0;mso-position-horizontal:absolute;mso-position-horizontal-relative:margin;mso-position-vertical:absolute;mso-position-vertical-relative:text;mso-width-percent:0;mso-height-percent:0;mso-width-relative:margin;mso-height-relative:margin;v-text-anchor:middle" o:gfxdata="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" fillcolor="black [3213]" strokecolor="black [3213]" strokeweight="2pt">
+              <v:rect w14:anchorId="1C4D31BE" id="Rectángulo 2" o:spid="_x0000_s1026" style="position:absolute;left:0;text-align:left;margin-left:31.5pt;margin-top:6pt;width:434.25pt;height:33pt;z-index:251652096;visibility:visible;mso-wrap-style:square;mso-width-percent:0;mso-height-percent:0;mso-wrap-distance-left:9pt;mso-wrap-distance-top:0;mso-wrap-distance-right:9pt;mso-wrap-distance-bottom:0;mso-position-horizontal:absolute;mso-position-horizontal-relative:margin;mso-position-vertical:absolute;mso-position-vertical-relative:text;mso-width-percent:0;mso-height-percent:0;mso-width-relative:margin;mso-height-relative:margin;v-text-anchor:middle" o:gfxdata="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" fillcolor="black [3213]" strokecolor="black [3213]" strokeweight="2pt">
                 <v:textbox>
                   <w:txbxContent>
                     <w:p>
@@ -5993,42 +5977,53 @@
         </w:tabs>
         <w:spacing w:before="2" w:line="252" w:lineRule="auto"/>
         <w:ind w:right="1461"/>
-      </w:pPr>
-      <w:r>
         <w:rPr>
           <w:bCs/>
           <w:i/>
           <w:iCs/>
         </w:rPr>
-        <w:t xml:space="preserve">Debes convertir el resultado de </w:t>
-      </w:r>
-      <w:proofErr w:type="spellStart"/>
-      <w:proofErr w:type="gramStart"/>
+      </w:pPr>
       <w:r>
         <w:rPr>
           <w:bCs/>
           <w:i/>
           <w:iCs/>
         </w:rPr>
-        <w:t>readObject</w:t>
+        <w:t xml:space="preserve">Debes convertir el resultado de </w:t>
+      </w:r>
+      <w:proofErr w:type="spellStart"/>
+      <w:r>
+        <w:rPr>
+          <w:b/>
+          <w:i/>
+          <w:iCs/>
+        </w:rPr>
+        <w:t>objIn.readObject</w:t>
       </w:r>
       <w:proofErr w:type="spellEnd"/>
+      <w:r>
+        <w:rPr>
+          <w:b/>
+          <w:i/>
+          <w:iCs/>
+        </w:rPr>
+        <w:t>()</w:t>
+      </w:r>
       <w:r>
         <w:rPr>
           <w:bCs/>
           <w:i/>
           <w:iCs/>
         </w:rPr>
-        <w:t>(</w:t>
-      </w:r>
-      <w:proofErr w:type="gramEnd"/>
+        <w:t xml:space="preserve"> </w:t>
+      </w:r>
       <w:r>
         <w:rPr>
           <w:bCs/>
           <w:i/>
           <w:iCs/>
         </w:rPr>
-        <w:t xml:space="preserve">) al tipo </w:t>
+        <w:t xml:space="preserve">al tipo </w:t>
       </w:r>
       <w:proofErr w:type="spellStart"/>
       <w:r>
@@ -6554,7 +6549,7 @@
         <mc:AlternateContent>
           <mc:Choice Requires="wps">
             <w:drawing>
-              <wp:anchor distT="0" distB="0" distL="114300" distR="114300" simplePos="0" relativeHeight="251648000" behindDoc="0" locked="0" layoutInCell="1" allowOverlap="1" wp14:anchorId="6EEA5942" wp14:editId="793B9CCD">
+              <wp:anchor distT="0" distB="0" distL="114300" distR="114300" simplePos="0" relativeHeight="251653120" behindDoc="0" locked="0" layoutInCell="1" allowOverlap="1" wp14:anchorId="6EEA5942" wp14:editId="793B9CCD">
                 <wp:simplePos x="0" y="0"/>
                 <wp:positionH relativeFrom="margin">
                   <wp:posOffset>402771</wp:posOffset>
@@ -6670,7 +6665,7 @@
           </mc:Choice>
           <mc:Fallback>
             <w:pict>
-              <v:rect w14:anchorId="6EEA5942" id="_x0000_s1027" style="position:absolute;left:0;text-align:left;margin-left:31.7pt;margin-top:5.7pt;width:434.5pt;height:23.15pt;z-index:251648000;visibility:visible;mso-wrap-style:square;mso-width-percent:0;mso-height-percent:0;mso-wrap-distance-left:9pt;mso-wrap-distance-top:0;mso-wrap-distance-right:9pt;mso-wrap-distance-bottom:0;mso-position-horizontal:absolute;mso-position-horizontal-relative:margin;mso-position-vertical:absolute;mso-position-vertical-relative:text;mso-width-percent:0;mso-height-percent:0;mso-width-relative:margin;mso-height-relative:margin;v-text-anchor:middle" o:gfxdata="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" fillcolor="black [3213]" strokecolor="black [3213]" strokeweight="2pt">
+              <v:rect w14:anchorId="6EEA5942" id="_x0000_s1027" style="position:absolute;left:0;text-align:left;margin-left:31.7pt;margin-top:5.7pt;width:434.5pt;height:23.15pt;z-index:251653120;visibility:visible;mso-wrap-style:square;mso-width-percent:0;mso-height-percent:0;mso-wrap-distance-left:9pt;mso-wrap-distance-top:0;mso-wrap-distance-right:9pt;mso-wrap-distance-bottom:0;mso-position-horizontal:absolute;mso-position-horizontal-relative:margin;mso-position-vertical:absolute;mso-position-vertical-relative:text;mso-width-percent:0;mso-height-percent:0;mso-width-relative:margin;mso-height-relative:margin;v-text-anchor:middle" o:gfxdata="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" fillcolor="black [3213]" strokecolor="black [3213]" strokeweight="2pt">
                 <v:textbox>
                   <w:txbxContent>
                     <w:p>
@@ -6764,9 +6759,6 @@
           <w:numId w:val="6"/>
         </w:numPr>
         <w:jc w:val="left"/>
-        <w:rPr>
-          <w:highlight w:val="yellow"/>
-        </w:rPr>
       </w:pPr>
       <w:bookmarkStart w:id="10" w:name="_bookmark5"/>
       <w:bookmarkStart w:id="11" w:name="_Toc236321498"/>
@@ -6774,7 +6766,6 @@
       <w:r>
         <w:rPr>
           <w:w w:val="90"/>
-          <w:highlight w:val="yellow"/>
         </w:rPr>
         <w:lastRenderedPageBreak/>
         <w:t>Ejercicio</w:t>
@@ -6783,14 +6774,12 @@
         <w:rPr>
           <w:spacing w:val="-5"/>
           <w:w w:val="90"/>
-          <w:highlight w:val="yellow"/>
         </w:rPr>
         <w:t xml:space="preserve"> </w:t>
       </w:r>
       <w:r>
         <w:rPr>
           <w:w w:val="90"/>
-          <w:highlight w:val="yellow"/>
         </w:rPr>
         <w:t>2:</w:t>
       </w:r>
@@ -6798,7 +6787,6 @@
         <w:rPr>
           <w:spacing w:val="-4"/>
           <w:w w:val="90"/>
-          <w:highlight w:val="yellow"/>
         </w:rPr>
         <w:t xml:space="preserve"> </w:t>
       </w:r>
@@ -6806,7 +6794,6 @@
         <w:rPr>
           <w:spacing w:val="-4"/>
           <w:w w:val="90"/>
-          <w:highlight w:val="yellow"/>
         </w:rPr>
         <w:t>La Runa Olvidada (</w:t>
       </w:r>
@@ -6817,7 +6804,6 @@
           <w:iCs w:val="0"/>
           <w:spacing w:val="-4"/>
           <w:w w:val="90"/>
-          <w:highlight w:val="yellow"/>
         </w:rPr>
         <w:t>serialVersionUID</w:t>
       </w:r>
@@ -6826,7 +6812,6 @@
         <w:rPr>
           <w:spacing w:val="-4"/>
           <w:w w:val="90"/>
-          <w:highlight w:val="yellow"/>
         </w:rPr>
         <w:t>)</w:t>
       </w:r>
@@ -7089,6 +7074,10 @@
           <w:numId w:val="32"/>
         </w:numPr>
         <w:rPr>
+          <w:b/>
+          <w:bCs/>
+          <w:i/>
+          <w:iCs/>
           <w:lang w:val="es-ES"/>
         </w:rPr>
       </w:pPr>
@@ -7098,24 +7087,98 @@
         </w:rPr>
         <w:t>Debes declarar explícitamente el atributo:</w:t>
       </w:r>
-    </w:p>
-    <w:p>
-      <w:pPr>
-        <w:pStyle w:val="Sinespaciado"/>
-        <w:numPr>
-          <w:ilvl w:val="0"/>
-          <w:numId w:val="32"/>
-        </w:numPr>
-      </w:pPr>
-      <w:r>
-        <w:t xml:space="preserve">private static final long </w:t>
+      <w:r>
+        <w:rPr>
+          <w:lang w:val="es-ES"/>
+        </w:rPr>
+        <w:t xml:space="preserve"> </w:t>
       </w:r>
       <w:proofErr w:type="spellStart"/>
       <w:r>
+        <w:rPr>
+          <w:b/>
+          <w:bCs/>
+          <w:i/>
+          <w:iCs/>
+          <w:lang w:val="es-ES"/>
+        </w:rPr>
+        <w:t>private</w:t>
+      </w:r>
+      <w:proofErr w:type="spellEnd"/>
+      <w:r>
+        <w:rPr>
+          <w:b/>
+          <w:bCs/>
+          <w:i/>
+          <w:iCs/>
+          <w:lang w:val="es-ES"/>
+        </w:rPr>
+        <w:t xml:space="preserve"> </w:t>
+      </w:r>
+      <w:proofErr w:type="spellStart"/>
+      <w:r>
+        <w:rPr>
+          <w:b/>
+          <w:bCs/>
+          <w:i/>
+          <w:iCs/>
+          <w:lang w:val="es-ES"/>
+        </w:rPr>
+        <w:t>static</w:t>
+      </w:r>
+      <w:proofErr w:type="spellEnd"/>
+      <w:r>
+        <w:rPr>
+          <w:b/>
+          <w:bCs/>
+          <w:i/>
+          <w:iCs/>
+          <w:lang w:val="es-ES"/>
+        </w:rPr>
+        <w:t xml:space="preserve"> final </w:t>
+      </w:r>
+      <w:proofErr w:type="spellStart"/>
+      <w:r>
+        <w:rPr>
+          <w:b/>
+          <w:bCs/>
+          <w:i/>
+          <w:iCs/>
+          <w:lang w:val="es-ES"/>
+        </w:rPr>
+        <w:t>long</w:t>
+      </w:r>
+      <w:proofErr w:type="spellEnd"/>
+      <w:r>
+        <w:rPr>
+          <w:b/>
+          <w:bCs/>
+          <w:i/>
+          <w:iCs/>
+          <w:lang w:val="es-ES"/>
+        </w:rPr>
+        <w:t xml:space="preserve"> </w:t>
+      </w:r>
+      <w:proofErr w:type="spellStart"/>
+      <w:r>
+        <w:rPr>
+          <w:b/>
+          <w:bCs/>
+          <w:i/>
+          <w:iCs/>
+          <w:lang w:val="es-ES"/>
+        </w:rPr>
         <w:t>serialVersionUID</w:t>
       </w:r>
       <w:proofErr w:type="spellEnd"/>
       <w:r>
+        <w:rPr>
+          <w:b/>
+          <w:bCs/>
+          <w:i/>
+          <w:iCs/>
+          <w:lang w:val="es-ES"/>
+        </w:rPr>
         <w:t xml:space="preserve"> = 1L;</w:t>
       </w:r>
     </w:p>
@@ -7128,7 +7191,6 @@
         <w:rPr>
           <w:b/>
           <w:i/>
-          <w:lang w:val="en-US"/>
         </w:rPr>
       </w:pPr>
     </w:p>
@@ -7159,21 +7221,8 @@
         <w:rPr>
           <w:spacing w:val="-6"/>
         </w:rPr>
-        <w:t>Las reliquias de Asgard pueden permanecer selladas durante siglos. Pero ¿qué ocurre si, mientras permanecen almacenadas, alguien modifica la clase que las representa?</w:t>
-      </w:r>
-      <w:r>
-        <w:rPr>
-          <w:spacing w:val="-6"/>
-        </w:rPr>
-        <w:t xml:space="preserve"> </w:t>
-      </w:r>
-      <w:r>
-        <w:rPr>
-          <w:spacing w:val="-6"/>
-        </w:rPr>
-        <w:t xml:space="preserve">En este ejercicio descubrirás el papel de </w:t>
-      </w:r>
-      <w:proofErr w:type="spellStart"/>
+        <w:t xml:space="preserve">Las reliquias de Asgard pueden permanecer selladas durante siglos. Pero </w:t>
+      </w:r>
       <w:r>
         <w:rPr>
           <w:b/>
@@ -7182,6 +7231,23 @@
           <w:iCs/>
           <w:spacing w:val="-6"/>
         </w:rPr>
+        <w:t xml:space="preserve">¿qué ocurre si, mientras permanecen almacenadas, alguien modifica la clase que las representa? </w:t>
+      </w:r>
+      <w:r>
+        <w:rPr>
+          <w:spacing w:val="-6"/>
+        </w:rPr>
+        <w:t xml:space="preserve">En este ejercicio descubrirás el papel de </w:t>
+      </w:r>
+      <w:proofErr w:type="spellStart"/>
+      <w:r>
+        <w:rPr>
+          <w:b/>
+          <w:bCs/>
+          <w:i/>
+          <w:iCs/>
+          <w:spacing w:val="-6"/>
+        </w:rPr>
         <w:t>serialVersionUID</w:t>
       </w:r>
       <w:proofErr w:type="spellEnd"/>
@@ -7216,67 +7282,62 @@
     </w:p>
     <w:p>
       <w:pPr>
+        <w:pStyle w:val="Prrafodelista"/>
         <w:numPr>
           <w:ilvl w:val="0"/>
           <w:numId w:val="33"/>
         </w:numPr>
-        <w:tabs>
-          <w:tab w:val="num" w:pos="720"/>
-        </w:tabs>
         <w:rPr>
           <w:spacing w:val="-6"/>
-          <w:lang w:val="en-US"/>
-        </w:rPr>
-      </w:pPr>
+        </w:rPr>
+      </w:pPr>
+      <w:r>
+        <w:rPr>
+          <w:spacing w:val="-6"/>
+        </w:rPr>
+        <w:t xml:space="preserve">El ejercicio trata de 3 diferentes casos, lo cual no es necesario que se cumpla la salida, solo es de ejemplo, la idea principal es la 3 formas de hacerlo, tendrás que modificar </w:t>
+      </w:r>
       <w:proofErr w:type="spellStart"/>
       <w:r>
         <w:rPr>
-          <w:b/>
-          <w:bCs/>
           <w:spacing w:val="-6"/>
-          <w:lang w:val="en-US"/>
-        </w:rPr>
-        <w:t>Serializa</w:t>
+        </w:rPr>
+        <w:t>RuneStone</w:t>
       </w:r>
       <w:proofErr w:type="spellEnd"/>
       <w:r>
         <w:rPr>
           <w:spacing w:val="-6"/>
-          <w:lang w:val="en-US"/>
-        </w:rPr>
-        <w:t xml:space="preserve"> un </w:t>
+        </w:rPr>
+        <w:t xml:space="preserve"> y </w:t>
       </w:r>
       <w:proofErr w:type="spellStart"/>
       <w:r>
         <w:rPr>
           <w:spacing w:val="-6"/>
-          <w:lang w:val="en-US"/>
-        </w:rPr>
-        <w:t>objeto</w:t>
+        </w:rPr>
+        <w:t>RuneMismatch</w:t>
       </w:r>
       <w:proofErr w:type="spellEnd"/>
       <w:r>
         <w:rPr>
           <w:spacing w:val="-6"/>
-          <w:lang w:val="en-US"/>
-        </w:rPr>
-        <w:t xml:space="preserve"> </w:t>
+        </w:rPr>
+        <w:t xml:space="preserve"> varias veces para poder realizar el problema, solo dejar la </w:t>
       </w:r>
       <w:proofErr w:type="spellStart"/>
       <w:r>
         <w:rPr>
           <w:spacing w:val="-6"/>
-          <w:lang w:val="en-US"/>
-        </w:rPr>
-        <w:t>RuneStone</w:t>
+        </w:rPr>
+        <w:t>ultima</w:t>
       </w:r>
       <w:proofErr w:type="spellEnd"/>
       <w:r>
         <w:rPr>
           <w:spacing w:val="-6"/>
-          <w:lang w:val="en-US"/>
-        </w:rPr>
-        <w:t>.</w:t>
+        </w:rPr>
+        <w:t xml:space="preserve"> manera.</w:t>
       </w:r>
     </w:p>
     <w:p>
@@ -7290,13 +7351,80 @@
         </w:tabs>
         <w:rPr>
           <w:spacing w:val="-6"/>
-        </w:rPr>
-      </w:pPr>
+          <w:lang w:val="en-US"/>
+        </w:rPr>
+      </w:pPr>
+      <w:proofErr w:type="spellStart"/>
       <w:r>
         <w:rPr>
           <w:b/>
           <w:bCs/>
           <w:spacing w:val="-6"/>
+          <w:lang w:val="en-US"/>
+        </w:rPr>
+        <w:t>Serializa</w:t>
+      </w:r>
+      <w:proofErr w:type="spellEnd"/>
+      <w:r>
+        <w:rPr>
+          <w:spacing w:val="-6"/>
+          <w:lang w:val="en-US"/>
+        </w:rPr>
+        <w:t xml:space="preserve"> un </w:t>
+      </w:r>
+      <w:proofErr w:type="spellStart"/>
+      <w:r>
+        <w:rPr>
+          <w:spacing w:val="-6"/>
+          <w:lang w:val="en-US"/>
+        </w:rPr>
+        <w:t>objeto</w:t>
+      </w:r>
+      <w:proofErr w:type="spellEnd"/>
+      <w:r>
+        <w:rPr>
+          <w:spacing w:val="-6"/>
+          <w:lang w:val="en-US"/>
+        </w:rPr>
+        <w:t xml:space="preserve"> </w:t>
+      </w:r>
+      <w:proofErr w:type="spellStart"/>
+      <w:r>
+        <w:rPr>
+          <w:b/>
+          <w:bCs/>
+          <w:spacing w:val="-6"/>
+          <w:lang w:val="en-US"/>
+        </w:rPr>
+        <w:t>RuneStone</w:t>
+      </w:r>
+      <w:proofErr w:type="spellEnd"/>
+      <w:r>
+        <w:rPr>
+          <w:spacing w:val="-6"/>
+          <w:lang w:val="en-US"/>
+        </w:rPr>
+        <w:t>.</w:t>
+      </w:r>
+    </w:p>
+    <w:p>
+      <w:pPr>
+        <w:numPr>
+          <w:ilvl w:val="0"/>
+          <w:numId w:val="33"/>
+        </w:numPr>
+        <w:tabs>
+          <w:tab w:val="num" w:pos="720"/>
+        </w:tabs>
+        <w:rPr>
+          <w:spacing w:val="-6"/>
+        </w:rPr>
+      </w:pPr>
+      <w:r>
+        <w:rPr>
+          <w:b/>
+          <w:bCs/>
+          <w:spacing w:val="-6"/>
         </w:rPr>
         <w:t>Modifica la clase</w:t>
       </w:r>
@@ -7309,6 +7437,8 @@
       <w:proofErr w:type="spellStart"/>
       <w:r>
         <w:rPr>
+          <w:b/>
+          <w:bCs/>
           <w:spacing w:val="-6"/>
         </w:rPr>
         <w:t>deserializar</w:t>
@@ -7505,12 +7635,75 @@
         <w:t>serializable</w:t>
       </w:r>
       <w:proofErr w:type="spellEnd"/>
-      <w:r>
+    </w:p>
+    <w:p>
+      <w:pPr>
+        <w:numPr>
+          <w:ilvl w:val="1"/>
+          <w:numId w:val="35"/>
+        </w:numPr>
         <w:rPr>
           <w:spacing w:val="-6"/>
         </w:rPr>
-        <w:t>.</w:t>
-      </w:r>
+      </w:pPr>
+      <w:r>
+        <w:rPr>
+          <w:spacing w:val="-6"/>
+        </w:rPr>
+        <w:t xml:space="preserve">Antes: </w:t>
+      </w:r>
+      <w:proofErr w:type="spellStart"/>
+      <w:r>
+        <w:rPr>
+          <w:b/>
+          <w:bCs/>
+          <w:i/>
+          <w:iCs/>
+          <w:spacing w:val="-6"/>
+        </w:rPr>
+        <w:t>value</w:t>
+      </w:r>
+      <w:proofErr w:type="spellEnd"/>
+      <w:r>
+        <w:rPr>
+          <w:spacing w:val="-6"/>
+        </w:rPr>
+        <w:t xml:space="preserve"> -&gt; Después: </w:t>
+      </w:r>
+      <w:proofErr w:type="spellStart"/>
+      <w:r>
+        <w:rPr>
+          <w:b/>
+          <w:bCs/>
+          <w:i/>
+          <w:iCs/>
+          <w:spacing w:val="-6"/>
+        </w:rPr>
+        <w:t>value</w:t>
+      </w:r>
+      <w:proofErr w:type="spellEnd"/>
+      <w:r>
+        <w:rPr>
+          <w:b/>
+          <w:bCs/>
+          <w:i/>
+          <w:iCs/>
+          <w:spacing w:val="-6"/>
+        </w:rPr>
+        <w:t xml:space="preserve">, </w:t>
+      </w:r>
+      <w:proofErr w:type="spellStart"/>
+      <w:r>
+        <w:rPr>
+          <w:b/>
+          <w:bCs/>
+          <w:i/>
+          <w:iCs/>
+          <w:spacing w:val="-6"/>
+        </w:rPr>
+        <w:t>name</w:t>
+      </w:r>
+      <w:proofErr w:type="spellEnd"/>
     </w:p>
     <w:p>
       <w:pPr>
@@ -7747,16 +7940,16 @@
         <mc:AlternateContent>
           <mc:Choice Requires="wps">
             <w:drawing>
-              <wp:anchor distT="0" distB="0" distL="114300" distR="114300" simplePos="0" relativeHeight="251655168" behindDoc="0" locked="0" layoutInCell="1" allowOverlap="1" wp14:anchorId="58BA83F3" wp14:editId="6DF5E4EB">
+              <wp:anchor distT="0" distB="0" distL="114300" distR="114300" simplePos="0" relativeHeight="251656192" behindDoc="0" locked="0" layoutInCell="1" allowOverlap="1" wp14:anchorId="58BA83F3" wp14:editId="38FBACBB">
                 <wp:simplePos x="0" y="0"/>
                 <wp:positionH relativeFrom="margin">
-                  <wp:posOffset>391886</wp:posOffset>
+                  <wp:posOffset>390525</wp:posOffset>
                 </wp:positionH>
                 <wp:positionV relativeFrom="paragraph">
-                  <wp:posOffset>76381</wp:posOffset>
+                  <wp:posOffset>80010</wp:posOffset>
                 </wp:positionV>
-                <wp:extent cx="5518205" cy="544286"/>
-                <wp:effectExtent l="0" t="0" r="25400" b="27305"/>
+                <wp:extent cx="5518205" cy="742950"/>
+                <wp:effectExtent l="0" t="0" r="25400" b="19050"/>
                 <wp:wrapNone/>
                 <wp:docPr id="2088680350" name="Rectángulo 2"/>
                 <wp:cNvGraphicFramePr/>
@@ -7767,7 +7960,7 @@
                       <wps:spPr>
                         <a:xfrm>
                           <a:off x="0" y="0"/>
-                          <a:ext cx="5518205" cy="544286"/>
+                          <a:ext cx="5518205" cy="742950"/>
                         </a:xfrm>
                         <a:prstGeom prst="rect">
                           <a:avLst/>
@@ -7804,31 +7997,74 @@
                               <w:pStyle w:val="Sinespaciado"/>
                               <w:rPr>
                                 <w:rFonts w:ascii="Cascadia Mono SemiBold" w:hAnsi="Cascadia Mono SemiBold" w:cs="Cascadia Mono SemiBold"/>
+                                <w:lang w:val="es-ES"/>
                               </w:rPr>
                             </w:pPr>
                             <w:r>
                               <w:rPr>
                                 <w:rFonts w:ascii="Cascadia Mono SemiBold" w:hAnsi="Cascadia Mono SemiBold" w:cs="Cascadia Mono SemiBold"/>
+                                <w:lang w:val="es-ES"/>
                               </w:rPr>
-                              <w:t xml:space="preserve">Exception in thread "main" </w:t>
+                              <w:t>PS C:\Users\Sergio URJC\</w:t>
                             </w:r>
                             <w:proofErr w:type="spellStart"/>
-                            <w:proofErr w:type="gramStart"/>
                             <w:r>
                               <w:rPr>
                                 <w:rFonts w:ascii="Cascadia Mono SemiBold" w:hAnsi="Cascadia Mono SemiBold" w:cs="Cascadia Mono SemiBold"/>
+                                <w:lang w:val="es-ES"/>
                               </w:rPr>
-                              <w:t>java.io.InvalidClassException</w:t>
+                              <w:t>Documents</w:t>
                             </w:r>
                             <w:proofErr w:type="spellEnd"/>
-                            <w:proofErr w:type="gramEnd"/>
                             <w:r>
                               <w:rPr>
                                 <w:rFonts w:ascii="Cascadia Mono SemiBold" w:hAnsi="Cascadia Mono SemiBold" w:cs="Cascadia Mono SemiBold"/>
+                                <w:lang w:val="es-ES"/>
                               </w:rPr>
-                              <w:t xml:space="preserve">: </w:t>
+                              <w:t>\</w:t>
                             </w:r>
                             <w:proofErr w:type="spellStart"/>
+                            <w:r>
+                              <w:rPr>
+                                <w:rFonts w:ascii="Cascadia Mono SemiBold" w:hAnsi="Cascadia Mono SemiBold" w:cs="Cascadia Mono SemiBold"/>
+                                <w:lang w:val="es-ES"/>
+                              </w:rPr>
+                              <w:t>java_modules</w:t>
+                            </w:r>
+                            <w:proofErr w:type="spellEnd"/>
+                            <w:r>
+                              <w:rPr>
+                                <w:rFonts w:ascii="Cascadia Mono SemiBold" w:hAnsi="Cascadia Mono SemiBold" w:cs="Cascadia Mono SemiBold"/>
+                                <w:lang w:val="es-ES"/>
+                              </w:rPr>
+                              <w:t>\</w:t>
+                            </w:r>
+                            <w:proofErr w:type="spellStart"/>
+                            <w:r>
+                              <w:rPr>
+                                <w:rFonts w:ascii="Cascadia Mono SemiBold" w:hAnsi="Cascadia Mono SemiBold" w:cs="Cascadia Mono SemiBold"/>
+                                <w:lang w:val="es-ES"/>
+                              </w:rPr>
+                              <w:t>src</w:t>
+                            </w:r>
+                            <w:proofErr w:type="spellEnd"/>
+                            <w:r>
+                              <w:rPr>
+                                <w:rFonts w:ascii="Cascadia Mono SemiBold" w:hAnsi="Cascadia Mono SemiBold" w:cs="Cascadia Mono SemiBold"/>
+                                <w:lang w:val="es-ES"/>
+                              </w:rPr>
+                              <w:t>\ex2&gt; java .\RuneMismatch.java</w:t>
+                            </w:r>
+                          </w:p>
+                          <w:p>
+                            <w:pPr>
+                              <w:pStyle w:val="Sinespaciado"/>
+                              <w:rPr>
+                                <w:rFonts w:ascii="Cascadia Mono SemiBold" w:hAnsi="Cascadia Mono SemiBold" w:cs="Cascadia Mono SemiBold"/>
+                              </w:rPr>
+                            </w:pPr>
+                            <w:proofErr w:type="spellStart"/>
+                            <w:proofErr w:type="gramStart"/>
                             <w:r>
                               <w:rPr>
                                 <w:rFonts w:ascii="Cascadia Mono SemiBold" w:hAnsi="Cascadia Mono SemiBold" w:cs="Cascadia Mono SemiBold"/>
@@ -7840,7 +8076,14 @@
                               <w:rPr>
                                 <w:rFonts w:ascii="Cascadia Mono SemiBold" w:hAnsi="Cascadia Mono SemiBold" w:cs="Cascadia Mono SemiBold"/>
                               </w:rPr>
-                              <w:t>; local class incompatible</w:t>
+                              <w:t>{</w:t>
+                            </w:r>
+                            <w:proofErr w:type="gramEnd"/>
+                            <w:r>
+                              <w:rPr>
+                                <w:rFonts w:ascii="Cascadia Mono SemiBold" w:hAnsi="Cascadia Mono SemiBold" w:cs="Cascadia Mono SemiBold"/>
+                              </w:rPr>
+                              <w:t>value=20, name='null'}</w:t>
                             </w:r>
                           </w:p>
                         </w:txbxContent>
@@ -7865,7 +8108,7 @@
           </mc:Choice>
           <mc:Fallback>
             <w:pict>
-              <v:rect w14:anchorId="58BA83F3" id="_x0000_s1028" style="position:absolute;left:0;text-align:left;margin-left:30.85pt;margin-top:6pt;width:434.5pt;height:42.85pt;z-index:251655168;visibility:visible;mso-wrap-style:square;mso-width-percent:0;mso-height-percent:0;mso-wrap-distance-left:9pt;mso-wrap-distance-top:0;mso-wrap-distance-right:9pt;mso-wrap-distance-bottom:0;mso-position-horizontal:absolute;mso-position-horizontal-relative:margin;mso-position-vertical:absolute;mso-position-vertical-relative:text;mso-width-percent:0;mso-height-percent:0;mso-width-relative:margin;mso-height-relative:margin;v-text-anchor:middle" o:gfxdata="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" fillcolor="black [3213]" strokecolor="black [3213]" strokeweight="2pt">
+              <v:rect w14:anchorId="58BA83F3" id="_x0000_s1028" style="position:absolute;left:0;text-align:left;margin-left:30.75pt;margin-top:6.3pt;width:434.5pt;height:58.5pt;z-index:251656192;visibility:visible;mso-wrap-style:square;mso-width-percent:0;mso-height-percent:0;mso-wrap-distance-left:9pt;mso-wrap-distance-top:0;mso-wrap-distance-right:9pt;mso-wrap-distance-bottom:0;mso-position-horizontal:absolute;mso-position-horizontal-relative:margin;mso-position-vertical:absolute;mso-position-vertical-relative:text;mso-width-percent:0;mso-height-percent:0;mso-width-relative:margin;mso-height-relative:margin;v-text-anchor:middle" o:gfxdata="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" fillcolor="black [3213]" strokecolor="black [3213]" strokeweight="2pt">
                 <v:textbox>
                   <w:txbxContent>
                     <w:p>
@@ -7873,31 +8116,74 @@
                         <w:pStyle w:val="Sinespaciado"/>
                         <w:rPr>
                           <w:rFonts w:ascii="Cascadia Mono SemiBold" w:hAnsi="Cascadia Mono SemiBold" w:cs="Cascadia Mono SemiBold"/>
+                          <w:lang w:val="es-ES"/>
                         </w:rPr>
                       </w:pPr>
                       <w:r>
                         <w:rPr>
                           <w:rFonts w:ascii="Cascadia Mono SemiBold" w:hAnsi="Cascadia Mono SemiBold" w:cs="Cascadia Mono SemiBold"/>
+                          <w:lang w:val="es-ES"/>
                         </w:rPr>
-                        <w:t xml:space="preserve">Exception in thread "main" </w:t>
+                        <w:t>PS C:\Users\Sergio URJC\</w:t>
                       </w:r>
                       <w:proofErr w:type="spellStart"/>
-                      <w:proofErr w:type="gramStart"/>
                       <w:r>
                         <w:rPr>
                           <w:rFonts w:ascii="Cascadia Mono SemiBold" w:hAnsi="Cascadia Mono SemiBold" w:cs="Cascadia Mono SemiBold"/>
+                          <w:lang w:val="es-ES"/>
                         </w:rPr>
-                        <w:t>java.io.InvalidClassException</w:t>
+                        <w:t>Documents</w:t>
                       </w:r>
                       <w:proofErr w:type="spellEnd"/>
-                      <w:proofErr w:type="gramEnd"/>
                       <w:r>
                         <w:rPr>
                           <w:rFonts w:ascii="Cascadia Mono SemiBold" w:hAnsi="Cascadia Mono SemiBold" w:cs="Cascadia Mono SemiBold"/>
+                          <w:lang w:val="es-ES"/>
                         </w:rPr>
-                        <w:t xml:space="preserve">: </w:t>
+                        <w:t>\</w:t>
                       </w:r>
                       <w:proofErr w:type="spellStart"/>
+                      <w:r>
+                        <w:rPr>
+                          <w:rFonts w:ascii="Cascadia Mono SemiBold" w:hAnsi="Cascadia Mono SemiBold" w:cs="Cascadia Mono SemiBold"/>
+                          <w:lang w:val="es-ES"/>
+                        </w:rPr>
+                        <w:t>java_modules</w:t>
+                      </w:r>
+                      <w:proofErr w:type="spellEnd"/>
+                      <w:r>
+                        <w:rPr>
+                          <w:rFonts w:ascii="Cascadia Mono SemiBold" w:hAnsi="Cascadia Mono SemiBold" w:cs="Cascadia Mono SemiBold"/>
+                          <w:lang w:val="es-ES"/>
+                        </w:rPr>
+                        <w:t>\</w:t>
+                      </w:r>
+                      <w:proofErr w:type="spellStart"/>
+                      <w:r>
+                        <w:rPr>
+                          <w:rFonts w:ascii="Cascadia Mono SemiBold" w:hAnsi="Cascadia Mono SemiBold" w:cs="Cascadia Mono SemiBold"/>
+                          <w:lang w:val="es-ES"/>
+                        </w:rPr>
+                        <w:t>src</w:t>
+                      </w:r>
+                      <w:proofErr w:type="spellEnd"/>
+                      <w:r>
+                        <w:rPr>
+                          <w:rFonts w:ascii="Cascadia Mono SemiBold" w:hAnsi="Cascadia Mono SemiBold" w:cs="Cascadia Mono SemiBold"/>
+                          <w:lang w:val="es-ES"/>
+                        </w:rPr>
+                        <w:t>\ex2&gt; java .\RuneMismatch.java</w:t>
+                      </w:r>
+                    </w:p>
+                    <w:p>
+                      <w:pPr>
+                        <w:pStyle w:val="Sinespaciado"/>
+                        <w:rPr>
+                          <w:rFonts w:ascii="Cascadia Mono SemiBold" w:hAnsi="Cascadia Mono SemiBold" w:cs="Cascadia Mono SemiBold"/>
+                        </w:rPr>
+                      </w:pPr>
+                      <w:proofErr w:type="spellStart"/>
+                      <w:proofErr w:type="gramStart"/>
                       <w:r>
                         <w:rPr>
                           <w:rFonts w:ascii="Cascadia Mono SemiBold" w:hAnsi="Cascadia Mono SemiBold" w:cs="Cascadia Mono SemiBold"/>
@@ -7909,7 +8195,14 @@
                         <w:rPr>
                           <w:rFonts w:ascii="Cascadia Mono SemiBold" w:hAnsi="Cascadia Mono SemiBold" w:cs="Cascadia Mono SemiBold"/>
                         </w:rPr>
-                        <w:t>; local class incompatible</w:t>
+                        <w:t>{</w:t>
+                      </w:r>
+                      <w:proofErr w:type="gramEnd"/>
+                      <w:r>
+                        <w:rPr>
+                          <w:rFonts w:ascii="Cascadia Mono SemiBold" w:hAnsi="Cascadia Mono SemiBold" w:cs="Cascadia Mono SemiBold"/>
+                        </w:rPr>
+                        <w:t>value=20, name='null'}</w:t>
                       </w:r>
                     </w:p>
                   </w:txbxContent>
@@ -8108,8 +8401,57 @@
         <w:rPr>
           <w:spacing w:val="-2"/>
           <w:szCs w:val="24"/>
+          <w:lang w:val="en-US"/>
         </w:rPr>
         <w:t>TreasuryVault.java</w:t>
+      </w:r>
+      <w:r>
+        <w:rPr>
+          <w:spacing w:val="-2"/>
+          <w:szCs w:val="24"/>
+          <w:lang w:val="en-US"/>
+        </w:rPr>
+        <w:t xml:space="preserve">, </w:t>
+      </w:r>
+      <w:r>
+        <w:rPr>
+          <w:spacing w:val="-2"/>
+          <w:szCs w:val="24"/>
+          <w:lang w:val="en-US"/>
+        </w:rPr>
+        <w:t>AsgardianRelic</w:t>
+      </w:r>
+      <w:r>
+        <w:rPr>
+          <w:spacing w:val="-2"/>
+          <w:szCs w:val="24"/>
+          <w:lang w:val="en-US"/>
+        </w:rPr>
+        <w:t>.java</w:t>
+      </w:r>
+      <w:r>
+        <w:rPr>
+          <w:spacing w:val="-2"/>
+          <w:szCs w:val="24"/>
+          <w:lang w:val="en-US"/>
+        </w:rPr>
+        <w:t xml:space="preserve"> </w:t>
+      </w:r>
+      <w:r>
+        <w:rPr>
+          <w:spacing w:val="-2"/>
+          <w:szCs w:val="24"/>
+          <w:lang w:val="en-US"/>
+        </w:rPr>
+        <w:t>(name</w:t>
+      </w:r>
+      <w:r>
+        <w:rPr>
+          <w:spacing w:val="-2"/>
+          <w:szCs w:val="24"/>
+          <w:lang w:val="en-US"/>
+        </w:rPr>
+        <w:t>)</w:t>
       </w:r>
     </w:p>
     <w:p>
@@ -8297,6 +8639,7 @@
         <w:t xml:space="preserve">, </w:t>
       </w:r>
       <w:proofErr w:type="spellStart"/>
+      <w:proofErr w:type="gramStart"/>
       <w:r>
         <w:rPr>
           <w:spacing w:val="-6"/>
@@ -8306,6 +8649,75 @@
         <w:t>ObjectInputStream</w:t>
       </w:r>
       <w:proofErr w:type="spellEnd"/>
+      <w:r>
+        <w:rPr>
+          <w:spacing w:val="-6"/>
+          <w:szCs w:val="24"/>
+          <w:lang w:val="en-US"/>
+        </w:rPr>
+        <w:t xml:space="preserve">, </w:t>
+      </w:r>
+      <w:r>
+        <w:rPr>
+          <w:spacing w:val="-6"/>
+          <w:szCs w:val="24"/>
+          <w:lang w:val="en-US"/>
+        </w:rPr>
+        <w:t>@</w:t>
+      </w:r>
+      <w:proofErr w:type="gramEnd"/>
+      <w:r>
+        <w:rPr>
+          <w:spacing w:val="-6"/>
+          <w:szCs w:val="24"/>
+          <w:lang w:val="en-US"/>
+        </w:rPr>
+        <w:t>SuppressWarnings("unchecked")</w:t>
+      </w:r>
+      <w:r>
+        <w:rPr>
+          <w:spacing w:val="-6"/>
+          <w:szCs w:val="24"/>
+          <w:lang w:val="en-US"/>
+        </w:rPr>
+        <w:t xml:space="preserve">, </w:t>
+      </w:r>
+      <w:proofErr w:type="spellStart"/>
+      <w:proofErr w:type="gramStart"/>
+      <w:r>
+        <w:rPr>
+          <w:spacing w:val="-6"/>
+          <w:szCs w:val="24"/>
+          <w:lang w:val="en-US"/>
+        </w:rPr>
+        <w:t>printStackTrace</w:t>
+      </w:r>
+      <w:proofErr w:type="spellEnd"/>
+      <w:r>
+        <w:rPr>
+          <w:spacing w:val="-6"/>
+          <w:szCs w:val="24"/>
+          <w:lang w:val="en-US"/>
+        </w:rPr>
+        <w:t>(</w:t>
+      </w:r>
+      <w:proofErr w:type="gramEnd"/>
+      <w:r>
+        <w:rPr>
+          <w:spacing w:val="-6"/>
+          <w:szCs w:val="24"/>
+          <w:lang w:val="en-US"/>
+        </w:rPr>
+        <w:t>)</w:t>
+      </w:r>
+      <w:r>
+        <w:rPr>
+          <w:spacing w:val="-6"/>
+          <w:szCs w:val="24"/>
+          <w:lang w:val="en-US"/>
+        </w:rPr>
+        <w:t>, try/catch, size</w:t>
+      </w:r>
     </w:p>
     <w:p>
       <w:pPr>
@@ -8468,105 +8880,76 @@
     </w:p>
     <w:p>
       <w:pPr>
+        <w:pStyle w:val="Sinespaciado"/>
         <w:ind w:left="622"/>
         <w:rPr>
+          <w:lang w:val="es-ES"/>
+        </w:rPr>
+      </w:pPr>
+      <w:r>
+        <w:rPr>
+          <w:lang w:val="es-ES"/>
+        </w:rPr>
+        <w:t>Odin desea sellar el tesoro de Asgard en un único pergamino mágico (</w:t>
+      </w:r>
+      <w:proofErr w:type="spellStart"/>
+      <w:r>
+        <w:rPr>
+          <w:b/>
           <w:bCs/>
-          <w:spacing w:val="-6"/>
-          <w:szCs w:val="24"/>
-        </w:rPr>
-      </w:pPr>
-      <w:r>
-        <w:rPr>
+          <w:i/>
+          <w:iCs/>
+          <w:lang w:val="es-ES"/>
+        </w:rPr>
+        <w:t>treasury.ser</w:t>
+      </w:r>
+      <w:proofErr w:type="spellEnd"/>
+      <w:r>
+        <w:rPr>
+          <w:lang w:val="es-ES"/>
+        </w:rPr>
+        <w:t>).</w:t>
+      </w:r>
+    </w:p>
+    <w:p>
+      <w:pPr>
+        <w:pStyle w:val="Sinespaciado"/>
+        <w:ind w:left="622"/>
+        <w:rPr>
+          <w:lang w:val="es-ES"/>
+        </w:rPr>
+      </w:pPr>
+      <w:r>
+        <w:rPr>
+          <w:lang w:val="es-ES"/>
+        </w:rPr>
+        <w:t xml:space="preserve">Implementa una clase </w:t>
+      </w:r>
+      <w:proofErr w:type="spellStart"/>
+      <w:r>
+        <w:rPr>
+          <w:b/>
           <w:bCs/>
-          <w:spacing w:val="-6"/>
-          <w:szCs w:val="24"/>
-        </w:rPr>
-        <w:t xml:space="preserve">Debes crear un recurso </w:t>
-      </w:r>
-      <w:proofErr w:type="spellStart"/>
-      <w:r>
-        <w:rPr>
-          <w:bCs/>
-          <w:spacing w:val="-6"/>
-          <w:szCs w:val="24"/>
-        </w:rPr>
-        <w:t>StubbornReactor</w:t>
+          <w:i/>
+          <w:iCs/>
+          <w:lang w:val="es-ES"/>
+        </w:rPr>
+        <w:t>TreasuryVault</w:t>
       </w:r>
       <w:proofErr w:type="spellEnd"/>
       <w:r>
         <w:rPr>
-          <w:bCs/>
-          <w:spacing w:val="-6"/>
-          <w:szCs w:val="24"/>
-        </w:rPr>
-        <w:t xml:space="preserve"> que implemente </w:t>
-      </w:r>
-      <w:proofErr w:type="spellStart"/>
-      <w:r>
-        <w:rPr>
-          <w:bCs/>
-          <w:spacing w:val="-6"/>
-          <w:szCs w:val="24"/>
-        </w:rPr>
-        <w:t>AutoCloseable</w:t>
-      </w:r>
-      <w:proofErr w:type="spellEnd"/>
-      <w:r>
-        <w:rPr>
-          <w:bCs/>
-          <w:spacing w:val="-6"/>
-          <w:szCs w:val="24"/>
-        </w:rPr>
-        <w:t>.</w:t>
-      </w:r>
-    </w:p>
-    <w:p>
-      <w:pPr>
-        <w:ind w:left="622"/>
-        <w:rPr>
-          <w:bCs/>
-          <w:spacing w:val="-6"/>
-          <w:szCs w:val="24"/>
-          <w:lang w:val="en-US"/>
-        </w:rPr>
-      </w:pPr>
-      <w:r>
-        <w:rPr>
-          <w:bCs/>
-          <w:spacing w:val="-6"/>
-          <w:szCs w:val="24"/>
-          <w:lang w:val="en-US"/>
-        </w:rPr>
-        <w:t xml:space="preserve">El reactor </w:t>
-      </w:r>
-      <w:proofErr w:type="spellStart"/>
-      <w:r>
-        <w:rPr>
-          <w:bCs/>
-          <w:spacing w:val="-6"/>
-          <w:szCs w:val="24"/>
-          <w:lang w:val="en-US"/>
-        </w:rPr>
-        <w:t>debe</w:t>
-      </w:r>
-      <w:proofErr w:type="spellEnd"/>
-    </w:p>
-    <w:p>
-      <w:pPr>
-        <w:ind w:left="622"/>
-        <w:rPr>
-          <w:bCs/>
-          <w:spacing w:val="-6"/>
-          <w:szCs w:val="24"/>
-          <w:lang w:val="en-US"/>
-        </w:rPr>
-      </w:pPr>
-    </w:p>
-    <w:p>
-      <w:pPr>
+          <w:lang w:val="es-ES"/>
+        </w:rPr>
+        <w:t xml:space="preserve"> que sea capaz de:</w:t>
+      </w:r>
+    </w:p>
+    <w:p>
+      <w:pPr>
+        <w:pStyle w:val="Sinespaciado"/>
         <w:numPr>
           <w:ilvl w:val="0"/>
-          <w:numId w:val="15"/>
+          <w:numId w:val="50"/>
         </w:numPr>
         <w:tabs>
           <w:tab w:val="clear" w:pos="720"/>
@@ -8574,43 +8957,77 @@
         </w:tabs>
         <w:ind w:left="1342"/>
         <w:rPr>
-          <w:bCs/>
-          <w:spacing w:val="-6"/>
-          <w:szCs w:val="24"/>
-        </w:rPr>
-      </w:pPr>
-      <w:r>
-        <w:rPr>
-          <w:bCs/>
-          <w:spacing w:val="-6"/>
-          <w:szCs w:val="24"/>
-        </w:rPr>
-        <w:t>Tener un nivel de energía (</w:t>
+          <w:lang w:val="es-ES"/>
+        </w:rPr>
+      </w:pPr>
+      <w:r>
+        <w:rPr>
+          <w:lang w:val="es-ES"/>
+        </w:rPr>
+        <w:t xml:space="preserve">Guardar una colección completa de reliquias en un archivo. </w:t>
+      </w:r>
+    </w:p>
+    <w:p>
+      <w:pPr>
+        <w:pStyle w:val="Sinespaciado"/>
+        <w:numPr>
+          <w:ilvl w:val="1"/>
+          <w:numId w:val="50"/>
+        </w:numPr>
+        <w:tabs>
+          <w:tab w:val="clear" w:pos="1440"/>
+        </w:tabs>
+        <w:rPr>
+          <w:lang w:val="es-ES"/>
+        </w:rPr>
+      </w:pPr>
+      <w:r>
+        <w:rPr>
+          <w:lang w:val="es-ES"/>
+        </w:rPr>
+        <w:t xml:space="preserve">Data: </w:t>
+      </w:r>
+      <w:r>
+        <w:rPr>
+          <w:lang w:val="es-ES"/>
+        </w:rPr>
+        <w:t>Mjolnir</w:t>
+      </w:r>
+      <w:r>
+        <w:rPr>
+          <w:lang w:val="es-ES"/>
+        </w:rPr>
+        <w:t xml:space="preserve">, </w:t>
       </w:r>
       <w:proofErr w:type="spellStart"/>
       <w:r>
         <w:rPr>
-          <w:bCs/>
-          <w:spacing w:val="-6"/>
-          <w:szCs w:val="24"/>
-        </w:rPr>
-        <w:t>energyLevel</w:t>
+          <w:lang w:val="es-ES"/>
+        </w:rPr>
+        <w:t>Gungnir</w:t>
       </w:r>
       <w:proofErr w:type="spellEnd"/>
       <w:r>
         <w:rPr>
-          <w:bCs/>
-          <w:spacing w:val="-6"/>
-          <w:szCs w:val="24"/>
-        </w:rPr>
-        <w:t>).</w:t>
-      </w:r>
-    </w:p>
-    <w:p>
-      <w:pPr>
+          <w:lang w:val="es-ES"/>
+        </w:rPr>
+        <w:t xml:space="preserve">, </w:t>
+      </w:r>
+      <w:proofErr w:type="spellStart"/>
+      <w:r>
+        <w:rPr>
+          <w:lang w:val="es-ES"/>
+        </w:rPr>
+        <w:t>Tesseract</w:t>
+      </w:r>
+      <w:proofErr w:type="spellEnd"/>
+    </w:p>
+    <w:p>
+      <w:pPr>
+        <w:pStyle w:val="Sinespaciado"/>
         <w:numPr>
           <w:ilvl w:val="0"/>
-          <w:numId w:val="15"/>
+          <w:numId w:val="50"/>
         </w:numPr>
         <w:tabs>
           <w:tab w:val="clear" w:pos="720"/>
@@ -8618,53 +9035,22 @@
         </w:tabs>
         <w:ind w:left="1342"/>
         <w:rPr>
-          <w:bCs/>
-          <w:spacing w:val="-6"/>
-          <w:szCs w:val="24"/>
-        </w:rPr>
-      </w:pPr>
-      <w:r>
-        <w:rPr>
-          <w:bCs/>
-          <w:spacing w:val="-6"/>
-          <w:szCs w:val="24"/>
-        </w:rPr>
-        <w:t xml:space="preserve">Intentar sellarse cuando Java ejecute automáticamente </w:t>
-      </w:r>
-      <w:proofErr w:type="spellStart"/>
-      <w:proofErr w:type="gramStart"/>
-      <w:r>
-        <w:rPr>
-          <w:bCs/>
-          <w:spacing w:val="-6"/>
-          <w:szCs w:val="24"/>
-        </w:rPr>
-        <w:t>close</w:t>
-      </w:r>
-      <w:proofErr w:type="spellEnd"/>
-      <w:r>
-        <w:rPr>
-          <w:bCs/>
-          <w:spacing w:val="-6"/>
-          <w:szCs w:val="24"/>
-        </w:rPr>
-        <w:t>(</w:t>
-      </w:r>
-      <w:proofErr w:type="gramEnd"/>
-      <w:r>
-        <w:rPr>
-          <w:bCs/>
-          <w:spacing w:val="-6"/>
-          <w:szCs w:val="24"/>
-        </w:rPr>
-        <w:t>).</w:t>
-      </w:r>
-    </w:p>
-    <w:p>
-      <w:pPr>
+          <w:lang w:val="es-ES"/>
+        </w:rPr>
+      </w:pPr>
+      <w:r>
+        <w:rPr>
+          <w:lang w:val="es-ES"/>
+        </w:rPr>
+        <w:t xml:space="preserve">Recuperar toda la colección con una única lectura. </w:t>
+      </w:r>
+    </w:p>
+    <w:p>
+      <w:pPr>
+        <w:pStyle w:val="Sinespaciado"/>
         <w:numPr>
           <w:ilvl w:val="0"/>
-          <w:numId w:val="15"/>
+          <w:numId w:val="50"/>
         </w:numPr>
         <w:tabs>
           <w:tab w:val="clear" w:pos="720"/>
@@ -8672,67 +9058,20 @@
         </w:tabs>
         <w:ind w:left="1342"/>
         <w:rPr>
-          <w:bCs/>
-          <w:spacing w:val="-6"/>
-          <w:szCs w:val="24"/>
-        </w:rPr>
-      </w:pPr>
-      <w:r>
-        <w:rPr>
-          <w:bCs/>
-          <w:spacing w:val="-6"/>
-          <w:szCs w:val="24"/>
-        </w:rPr>
-        <w:t xml:space="preserve">Lanzar una excepción personalizada </w:t>
-      </w:r>
-      <w:proofErr w:type="spellStart"/>
-      <w:r>
-        <w:rPr>
-          <w:bCs/>
-          <w:spacing w:val="-6"/>
-          <w:szCs w:val="24"/>
-        </w:rPr>
-        <w:t>ReactorMalfunctionException</w:t>
-      </w:r>
-      <w:proofErr w:type="spellEnd"/>
-      <w:r>
-        <w:rPr>
-          <w:bCs/>
-          <w:spacing w:val="-6"/>
-          <w:szCs w:val="24"/>
-        </w:rPr>
-        <w:t xml:space="preserve"> si el nivel de energía supera un límite crítico</w:t>
-      </w:r>
-      <w:r>
-        <w:rPr>
-          <w:bCs/>
-          <w:spacing w:val="-6"/>
-          <w:szCs w:val="24"/>
-        </w:rPr>
-        <w:t xml:space="preserve"> (100)</w:t>
-      </w:r>
-      <w:r>
-        <w:rPr>
-          <w:bCs/>
-          <w:spacing w:val="-6"/>
-          <w:szCs w:val="24"/>
-        </w:rPr>
-        <w:t>.</w:t>
-      </w:r>
-    </w:p>
-    <w:p>
-      <w:pPr>
-        <w:pStyle w:val="Sinespaciado"/>
-        <w:rPr>
-          <w:lang w:val="es-ES"/>
-        </w:rPr>
-      </w:pPr>
+          <w:lang w:val="es-ES"/>
+        </w:rPr>
+      </w:pPr>
+      <w:r>
+        <w:rPr>
+          <w:lang w:val="es-ES"/>
+        </w:rPr>
+        <w:t>Mostrar cuántas reliquias fueron almacenadas y cuáles se recuperaron.</w:t>
+      </w:r>
     </w:p>
     <w:p>
       <w:pPr>
         <w:pStyle w:val="Textoindependiente"/>
         <w:spacing w:before="15"/>
-        <w:ind w:firstLine="622"/>
         <w:rPr>
           <w:b/>
           <w:bCs/>
@@ -8740,255 +9079,6 @@
           <w:szCs w:val="22"/>
         </w:rPr>
       </w:pPr>
-      <w:r>
-        <w:rPr>
-          <w:b/>
-          <w:bCs/>
-          <w:spacing w:val="-6"/>
-          <w:szCs w:val="22"/>
-        </w:rPr>
-        <w:t>Requisitos</w:t>
-      </w:r>
-    </w:p>
-    <w:p>
-      <w:pPr>
-        <w:pStyle w:val="Sinespaciado"/>
-        <w:ind w:left="622"/>
-      </w:pPr>
-      <w:r>
-        <w:t xml:space="preserve">El </w:t>
-      </w:r>
-      <w:proofErr w:type="spellStart"/>
-      <w:r>
-        <w:t>programa</w:t>
-      </w:r>
-      <w:proofErr w:type="spellEnd"/>
-      <w:r>
-        <w:t xml:space="preserve"> </w:t>
-      </w:r>
-      <w:proofErr w:type="spellStart"/>
-      <w:r>
-        <w:t>debe</w:t>
-      </w:r>
-      <w:proofErr w:type="spellEnd"/>
-    </w:p>
-    <w:p>
-      <w:pPr>
-        <w:pStyle w:val="Sinespaciado"/>
-        <w:numPr>
-          <w:ilvl w:val="0"/>
-          <w:numId w:val="16"/>
-        </w:numPr>
-        <w:rPr>
-          <w:lang w:val="es-ES"/>
-        </w:rPr>
-      </w:pPr>
-      <w:r>
-        <w:rPr>
-          <w:lang w:val="es-ES"/>
-        </w:rPr>
-        <w:t xml:space="preserve">Crear una excepción propia llamada </w:t>
-      </w:r>
-      <w:proofErr w:type="spellStart"/>
-      <w:r>
-        <w:rPr>
-          <w:lang w:val="es-ES"/>
-        </w:rPr>
-        <w:t>ReactorMalfunctionException</w:t>
-      </w:r>
-      <w:proofErr w:type="spellEnd"/>
-      <w:r>
-        <w:rPr>
-          <w:lang w:val="es-ES"/>
-        </w:rPr>
-        <w:t>.</w:t>
-      </w:r>
-    </w:p>
-    <w:p>
-      <w:pPr>
-        <w:pStyle w:val="Sinespaciado"/>
-        <w:numPr>
-          <w:ilvl w:val="0"/>
-          <w:numId w:val="16"/>
-        </w:numPr>
-        <w:rPr>
-          <w:lang w:val="es-ES"/>
-        </w:rPr>
-      </w:pPr>
-      <w:r>
-        <w:rPr>
-          <w:lang w:val="es-ES"/>
-        </w:rPr>
-        <w:t xml:space="preserve">Hacer que </w:t>
-      </w:r>
-      <w:proofErr w:type="spellStart"/>
-      <w:proofErr w:type="gramStart"/>
-      <w:r>
-        <w:rPr>
-          <w:lang w:val="es-ES"/>
-        </w:rPr>
-        <w:t>close</w:t>
-      </w:r>
-      <w:proofErr w:type="spellEnd"/>
-      <w:r>
-        <w:rPr>
-          <w:lang w:val="es-ES"/>
-        </w:rPr>
-        <w:t>(</w:t>
-      </w:r>
-      <w:proofErr w:type="gramEnd"/>
-      <w:r>
-        <w:rPr>
-          <w:lang w:val="es-ES"/>
-        </w:rPr>
-        <w:t>) pueda lanzar esa excepción.</w:t>
-      </w:r>
-    </w:p>
-    <w:p>
-      <w:pPr>
-        <w:pStyle w:val="Sinespaciado"/>
-        <w:numPr>
-          <w:ilvl w:val="0"/>
-          <w:numId w:val="16"/>
-        </w:numPr>
-      </w:pPr>
-      <w:proofErr w:type="spellStart"/>
-      <w:r>
-        <w:t>Utilizar</w:t>
-      </w:r>
-      <w:proofErr w:type="spellEnd"/>
-      <w:r>
-        <w:t xml:space="preserve"> try-with-resources.</w:t>
-      </w:r>
-    </w:p>
-    <w:p>
-      <w:pPr>
-        <w:pStyle w:val="Sinespaciado"/>
-        <w:numPr>
-          <w:ilvl w:val="0"/>
-          <w:numId w:val="16"/>
-        </w:numPr>
-        <w:rPr>
-          <w:lang w:val="es-ES"/>
-        </w:rPr>
-      </w:pPr>
-      <w:r>
-        <w:rPr>
-          <w:lang w:val="es-ES"/>
-        </w:rPr>
-        <w:t xml:space="preserve">Permitir que Java invoque </w:t>
-      </w:r>
-      <w:proofErr w:type="spellStart"/>
-      <w:proofErr w:type="gramStart"/>
-      <w:r>
-        <w:rPr>
-          <w:lang w:val="es-ES"/>
-        </w:rPr>
-        <w:t>close</w:t>
-      </w:r>
-      <w:proofErr w:type="spellEnd"/>
-      <w:r>
-        <w:rPr>
-          <w:lang w:val="es-ES"/>
-        </w:rPr>
-        <w:t>(</w:t>
-      </w:r>
-      <w:proofErr w:type="gramEnd"/>
-      <w:r>
-        <w:rPr>
-          <w:lang w:val="es-ES"/>
-        </w:rPr>
-        <w:t>) automáticamente.</w:t>
-      </w:r>
-    </w:p>
-    <w:p>
-      <w:pPr>
-        <w:pStyle w:val="Sinespaciado"/>
-        <w:numPr>
-          <w:ilvl w:val="0"/>
-          <w:numId w:val="16"/>
-        </w:numPr>
-        <w:rPr>
-          <w:lang w:val="es-ES"/>
-        </w:rPr>
-      </w:pPr>
-      <w:r>
-        <w:rPr>
-          <w:lang w:val="es-ES"/>
-        </w:rPr>
-        <w:t>Capturar la excepción correctamente desde el código principal.</w:t>
-      </w:r>
-    </w:p>
-    <w:p>
-      <w:pPr>
-        <w:pStyle w:val="Sinespaciado"/>
-        <w:numPr>
-          <w:ilvl w:val="0"/>
-          <w:numId w:val="16"/>
-        </w:numPr>
-        <w:rPr>
-          <w:lang w:val="es-ES"/>
-        </w:rPr>
-      </w:pPr>
-      <w:r>
-        <w:rPr>
-          <w:lang w:val="es-ES"/>
-        </w:rPr>
-        <w:t>Evitar que el programa termine de forma incontrolada.</w:t>
-      </w:r>
-    </w:p>
-    <w:p>
-      <w:pPr>
-        <w:pStyle w:val="Sinespaciado"/>
-        <w:numPr>
-          <w:ilvl w:val="0"/>
-          <w:numId w:val="16"/>
-        </w:numPr>
-        <w:rPr>
-          <w:lang w:val="es-ES"/>
-        </w:rPr>
-      </w:pPr>
-      <w:r>
-        <w:rPr>
-          <w:lang w:val="es-ES"/>
-        </w:rPr>
-        <w:t xml:space="preserve">No debes llamar manualmente a </w:t>
-      </w:r>
-      <w:proofErr w:type="spellStart"/>
-      <w:proofErr w:type="gramStart"/>
-      <w:r>
-        <w:rPr>
-          <w:lang w:val="es-ES"/>
-        </w:rPr>
-        <w:t>close</w:t>
-      </w:r>
-      <w:proofErr w:type="spellEnd"/>
-      <w:r>
-        <w:rPr>
-          <w:lang w:val="es-ES"/>
-        </w:rPr>
-        <w:t>(</w:t>
-      </w:r>
-      <w:proofErr w:type="gramEnd"/>
-      <w:r>
-        <w:rPr>
-          <w:lang w:val="es-ES"/>
-        </w:rPr>
-        <w:t>).</w:t>
-      </w:r>
-    </w:p>
-    <w:p>
-      <w:pPr>
-        <w:pStyle w:val="Textoindependiente"/>
-        <w:spacing w:before="15"/>
-        <w:ind w:firstLine="622"/>
-        <w:rPr>
-          <w:b/>
-          <w:bCs/>
-          <w:spacing w:val="-6"/>
-          <w:szCs w:val="22"/>
-        </w:rPr>
-      </w:pPr>
     </w:p>
     <w:p>
       <w:pPr>
@@ -9020,7 +9110,7 @@
         <mc:AlternateContent>
           <mc:Choice Requires="wps">
             <w:drawing>
-              <wp:anchor distT="0" distB="0" distL="114300" distR="114300" simplePos="0" relativeHeight="251657216" behindDoc="0" locked="0" layoutInCell="1" allowOverlap="1" wp14:anchorId="3E5A6502" wp14:editId="0D5C0AC1">
+              <wp:anchor distT="0" distB="0" distL="114300" distR="114300" simplePos="0" relativeHeight="251658240" behindDoc="0" locked="0" layoutInCell="1" allowOverlap="1" wp14:anchorId="3E5A6502" wp14:editId="0D5C0AC1">
                 <wp:simplePos x="0" y="0"/>
                 <wp:positionH relativeFrom="margin">
                   <wp:posOffset>391886</wp:posOffset>
@@ -9122,14 +9212,6 @@
                               </w:rPr>
                             </w:pPr>
                           </w:p>
-                          <w:p>
-                            <w:pPr>
-                              <w:pStyle w:val="Sinespaciado"/>
-                              <w:rPr>
-                                <w:rFonts w:ascii="Cascadia Mono SemiBold" w:hAnsi="Cascadia Mono SemiBold" w:cs="Cascadia Mono SemiBold"/>
-                              </w:rPr>
-                            </w:pPr>
-                          </w:p>
                         </w:txbxContent>
                       </wps:txbx>
                       <wps:bodyPr rot="0" spcFirstLastPara="0" vertOverflow="overflow" horzOverflow="overflow" vert="horz" wrap="square" lIns="91440" tIns="45720" rIns="91440" bIns="45720" numCol="1" spcCol="0" rtlCol="0" fromWordArt="0" anchor="ctr" anchorCtr="0" forceAA="0" compatLnSpc="1">
@@ -9152,7 +9234,7 @@
           </mc:Choice>
           <mc:Fallback>
             <w:pict>
-              <v:rect w14:anchorId="3E5A6502" id="_x0000_s1029" style="position:absolute;left:0;text-align:left;margin-left:30.85pt;margin-top:6.15pt;width:434.5pt;height:39pt;z-index:251657216;visibility:visible;mso-wrap-style:square;mso-width-percent:0;mso-height-percent:0;mso-wrap-distance-left:9pt;mso-wrap-distance-top:0;mso-wrap-distance-right:9pt;mso-wrap-distance-bottom:0;mso-position-horizontal:absolute;mso-position-horizontal-relative:margin;mso-position-vertical:absolute;mso-position-vertical-relative:text;mso-width-percent:0;mso-height-percent:0;mso-width-relative:margin;mso-height-relative:margin;v-text-anchor:middle" o:gfxdata="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" fillcolor="black [3213]" strokecolor="black [3213]" strokeweight="2pt">
+              <v:rect w14:anchorId="3E5A6502" id="_x0000_s1029" style="position:absolute;left:0;text-align:left;margin-left:30.85pt;margin-top:6.15pt;width:434.5pt;height:39pt;z-index:251658240;visibility:visible;mso-wrap-style:square;mso-width-percent:0;mso-height-percent:0;mso-wrap-distance-left:9pt;mso-wrap-distance-top:0;mso-wrap-distance-right:9pt;mso-wrap-distance-bottom:0;mso-position-horizontal:absolute;mso-position-horizontal-relative:margin;mso-position-vertical:absolute;mso-position-vertical-relative:text;mso-width-percent:0;mso-height-percent:0;mso-width-relative:margin;mso-height-relative:margin;v-text-anchor:middle" o:gfxdata="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" fillcolor="black [3213]" strokecolor="black [3213]" strokeweight="2pt">
                 <v:textbox>
                   <w:txbxContent>
                     <w:p>
@@ -9205,14 +9287,6 @@
                         </w:rPr>
                       </w:pPr>
                     </w:p>
-                    <w:p>
-                      <w:pPr>
-                        <w:pStyle w:val="Sinespaciado"/>
-                        <w:rPr>
-                          <w:rFonts w:ascii="Cascadia Mono SemiBold" w:hAnsi="Cascadia Mono SemiBold" w:cs="Cascadia Mono SemiBold"/>
-                        </w:rPr>
-                      </w:pPr>
-                    </w:p>
                   </w:txbxContent>
                 </v:textbox>
                 <w10:wrap anchorx="margin"/>
@@ -9260,13 +9334,17 @@
           <w:numId w:val="6"/>
         </w:numPr>
         <w:jc w:val="left"/>
-      </w:pPr>
-      <w:bookmarkStart w:id="14" w:name="_bookmark7"/>
-      <w:bookmarkStart w:id="15" w:name="_Toc236321500"/>
-      <w:bookmarkEnd w:id="14"/>
+        <w:rPr>
+          <w:highlight w:val="yellow"/>
+        </w:rPr>
+      </w:pPr>
+      <w:bookmarkStart w:id="14" w:name="_Toc236321500"/>
+      <w:bookmarkStart w:id="15" w:name="_bookmark7"/>
+      <w:bookmarkEnd w:id="15"/>
       <w:r>
         <w:rPr>
           <w:w w:val="90"/>
+          <w:highlight w:val="yellow"/>
         </w:rPr>
         <w:lastRenderedPageBreak/>
         <w:t>Ejercicio</w:t>
@@ -9275,12 +9353,14 @@
         <w:rPr>
           <w:spacing w:val="-7"/>
           <w:w w:val="90"/>
+          <w:highlight w:val="yellow"/>
         </w:rPr>
         <w:t xml:space="preserve"> </w:t>
       </w:r>
       <w:r>
         <w:rPr>
           <w:w w:val="90"/>
+          <w:highlight w:val="yellow"/>
         </w:rPr>
         <w:t>4:</w:t>
       </w:r>
@@ -9288,6 +9368,7 @@
         <w:rPr>
           <w:spacing w:val="-7"/>
           <w:w w:val="90"/>
+          <w:highlight w:val="yellow"/>
         </w:rPr>
         <w:t xml:space="preserve"> </w:t>
       </w:r>
@@ -9295,6 +9376,7 @@
         <w:rPr>
           <w:spacing w:val="-7"/>
           <w:w w:val="90"/>
+          <w:highlight w:val="yellow"/>
         </w:rPr>
         <w:t>El Traidor (</w:t>
       </w:r>
@@ -9303,6 +9385,7 @@
         <w:rPr>
           <w:spacing w:val="-7"/>
           <w:w w:val="90"/>
+          <w:highlight w:val="yellow"/>
         </w:rPr>
         <w:t>transient</w:t>
       </w:r>
@@ -9311,10 +9394,11 @@
         <w:rPr>
           <w:spacing w:val="-7"/>
           <w:w w:val="90"/>
+          <w:highlight w:val="yellow"/>
         </w:rPr>
         <w:t>)</w:t>
       </w:r>
-      <w:bookmarkEnd w:id="15"/>
+      <w:bookmarkEnd w:id="14"/>
     </w:p>
     <w:p>
       <w:pPr>
@@ -10008,7 +10092,7 @@
         <mc:AlternateContent>
           <mc:Choice Requires="wps">
             <w:drawing>
-              <wp:anchor distT="0" distB="0" distL="114300" distR="114300" simplePos="0" relativeHeight="251643904" behindDoc="0" locked="0" layoutInCell="1" allowOverlap="1" wp14:anchorId="07DEF22C" wp14:editId="63A08BFC">
+              <wp:anchor distT="0" distB="0" distL="114300" distR="114300" simplePos="0" relativeHeight="251651072" behindDoc="0" locked="0" layoutInCell="1" allowOverlap="1" wp14:anchorId="07DEF22C" wp14:editId="63A08BFC">
                 <wp:simplePos x="0" y="0"/>
                 <wp:positionH relativeFrom="margin">
                   <wp:posOffset>337457</wp:posOffset>
@@ -10138,7 +10222,7 @@
           </mc:Choice>
           <mc:Fallback>
             <w:pict>
-              <v:rect w14:anchorId="07DEF22C" id="_x0000_s1030" style="position:absolute;margin-left:26.55pt;margin-top:.65pt;width:441.4pt;height:44.15pt;z-index:251643904;visibility:visible;mso-wrap-style:square;mso-width-percent:0;mso-height-percent:0;mso-wrap-distance-left:9pt;mso-wrap-distance-top:0;mso-wrap-distance-right:9pt;mso-wrap-distance-bottom:0;mso-position-horizontal:absolute;mso-position-horizontal-relative:margin;mso-position-vertical:absolute;mso-position-vertical-relative:text;mso-width-percent:0;mso-height-percent:0;mso-width-relative:margin;mso-height-relative:margin;v-text-anchor:middle" o:gfxdata="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" fillcolor="black [3213]" strokecolor="black [3213]" strokeweight="2pt">
+              <v:rect w14:anchorId="07DEF22C" id="_x0000_s1030" style="position:absolute;margin-left:26.55pt;margin-top:.65pt;width:441.4pt;height:44.15pt;z-index:251651072;visibility:visible;mso-wrap-style:square;mso-width-percent:0;mso-height-percent:0;mso-wrap-distance-left:9pt;mso-wrap-distance-top:0;mso-wrap-distance-right:9pt;mso-wrap-distance-bottom:0;mso-position-horizontal:absolute;mso-position-horizontal-relative:margin;mso-position-vertical:absolute;mso-position-vertical-relative:text;mso-width-percent:0;mso-height-percent:0;mso-width-relative:margin;mso-height-relative:margin;v-text-anchor:middle" o:gfxdata="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" fillcolor="black [3213]" strokecolor="black [3213]" strokeweight="2pt">
                 <v:textbox>
                   <w:txbxContent>
                     <w:p>
@@ -11018,7 +11102,7 @@
         <mc:AlternateContent>
           <mc:Choice Requires="wps">
             <w:drawing>
-              <wp:anchor distT="0" distB="0" distL="114300" distR="114300" simplePos="0" relativeHeight="251670528" behindDoc="0" locked="0" layoutInCell="1" allowOverlap="1" wp14:anchorId="6925DDC6" wp14:editId="6897C01F">
+              <wp:anchor distT="0" distB="0" distL="114300" distR="114300" simplePos="0" relativeHeight="251663360" behindDoc="0" locked="0" layoutInCell="1" allowOverlap="1" wp14:anchorId="6925DDC6" wp14:editId="6897C01F">
                 <wp:simplePos x="0" y="0"/>
                 <wp:positionH relativeFrom="margin">
                   <wp:posOffset>337457</wp:posOffset>
@@ -11274,7 +11358,7 @@
           </mc:Choice>
           <mc:Fallback>
             <w:pict>
-              <v:rect w14:anchorId="6925DDC6" id="_x0000_s1031" style="position:absolute;margin-left:26.55pt;margin-top:.8pt;width:441.4pt;height:150.85pt;z-index:251670528;visibility:visible;mso-wrap-style:square;mso-width-percent:0;mso-height-percent:0;mso-wrap-distance-left:9pt;mso-wrap-distance-top:0;mso-wrap-distance-right:9pt;mso-wrap-distance-bottom:0;mso-position-horizontal:absolute;mso-position-horizontal-relative:margin;mso-position-vertical:absolute;mso-position-vertical-relative:text;mso-width-percent:0;mso-height-percent:0;mso-width-relative:margin;mso-height-relative:margin;v-text-anchor:middle" o:gfxdata="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" fillcolor="black [3213]" strokecolor="black [3213]" strokeweight="2pt">
+              <v:rect w14:anchorId="6925DDC6" id="_x0000_s1031" style="position:absolute;margin-left:26.55pt;margin-top:.8pt;width:441.4pt;height:150.85pt;z-index:251663360;visibility:visible;mso-wrap-style:square;mso-width-percent:0;mso-height-percent:0;mso-wrap-distance-left:9pt;mso-wrap-distance-top:0;mso-wrap-distance-right:9pt;mso-wrap-distance-bottom:0;mso-position-horizontal:absolute;mso-position-horizontal-relative:margin;mso-position-vertical:absolute;mso-position-vertical-relative:text;mso-width-percent:0;mso-height-percent:0;mso-width-relative:margin;mso-height-relative:margin;v-text-anchor:middle" o:gfxdata="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" fillcolor="black [3213]" strokecolor="black [3213]" strokeweight="2pt">
                 <v:textbox>
                   <w:txbxContent>
                     <w:p>
@@ -12300,7 +12384,7 @@
         <mc:AlternateContent>
           <mc:Choice Requires="wps">
             <w:drawing>
-              <wp:anchor distT="0" distB="0" distL="114300" distR="114300" simplePos="0" relativeHeight="251672576" behindDoc="0" locked="0" layoutInCell="1" allowOverlap="1" wp14:anchorId="63253069" wp14:editId="20B257E7">
+              <wp:anchor distT="0" distB="0" distL="114300" distR="114300" simplePos="0" relativeHeight="251664384" behindDoc="0" locked="0" layoutInCell="1" allowOverlap="1" wp14:anchorId="63253069" wp14:editId="20B257E7">
                 <wp:simplePos x="0" y="0"/>
                 <wp:positionH relativeFrom="margin">
                   <wp:posOffset>337457</wp:posOffset>
@@ -12412,7 +12496,7 @@
           </mc:Choice>
           <mc:Fallback>
             <w:pict>
-              <v:rect w14:anchorId="63253069" id="_x0000_s1032" style="position:absolute;margin-left:26.55pt;margin-top:.65pt;width:441.4pt;height:43.7pt;z-index:251672576;visibility:visible;mso-wrap-style:square;mso-width-percent:0;mso-height-percent:0;mso-wrap-distance-left:9pt;mso-wrap-distance-top:0;mso-wrap-distance-right:9pt;mso-wrap-distance-bottom:0;mso-position-horizontal:absolute;mso-position-horizontal-relative:margin;mso-position-vertical:absolute;mso-position-vertical-relative:text;mso-width-percent:0;mso-height-percent:0;mso-width-relative:margin;mso-height-relative:margin;v-text-anchor:middle" o:gfxdata="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" fillcolor="black [3213]" strokecolor="black [3213]" strokeweight="2pt">
+              <v:rect w14:anchorId="63253069" id="_x0000_s1032" style="position:absolute;margin-left:26.55pt;margin-top:.65pt;width:441.4pt;height:43.7pt;z-index:251664384;visibility:visible;mso-wrap-style:square;mso-width-percent:0;mso-height-percent:0;mso-wrap-distance-left:9pt;mso-wrap-distance-top:0;mso-wrap-distance-right:9pt;mso-wrap-distance-bottom:0;mso-position-horizontal:absolute;mso-position-horizontal-relative:margin;mso-position-vertical:absolute;mso-position-vertical-relative:text;mso-width-percent:0;mso-height-percent:0;mso-width-relative:margin;mso-height-relative:margin;v-text-anchor:middle" o:gfxdata="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" fillcolor="black [3213]" strokecolor="black [3213]" strokeweight="2pt">
                 <v:textbox>
                   <w:txbxContent>
                     <w:p>
@@ -12523,7 +12607,6 @@
           <w:rFonts w:eastAsiaTheme="minorHAnsi" w:cstheme="minorBidi"/>
           <w:kern w:val="2"/>
           <w:szCs w:val="24"/>
-          <w:lang w:val="en-US"/>
           <w14:ligatures w14:val="standardContextual"/>
         </w:rPr>
         <w:lastRenderedPageBreak/>
@@ -12547,13 +12630,7 @@
         <w:rPr>
           <w:w w:val="90"/>
         </w:rPr>
-        <w:t>7</w:t>
-      </w:r>
-      <w:r>
-        <w:rPr>
-          <w:w w:val="90"/>
-        </w:rPr>
-        <w:t>:</w:t>
+        <w:t>7:</w:t>
       </w:r>
       <w:r>
         <w:rPr>
@@ -13561,6 +13638,9 @@
     <w:p>
       <w:pPr>
         <w:pStyle w:val="Sinespaciado"/>
+        <w:rPr>
+          <w:lang w:val="es-ES"/>
+        </w:rPr>
       </w:pPr>
     </w:p>
     <w:p>
@@ -13604,7 +13684,7 @@
         <mc:AlternateContent>
           <mc:Choice Requires="wps">
             <w:drawing>
-              <wp:anchor distT="0" distB="0" distL="114300" distR="114300" simplePos="0" relativeHeight="251653120" behindDoc="0" locked="0" layoutInCell="1" allowOverlap="1" wp14:anchorId="326B5D78" wp14:editId="0A1BF796">
+              <wp:anchor distT="0" distB="0" distL="114300" distR="114300" simplePos="0" relativeHeight="251655168" behindDoc="0" locked="0" layoutInCell="1" allowOverlap="1" wp14:anchorId="326B5D78" wp14:editId="0A1BF796">
                 <wp:simplePos x="0" y="0"/>
                 <wp:positionH relativeFrom="margin">
                   <wp:posOffset>333375</wp:posOffset>
@@ -13760,7 +13840,7 @@
           </mc:Choice>
           <mc:Fallback>
             <w:pict>
-              <v:rect w14:anchorId="326B5D78" id="_x0000_s1033" style="position:absolute;margin-left:26.25pt;margin-top:.9pt;width:441.4pt;height:75pt;z-index:251653120;visibility:visible;mso-wrap-style:square;mso-width-percent:0;mso-height-percent:0;mso-wrap-distance-left:9pt;mso-wrap-distance-top:0;mso-wrap-distance-right:9pt;mso-wrap-distance-bottom:0;mso-position-horizontal:absolute;mso-position-horizontal-relative:margin;mso-position-vertical:absolute;mso-position-vertical-relative:text;mso-width-percent:0;mso-height-percent:0;mso-width-relative:margin;mso-height-relative:margin;v-text-anchor:middle" o:gfxdata="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" fillcolor="black [3213]" strokecolor="black [3213]" strokeweight="2pt">
+              <v:rect w14:anchorId="326B5D78" id="_x0000_s1033" style="position:absolute;margin-left:26.25pt;margin-top:.9pt;width:441.4pt;height:75pt;z-index:251655168;visibility:visible;mso-wrap-style:square;mso-width-percent:0;mso-height-percent:0;mso-wrap-distance-left:9pt;mso-wrap-distance-top:0;mso-wrap-distance-right:9pt;mso-wrap-distance-bottom:0;mso-position-horizontal:absolute;mso-position-horizontal-relative:margin;mso-position-vertical:absolute;mso-position-vertical-relative:text;mso-width-percent:0;mso-height-percent:0;mso-width-relative:margin;mso-height-relative:margin;v-text-anchor:middle" o:gfxdata="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" fillcolor="black [3213]" strokecolor="black [3213]" strokeweight="2pt">
                 <v:textbox>
                   <w:txbxContent>
                     <w:p>
@@ -14176,25 +14256,15 @@
       <w:pPr>
         <w:pStyle w:val="Sinespaciado"/>
         <w:ind w:left="720"/>
-      </w:pPr>
-      <w:r>
-        <w:t xml:space="preserve">Primero, </w:t>
-      </w:r>
-      <w:proofErr w:type="spellStart"/>
-      <w:r>
-        <w:t>una</w:t>
-      </w:r>
-      <w:proofErr w:type="spellEnd"/>
-      <w:r>
-        <w:t xml:space="preserve"> </w:t>
-      </w:r>
-      <w:proofErr w:type="spellStart"/>
-      <w:r>
-        <w:t>clase</w:t>
-      </w:r>
-      <w:proofErr w:type="spellEnd"/>
-      <w:r>
-        <w:t xml:space="preserve"> simple:</w:t>
+        <w:rPr>
+          <w:lang w:val="es-ES"/>
+        </w:rPr>
+      </w:pPr>
+      <w:r>
+        <w:rPr>
+          <w:lang w:val="es-ES"/>
+        </w:rPr>
+        <w:t>Primero, una clase simple:</w:t>
       </w:r>
     </w:p>
     <w:p>
@@ -14212,7 +14282,7 @@
         <mc:AlternateContent>
           <mc:Choice Requires="wps">
             <w:drawing>
-              <wp:anchor distT="0" distB="0" distL="114300" distR="114300" simplePos="0" relativeHeight="251666432" behindDoc="0" locked="0" layoutInCell="1" allowOverlap="1" wp14:anchorId="0E8D1A1D" wp14:editId="4BE5DB3E">
+              <wp:anchor distT="0" distB="0" distL="114300" distR="114300" simplePos="0" relativeHeight="251661312" behindDoc="0" locked="0" layoutInCell="1" allowOverlap="1" wp14:anchorId="0E8D1A1D" wp14:editId="4BE5DB3E">
                 <wp:simplePos x="0" y="0"/>
                 <wp:positionH relativeFrom="margin">
                   <wp:posOffset>523875</wp:posOffset>
@@ -14613,7 +14683,7 @@
           </mc:Choice>
           <mc:Fallback>
             <w:pict>
-              <v:rect w14:anchorId="0E8D1A1D" id="_x0000_s1034" style="position:absolute;left:0;text-align:left;margin-left:41.25pt;margin-top:14.75pt;width:505.3pt;height:245.25pt;z-index:251666432;visibility:visible;mso-wrap-style:square;mso-width-percent:0;mso-height-percent:0;mso-wrap-distance-left:9pt;mso-wrap-distance-top:0;mso-wrap-distance-right:9pt;mso-wrap-distance-bottom:0;mso-position-horizontal:absolute;mso-position-horizontal-relative:margin;mso-position-vertical:absolute;mso-position-vertical-relative:text;mso-width-percent:0;mso-height-percent:0;mso-width-relative:margin;mso-height-relative:margin;v-text-anchor:middle" o:gfxdata="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" fillcolor="black [3213]" strokecolor="black [3213]" strokeweight="2pt">
+              <v:rect w14:anchorId="0E8D1A1D" id="_x0000_s1034" style="position:absolute;left:0;text-align:left;margin-left:41.25pt;margin-top:14.75pt;width:505.3pt;height:245.25pt;z-index:251661312;visibility:visible;mso-wrap-style:square;mso-width-percent:0;mso-height-percent:0;mso-wrap-distance-left:9pt;mso-wrap-distance-top:0;mso-wrap-distance-right:9pt;mso-wrap-distance-bottom:0;mso-position-horizontal:absolute;mso-position-horizontal-relative:margin;mso-position-vertical:absolute;mso-position-vertical-relative:text;mso-width-percent:0;mso-height-percent:0;mso-width-relative:margin;mso-height-relative:margin;v-text-anchor:middle" o:gfxdata="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" fillcolor="black [3213]" strokecolor="black [3213]" strokeweight="2pt">
                 <v:textbox>
                   <w:txbxContent>
                     <w:p>
@@ -15217,18 +15287,16 @@
       <w:pPr>
         <w:pStyle w:val="Sinespaciado"/>
         <w:ind w:left="720"/>
-      </w:pPr>
-      <w:r>
+        <w:rPr>
+          <w:lang w:val="es-ES"/>
+        </w:rPr>
+      </w:pPr>
+      <w:r>
+        <w:rPr>
+          <w:lang w:val="es-ES"/>
+        </w:rPr>
         <w:lastRenderedPageBreak/>
-        <w:t xml:space="preserve">Y el nuevo </w:t>
-      </w:r>
-      <w:proofErr w:type="spellStart"/>
-      <w:r>
-        <w:t>método</w:t>
-      </w:r>
-      <w:proofErr w:type="spellEnd"/>
-      <w:r>
-        <w:t>:</w:t>
+        <w:t>Y el nuevo método:</w:t>
       </w:r>
     </w:p>
     <w:p>
@@ -15237,7 +15305,23 @@
         <w:ind w:left="720"/>
       </w:pPr>
       <w:r>
-        <w:t>Primero, una clase simple:</w:t>
+        <w:t xml:space="preserve">Primero, </w:t>
+      </w:r>
+      <w:proofErr w:type="spellStart"/>
+      <w:r>
+        <w:t>una</w:t>
+      </w:r>
+      <w:proofErr w:type="spellEnd"/>
+      <w:r>
+        <w:t xml:space="preserve"> </w:t>
+      </w:r>
+      <w:proofErr w:type="spellStart"/>
+      <w:r>
+        <w:t>clase</w:t>
+      </w:r>
+      <w:proofErr w:type="spellEnd"/>
+      <w:r>
+        <w:t xml:space="preserve"> simple:</w:t>
       </w:r>
     </w:p>
     <w:p>
@@ -15264,7 +15348,7 @@
         <mc:AlternateContent>
           <mc:Choice Requires="wps">
             <w:drawing>
-              <wp:anchor distT="0" distB="0" distL="114300" distR="114300" simplePos="0" relativeHeight="251662336" behindDoc="0" locked="0" layoutInCell="1" allowOverlap="1" wp14:anchorId="3A77B857" wp14:editId="1F153980">
+              <wp:anchor distT="0" distB="0" distL="114300" distR="114300" simplePos="0" relativeHeight="251659264" behindDoc="0" locked="0" layoutInCell="1" allowOverlap="1" wp14:anchorId="3A77B857" wp14:editId="1F153980">
                 <wp:simplePos x="0" y="0"/>
                 <wp:positionH relativeFrom="margin">
                   <wp:posOffset>457200</wp:posOffset>
@@ -15399,19 +15483,37 @@
                               <w:pStyle w:val="Sinespaciado"/>
                               <w:rPr>
                                 <w:rFonts w:ascii="Cascadia Mono SemiBold" w:hAnsi="Cascadia Mono SemiBold" w:cs="Cascadia Mono SemiBold"/>
+                                <w:lang w:val="es-ES"/>
                               </w:rPr>
                             </w:pPr>
                             <w:r>
                               <w:rPr>
                                 <w:rFonts w:ascii="Cascadia Mono SemiBold" w:hAnsi="Cascadia Mono SemiBold" w:cs="Cascadia Mono SemiBold"/>
                               </w:rPr>
-                              <w:t xml:space="preserve">            throw new </w:t>
+                              <w:t xml:space="preserve">            </w:t>
+                            </w:r>
+                            <w:proofErr w:type="spellStart"/>
+                            <w:r>
+                              <w:rPr>
+                                <w:rFonts w:ascii="Cascadia Mono SemiBold" w:hAnsi="Cascadia Mono SemiBold" w:cs="Cascadia Mono SemiBold"/>
+                                <w:lang w:val="es-ES"/>
+                              </w:rPr>
+                              <w:t>throw</w:t>
+                            </w:r>
+                            <w:proofErr w:type="spellEnd"/>
+                            <w:r>
+                              <w:rPr>
+                                <w:rFonts w:ascii="Cascadia Mono SemiBold" w:hAnsi="Cascadia Mono SemiBold" w:cs="Cascadia Mono SemiBold"/>
+                                <w:lang w:val="es-ES"/>
+                              </w:rPr>
+                              <w:t xml:space="preserve"> new </w:t>
                             </w:r>
                             <w:proofErr w:type="spellStart"/>
                             <w:proofErr w:type="gramStart"/>
                             <w:r>
                               <w:rPr>
                                 <w:rFonts w:ascii="Cascadia Mono SemiBold" w:hAnsi="Cascadia Mono SemiBold" w:cs="Cascadia Mono SemiBold"/>
+                                <w:lang w:val="es-ES"/>
                               </w:rPr>
                               <w:t>IllegalArgumentException</w:t>
                             </w:r>
@@ -15419,6 +15521,7 @@
                             <w:r>
                               <w:rPr>
                                 <w:rFonts w:ascii="Cascadia Mono SemiBold" w:hAnsi="Cascadia Mono SemiBold" w:cs="Cascadia Mono SemiBold"/>
+                                <w:lang w:val="es-ES"/>
                               </w:rPr>
                               <w:t>(</w:t>
                             </w:r>
@@ -15426,50 +15529,9 @@
                             <w:r>
                               <w:rPr>
                                 <w:rFonts w:ascii="Cascadia Mono SemiBold" w:hAnsi="Cascadia Mono SemiBold" w:cs="Cascadia Mono SemiBold"/>
+                                <w:lang w:val="es-ES"/>
                               </w:rPr>
-                              <w:t xml:space="preserve">"La </w:t>
-                            </w:r>
-                            <w:proofErr w:type="spellStart"/>
-                            <w:r>
-                              <w:rPr>
-                                <w:rFonts w:ascii="Cascadia Mono SemiBold" w:hAnsi="Cascadia Mono SemiBold" w:cs="Cascadia Mono SemiBold"/>
-                              </w:rPr>
-                              <w:t>intensidad</w:t>
-                            </w:r>
-                            <w:proofErr w:type="spellEnd"/>
-                            <w:r>
-                              <w:rPr>
-                                <w:rFonts w:ascii="Cascadia Mono SemiBold" w:hAnsi="Cascadia Mono SemiBold" w:cs="Cascadia Mono SemiBold"/>
-                              </w:rPr>
-                              <w:t xml:space="preserve"> </w:t>
-                            </w:r>
-                            <w:proofErr w:type="spellStart"/>
-                            <w:r>
-                              <w:rPr>
-                                <w:rFonts w:ascii="Cascadia Mono SemiBold" w:hAnsi="Cascadia Mono SemiBold" w:cs="Cascadia Mono SemiBold"/>
-                              </w:rPr>
-                              <w:t>debe</w:t>
-                            </w:r>
-                            <w:proofErr w:type="spellEnd"/>
-                            <w:r>
-                              <w:rPr>
-                                <w:rFonts w:ascii="Cascadia Mono SemiBold" w:hAnsi="Cascadia Mono SemiBold" w:cs="Cascadia Mono SemiBold"/>
-                              </w:rPr>
-                              <w:t xml:space="preserve"> ser </w:t>
-                            </w:r>
-                            <w:proofErr w:type="spellStart"/>
-                            <w:r>
-                              <w:rPr>
-                                <w:rFonts w:ascii="Cascadia Mono SemiBold" w:hAnsi="Cascadia Mono SemiBold" w:cs="Cascadia Mono SemiBold"/>
-                              </w:rPr>
-                              <w:t>positiva</w:t>
-                            </w:r>
-                            <w:proofErr w:type="spellEnd"/>
-                            <w:r>
-                              <w:rPr>
-                                <w:rFonts w:ascii="Cascadia Mono SemiBold" w:hAnsi="Cascadia Mono SemiBold" w:cs="Cascadia Mono SemiBold"/>
-                              </w:rPr>
-                              <w:t>.");</w:t>
+                              <w:t>"La intensidad debe ser positiva.");</w:t>
                             </w:r>
                           </w:p>
                           <w:p>
@@ -15482,8 +15544,15 @@
                             <w:r>
                               <w:rPr>
                                 <w:rFonts w:ascii="Cascadia Mono SemiBold" w:hAnsi="Cascadia Mono SemiBold" w:cs="Cascadia Mono SemiBold"/>
+                                <w:lang w:val="es-ES"/>
                               </w:rPr>
-                              <w:t xml:space="preserve">        }</w:t>
+                              <w:t xml:space="preserve">        </w:t>
+                            </w:r>
+                            <w:r>
+                              <w:rPr>
+                                <w:rFonts w:ascii="Cascadia Mono SemiBold" w:hAnsi="Cascadia Mono SemiBold" w:cs="Cascadia Mono SemiBold"/>
+                              </w:rPr>
+                              <w:t>}</w:t>
                             </w:r>
                           </w:p>
                           <w:p>
@@ -15703,7 +15772,7 @@
           </mc:Choice>
           <mc:Fallback>
             <w:pict>
-              <v:rect w14:anchorId="3A77B857" id="_x0000_s1035" style="position:absolute;left:0;text-align:left;margin-left:36pt;margin-top:.4pt;width:505.3pt;height:221.25pt;z-index:251662336;visibility:visible;mso-wrap-style:square;mso-width-percent:0;mso-height-percent:0;mso-wrap-distance-left:9pt;mso-wrap-distance-top:0;mso-wrap-distance-right:9pt;mso-wrap-distance-bottom:0;mso-position-horizontal:absolute;mso-position-horizontal-relative:margin;mso-position-vertical:absolute;mso-position-vertical-relative:text;mso-width-percent:0;mso-height-percent:0;mso-width-relative:margin;mso-height-relative:margin;v-text-anchor:middle" o:gfxdata="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" fillcolor="black [3213]" strokecolor="black [3213]" strokeweight="2pt">
+              <v:rect w14:anchorId="3A77B857" id="_x0000_s1035" style="position:absolute;left:0;text-align:left;margin-left:36pt;margin-top:.4pt;width:505.3pt;height:221.25pt;z-index:251659264;visibility:visible;mso-wrap-style:square;mso-width-percent:0;mso-height-percent:0;mso-wrap-distance-left:9pt;mso-wrap-distance-top:0;mso-wrap-distance-right:9pt;mso-wrap-distance-bottom:0;mso-position-horizontal:absolute;mso-position-horizontal-relative:margin;mso-position-vertical:absolute;mso-position-vertical-relative:text;mso-width-percent:0;mso-height-percent:0;mso-width-relative:margin;mso-height-relative:margin;v-text-anchor:middle" o:gfxdata="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" fillcolor="black [3213]" strokecolor="black [3213]" strokeweight="2pt">
                 <v:textbox>
                   <w:txbxContent>
                     <w:p>
@@ -15789,19 +15858,37 @@
                         <w:pStyle w:val="Sinespaciado"/>
                         <w:rPr>
                           <w:rFonts w:ascii="Cascadia Mono SemiBold" w:hAnsi="Cascadia Mono SemiBold" w:cs="Cascadia Mono SemiBold"/>
+                          <w:lang w:val="es-ES"/>
                         </w:rPr>
                       </w:pPr>
                       <w:r>
                         <w:rPr>
                           <w:rFonts w:ascii="Cascadia Mono SemiBold" w:hAnsi="Cascadia Mono SemiBold" w:cs="Cascadia Mono SemiBold"/>
                         </w:rPr>
-                        <w:t xml:space="preserve">            throw new </w:t>
+                        <w:t xml:space="preserve">            </w:t>
+                      </w:r>
+                      <w:proofErr w:type="spellStart"/>
+                      <w:r>
+                        <w:rPr>
+                          <w:rFonts w:ascii="Cascadia Mono SemiBold" w:hAnsi="Cascadia Mono SemiBold" w:cs="Cascadia Mono SemiBold"/>
+                          <w:lang w:val="es-ES"/>
+                        </w:rPr>
+                        <w:t>throw</w:t>
+                      </w:r>
+                      <w:proofErr w:type="spellEnd"/>
+                      <w:r>
+                        <w:rPr>
+                          <w:rFonts w:ascii="Cascadia Mono SemiBold" w:hAnsi="Cascadia Mono SemiBold" w:cs="Cascadia Mono SemiBold"/>
+                          <w:lang w:val="es-ES"/>
+                        </w:rPr>
+                        <w:t xml:space="preserve"> new </w:t>
                       </w:r>
                       <w:proofErr w:type="spellStart"/>
                       <w:proofErr w:type="gramStart"/>
                       <w:r>
                         <w:rPr>
                           <w:rFonts w:ascii="Cascadia Mono SemiBold" w:hAnsi="Cascadia Mono SemiBold" w:cs="Cascadia Mono SemiBold"/>
+                          <w:lang w:val="es-ES"/>
                         </w:rPr>
                         <w:t>IllegalArgumentException</w:t>
                       </w:r>
@@ -15809,6 +15896,7 @@
                       <w:r>
                         <w:rPr>
                           <w:rFonts w:ascii="Cascadia Mono SemiBold" w:hAnsi="Cascadia Mono SemiBold" w:cs="Cascadia Mono SemiBold"/>
+                          <w:lang w:val="es-ES"/>
                         </w:rPr>
                         <w:t>(</w:t>
                       </w:r>
@@ -15816,50 +15904,9 @@
                       <w:r>
                         <w:rPr>
                           <w:rFonts w:ascii="Cascadia Mono SemiBold" w:hAnsi="Cascadia Mono SemiBold" w:cs="Cascadia Mono SemiBold"/>
+                          <w:lang w:val="es-ES"/>
                         </w:rPr>
-                        <w:t xml:space="preserve">"La </w:t>
-                      </w:r>
-                      <w:proofErr w:type="spellStart"/>
-                      <w:r>
-                        <w:rPr>
-                          <w:rFonts w:ascii="Cascadia Mono SemiBold" w:hAnsi="Cascadia Mono SemiBold" w:cs="Cascadia Mono SemiBold"/>
-                        </w:rPr>
-                        <w:t>intensidad</w:t>
-                      </w:r>
-                      <w:proofErr w:type="spellEnd"/>
-                      <w:r>
-                        <w:rPr>
-                          <w:rFonts w:ascii="Cascadia Mono SemiBold" w:hAnsi="Cascadia Mono SemiBold" w:cs="Cascadia Mono SemiBold"/>
-                        </w:rPr>
-                        <w:t xml:space="preserve"> </w:t>
-                      </w:r>
-                      <w:proofErr w:type="spellStart"/>
-                      <w:r>
-                        <w:rPr>
-                          <w:rFonts w:ascii="Cascadia Mono SemiBold" w:hAnsi="Cascadia Mono SemiBold" w:cs="Cascadia Mono SemiBold"/>
-                        </w:rPr>
-                        <w:t>debe</w:t>
-                      </w:r>
-                      <w:proofErr w:type="spellEnd"/>
-                      <w:r>
-                        <w:rPr>
-                          <w:rFonts w:ascii="Cascadia Mono SemiBold" w:hAnsi="Cascadia Mono SemiBold" w:cs="Cascadia Mono SemiBold"/>
-                        </w:rPr>
-                        <w:t xml:space="preserve"> ser </w:t>
-                      </w:r>
-                      <w:proofErr w:type="spellStart"/>
-                      <w:r>
-                        <w:rPr>
-                          <w:rFonts w:ascii="Cascadia Mono SemiBold" w:hAnsi="Cascadia Mono SemiBold" w:cs="Cascadia Mono SemiBold"/>
-                        </w:rPr>
-                        <w:t>positiva</w:t>
-                      </w:r>
-                      <w:proofErr w:type="spellEnd"/>
-                      <w:r>
-                        <w:rPr>
-                          <w:rFonts w:ascii="Cascadia Mono SemiBold" w:hAnsi="Cascadia Mono SemiBold" w:cs="Cascadia Mono SemiBold"/>
-                        </w:rPr>
-                        <w:t>.");</w:t>
+                        <w:t>"La intensidad debe ser positiva.");</w:t>
                       </w:r>
                     </w:p>
                     <w:p>
@@ -15872,8 +15919,15 @@
                       <w:r>
                         <w:rPr>
                           <w:rFonts w:ascii="Cascadia Mono SemiBold" w:hAnsi="Cascadia Mono SemiBold" w:cs="Cascadia Mono SemiBold"/>
+                          <w:lang w:val="es-ES"/>
                         </w:rPr>
-                        <w:t xml:space="preserve">        }</w:t>
+                        <w:t xml:space="preserve">        </w:t>
+                      </w:r>
+                      <w:r>
+                        <w:rPr>
+                          <w:rFonts w:ascii="Cascadia Mono SemiBold" w:hAnsi="Cascadia Mono SemiBold" w:cs="Cascadia Mono SemiBold"/>
+                        </w:rPr>
+                        <w:t>}</w:t>
                       </w:r>
                     </w:p>
                     <w:p>
@@ -16661,7 +16715,7 @@
         <mc:AlternateContent>
           <mc:Choice Requires="wps">
             <w:drawing>
-              <wp:anchor distT="0" distB="0" distL="114300" distR="114300" simplePos="0" relativeHeight="251668480" behindDoc="0" locked="0" layoutInCell="1" allowOverlap="1" wp14:anchorId="785DDB1C" wp14:editId="4C18A5A6">
+              <wp:anchor distT="0" distB="0" distL="114300" distR="114300" simplePos="0" relativeHeight="251662336" behindDoc="0" locked="0" layoutInCell="1" allowOverlap="1" wp14:anchorId="785DDB1C" wp14:editId="4C18A5A6">
                 <wp:simplePos x="0" y="0"/>
                 <wp:positionH relativeFrom="margin">
                   <wp:posOffset>457363</wp:posOffset>
@@ -16793,7 +16847,7 @@
           </mc:Choice>
           <mc:Fallback>
             <w:pict>
-              <v:rect w14:anchorId="785DDB1C" id="_x0000_s1036" style="position:absolute;margin-left:36pt;margin-top:1.25pt;width:466.4pt;height:45pt;z-index:251668480;visibility:visible;mso-wrap-style:square;mso-width-percent:0;mso-height-percent:0;mso-wrap-distance-left:9pt;mso-wrap-distance-top:0;mso-wrap-distance-right:9pt;mso-wrap-distance-bottom:0;mso-position-horizontal:absolute;mso-position-horizontal-relative:margin;mso-position-vertical:absolute;mso-position-vertical-relative:text;mso-width-percent:0;mso-height-percent:0;mso-width-relative:margin;mso-height-relative:margin;v-text-anchor:middle" o:gfxdata="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" fillcolor="black [3213]" strokecolor="black [3213]" strokeweight="2pt">
+              <v:rect w14:anchorId="785DDB1C" id="_x0000_s1036" style="position:absolute;margin-left:36pt;margin-top:1.25pt;width:466.4pt;height:45pt;z-index:251662336;visibility:visible;mso-wrap-style:square;mso-width-percent:0;mso-height-percent:0;mso-wrap-distance-left:9pt;mso-wrap-distance-top:0;mso-wrap-distance-right:9pt;mso-wrap-distance-bottom:0;mso-position-horizontal:absolute;mso-position-horizontal-relative:margin;mso-position-vertical:absolute;mso-position-vertical-relative:text;mso-width-percent:0;mso-height-percent:0;mso-width-relative:margin;mso-height-relative:margin;v-text-anchor:middle" o:gfxdata="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" fillcolor="black [3213]" strokecolor="black [3213]" strokeweight="2pt">
                 <v:textbox>
                   <w:txbxContent>
                     <w:p>
@@ -18059,7 +18113,7 @@
         </mc:Choice>
         <mc:Fallback>
           <w:pict>
-            <v:shape w14:anchorId="4206F0E7" id="Graphic 4" o:spid="_x0000_s1026" style="position:absolute;margin-left:86.45pt;margin-top:719.75pt;width:476.5pt;height:25.2pt;z-index:-251659264;visibility:visible;mso-wrap-style:square;mso-wrap-distance-left:0;mso-wrap-distance-top:0;mso-wrap-distance-right:0;mso-wrap-distance-bottom:0;mso-position-horizontal:absolute;mso-position-horizontal-relative:page;mso-position-vertical:absolute;mso-position-vertical-relative:page;v-text-anchor:top" coordsize="6051550,320040" o:gfxdata="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" path="m6051397,l5594197,,,12,,18605r5594197,l5594197,320040r457200,l6051397,xe" fillcolor="black" stroked="f">
+            <v:shape w14:anchorId="7CB07FFE" id="Graphic 4" o:spid="_x0000_s1026" style="position:absolute;margin-left:86.45pt;margin-top:719.75pt;width:476.5pt;height:25.2pt;z-index:-251659264;visibility:visible;mso-wrap-style:square;mso-wrap-distance-left:0;mso-wrap-distance-top:0;mso-wrap-distance-right:0;mso-wrap-distance-bottom:0;mso-position-horizontal:absolute;mso-position-horizontal-relative:page;mso-position-vertical:absolute;mso-position-vertical-relative:page;v-text-anchor:top" coordsize="6051550,320040" o:gfxdata="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" path="m6051397,l5594197,,,12,,18605r5594197,l5594197,320040r457200,l6051397,xe" fillcolor="black" stroked="f">
               <v:path arrowok="t"/>
               <w10:wrap anchorx="page" anchory="page"/>
             </v:shape>
@@ -18951,7 +19005,7 @@
         <w:sz w:val="20"/>
       </w:rPr>
     </w:lvl>
-    <w:lvl w:ilvl="1" w:tentative="1">
+    <w:lvl w:ilvl="1">
       <w:start w:val="1"/>
       <w:numFmt w:val="bullet"/>
       <w:lvlText w:val="o"/>
@@ -21482,6 +21536,155 @@
     </w:lvl>
   </w:abstractNum>
   <w:abstractNum w:abstractNumId="24" w15:restartNumberingAfterBreak="0">
+    <w:nsid w:val="42AE4D24"/>
+    <w:multiLevelType w:val="multilevel"/>
+    <w:tmpl w:val="24484D14"/>
+    <w:lvl w:ilvl="0">
+      <w:start w:val="1"/>
+      <w:numFmt w:val="bullet"/>
+      <w:lvlText w:val=""/>
+      <w:lvlJc w:val="left"/>
+      <w:pPr>
+        <w:tabs>
+          <w:tab w:val="num" w:pos="720"/>
+        </w:tabs>
+        <w:ind w:left="720" w:hanging="360"/>
+      </w:pPr>
+      <w:rPr>
+        <w:rFonts w:ascii="Symbol" w:hAnsi="Symbol" w:hint="default"/>
+        <w:sz w:val="20"/>
+      </w:rPr>
+    </w:lvl>
+    <w:lvl w:ilvl="1">
+      <w:start w:val="1"/>
+      <w:numFmt w:val="bullet"/>
+      <w:lvlText w:val="o"/>
+      <w:lvlJc w:val="left"/>
+      <w:pPr>
+        <w:tabs>
+          <w:tab w:val="num" w:pos="1440"/>
+        </w:tabs>
+        <w:ind w:left="1440" w:hanging="360"/>
+      </w:pPr>
+      <w:rPr>
+        <w:rFonts w:ascii="Courier New" w:hAnsi="Courier New" w:hint="default"/>
+        <w:sz w:val="20"/>
+      </w:rPr>
+    </w:lvl>
+    <w:lvl w:ilvl="2" w:tentative="1">
+      <w:start w:val="1"/>
+      <w:numFmt w:val="bullet"/>
+      <w:lvlText w:val=""/>
+      <w:lvlJc w:val="left"/>
+      <w:pPr>
+        <w:tabs>
+          <w:tab w:val="num" w:pos="2160"/>
+        </w:tabs>
+        <w:ind w:left="2160" w:hanging="360"/>
+      </w:pPr>
+      <w:rPr>
+        <w:rFonts w:ascii="Wingdings" w:hAnsi="Wingdings" w:hint="default"/>
+        <w:sz w:val="20"/>
+      </w:rPr>
+    </w:lvl>
+    <w:lvl w:ilvl="3" w:tentative="1">
+      <w:start w:val="1"/>
+      <w:numFmt w:val="bullet"/>
+      <w:lvlText w:val=""/>
+      <w:lvlJc w:val="left"/>
+      <w:pPr>
+        <w:tabs>
+          <w:tab w:val="num" w:pos="2880"/>
+        </w:tabs>
+        <w:ind w:left="2880" w:hanging="360"/>
+      </w:pPr>
+      <w:rPr>
+        <w:rFonts w:ascii="Wingdings" w:hAnsi="Wingdings" w:hint="default"/>
+        <w:sz w:val="20"/>
+      </w:rPr>
+    </w:lvl>
+    <w:lvl w:ilvl="4" w:tentative="1">
+      <w:start w:val="1"/>
+      <w:numFmt w:val="bullet"/>
+      <w:lvlText w:val=""/>
+      <w:lvlJc w:val="left"/>
+      <w:pPr>
+        <w:tabs>
+          <w:tab w:val="num" w:pos="3600"/>
+        </w:tabs>
+        <w:ind w:left="3600" w:hanging="360"/>
+      </w:pPr>
+      <w:rPr>
+        <w:rFonts w:ascii="Wingdings" w:hAnsi="Wingdings" w:hint="default"/>
+        <w:sz w:val="20"/>
+      </w:rPr>
+    </w:lvl>
+    <w:lvl w:ilvl="5" w:tentative="1">
+      <w:start w:val="1"/>
+      <w:numFmt w:val="bullet"/>
+      <w:lvlText w:val=""/>
+      <w:lvlJc w:val="left"/>
+      <w:pPr>
+        <w:tabs>
+          <w:tab w:val="num" w:pos="4320"/>
+        </w:tabs>
+        <w:ind w:left="4320" w:hanging="360"/>
+      </w:pPr>
+      <w:rPr>
+        <w:rFonts w:ascii="Wingdings" w:hAnsi="Wingdings" w:hint="default"/>
+        <w:sz w:val="20"/>
+      </w:rPr>
+    </w:lvl>
+    <w:lvl w:ilvl="6" w:tentative="1">
+      <w:start w:val="1"/>
+      <w:numFmt w:val="bullet"/>
+      <w:lvlText w:val=""/>
+      <w:lvlJc w:val="left"/>
+      <w:pPr>
+        <w:tabs>
+          <w:tab w:val="num" w:pos="5040"/>
+        </w:tabs>
+        <w:ind w:left="5040" w:hanging="360"/>
+      </w:pPr>
+      <w:rPr>
+        <w:rFonts w:ascii="Wingdings" w:hAnsi="Wingdings" w:hint="default"/>
+        <w:sz w:val="20"/>
+      </w:rPr>
+    </w:lvl>
+    <w:lvl w:ilvl="7" w:tentative="1">
+      <w:start w:val="1"/>
+      <w:numFmt w:val="bullet"/>
+      <w:lvlText w:val=""/>
+      <w:lvlJc w:val="left"/>
+      <w:pPr>
+        <w:tabs>
+          <w:tab w:val="num" w:pos="5760"/>
+        </w:tabs>
+        <w:ind w:left="5760" w:hanging="360"/>
+      </w:pPr>
+      <w:rPr>
+        <w:rFonts w:ascii="Wingdings" w:hAnsi="Wingdings" w:hint="default"/>
+        <w:sz w:val="20"/>
+      </w:rPr>
+    </w:lvl>
+    <w:lvl w:ilvl="8" w:tentative="1">
+      <w:start w:val="1"/>
+      <w:numFmt w:val="bullet"/>
+      <w:lvlText w:val=""/>
+      <w:lvlJc w:val="left"/>
+      <w:pPr>
+        <w:tabs>
+          <w:tab w:val="num" w:pos="6480"/>
+        </w:tabs>
+        <w:ind w:left="6480" w:hanging="360"/>
+      </w:pPr>
+      <w:rPr>
+        <w:rFonts w:ascii="Wingdings" w:hAnsi="Wingdings" w:hint="default"/>
+        <w:sz w:val="20"/>
+      </w:rPr>
+    </w:lvl>
+  </w:abstractNum>
+  <w:abstractNum w:abstractNumId="25" w15:restartNumberingAfterBreak="0">
     <w:nsid w:val="48302CFF"/>
     <w:multiLevelType w:val="multilevel"/>
     <w:tmpl w:val="01DE1556"/>
@@ -21630,7 +21833,7 @@
       </w:rPr>
     </w:lvl>
   </w:abstractNum>
-  <w:abstractNum w:abstractNumId="25" w15:restartNumberingAfterBreak="0">
+  <w:abstractNum w:abstractNumId="26" w15:restartNumberingAfterBreak="0">
     <w:nsid w:val="4A821D95"/>
     <w:multiLevelType w:val="multilevel"/>
     <w:tmpl w:val="01DE1556"/>
@@ -21779,7 +21982,7 @@
       </w:rPr>
     </w:lvl>
   </w:abstractNum>
-  <w:abstractNum w:abstractNumId="26" w15:restartNumberingAfterBreak="0">
+  <w:abstractNum w:abstractNumId="27" w15:restartNumberingAfterBreak="0">
     <w:nsid w:val="4D0802A3"/>
     <w:multiLevelType w:val="multilevel"/>
     <w:tmpl w:val="BDF04E98"/>
@@ -21928,7 +22131,7 @@
       </w:rPr>
     </w:lvl>
   </w:abstractNum>
-  <w:abstractNum w:abstractNumId="27" w15:restartNumberingAfterBreak="0">
+  <w:abstractNum w:abstractNumId="28" w15:restartNumberingAfterBreak="0">
     <w:nsid w:val="4F1C370C"/>
     <w:multiLevelType w:val="multilevel"/>
     <w:tmpl w:val="288ABAE4"/>
@@ -22041,7 +22244,7 @@
       </w:pPr>
     </w:lvl>
   </w:abstractNum>
-  <w:abstractNum w:abstractNumId="28" w15:restartNumberingAfterBreak="0">
+  <w:abstractNum w:abstractNumId="29" w15:restartNumberingAfterBreak="0">
     <w:nsid w:val="4FCC1037"/>
     <w:multiLevelType w:val="hybridMultilevel"/>
     <w:tmpl w:val="7C08BEB8"/>
@@ -22127,7 +22330,7 @@
       </w:pPr>
     </w:lvl>
   </w:abstractNum>
-  <w:abstractNum w:abstractNumId="29" w15:restartNumberingAfterBreak="0">
+  <w:abstractNum w:abstractNumId="30" w15:restartNumberingAfterBreak="0">
     <w:nsid w:val="55E443F3"/>
     <w:multiLevelType w:val="hybridMultilevel"/>
     <w:tmpl w:val="A368740C"/>
@@ -22248,7 +22451,7 @@
       </w:rPr>
     </w:lvl>
   </w:abstractNum>
-  <w:abstractNum w:abstractNumId="30" w15:restartNumberingAfterBreak="0">
+  <w:abstractNum w:abstractNumId="31" w15:restartNumberingAfterBreak="0">
     <w:nsid w:val="583C2E88"/>
     <w:multiLevelType w:val="multilevel"/>
     <w:tmpl w:val="C66EDFCA"/>
@@ -22397,7 +22600,7 @@
       </w:rPr>
     </w:lvl>
   </w:abstractNum>
-  <w:abstractNum w:abstractNumId="31" w15:restartNumberingAfterBreak="0">
+  <w:abstractNum w:abstractNumId="32" w15:restartNumberingAfterBreak="0">
     <w:nsid w:val="584F2438"/>
     <w:multiLevelType w:val="multilevel"/>
     <w:tmpl w:val="7C6220D8"/>
@@ -22510,7 +22713,7 @@
       </w:pPr>
     </w:lvl>
   </w:abstractNum>
-  <w:abstractNum w:abstractNumId="32" w15:restartNumberingAfterBreak="0">
+  <w:abstractNum w:abstractNumId="33" w15:restartNumberingAfterBreak="0">
     <w:nsid w:val="585160A1"/>
     <w:multiLevelType w:val="multilevel"/>
     <w:tmpl w:val="3F7AB584"/>
@@ -22659,7 +22862,7 @@
       </w:rPr>
     </w:lvl>
   </w:abstractNum>
-  <w:abstractNum w:abstractNumId="33" w15:restartNumberingAfterBreak="0">
+  <w:abstractNum w:abstractNumId="34" w15:restartNumberingAfterBreak="0">
     <w:nsid w:val="5AEF39BB"/>
     <w:multiLevelType w:val="hybridMultilevel"/>
     <w:tmpl w:val="0AE2CBB0"/>
@@ -22772,7 +22975,7 @@
       </w:rPr>
     </w:lvl>
   </w:abstractNum>
-  <w:abstractNum w:abstractNumId="34" w15:restartNumberingAfterBreak="0">
+  <w:abstractNum w:abstractNumId="35" w15:restartNumberingAfterBreak="0">
     <w:nsid w:val="5BF04610"/>
     <w:multiLevelType w:val="multilevel"/>
     <w:tmpl w:val="1AB280E0"/>
@@ -22885,7 +23088,7 @@
       </w:pPr>
     </w:lvl>
   </w:abstractNum>
-  <w:abstractNum w:abstractNumId="35" w15:restartNumberingAfterBreak="0">
+  <w:abstractNum w:abstractNumId="36" w15:restartNumberingAfterBreak="0">
     <w:nsid w:val="617B71A4"/>
     <w:multiLevelType w:val="hybridMultilevel"/>
     <w:tmpl w:val="BBB6A404"/>
@@ -22998,7 +23201,7 @@
       </w:rPr>
     </w:lvl>
   </w:abstractNum>
-  <w:abstractNum w:abstractNumId="36" w15:restartNumberingAfterBreak="0">
+  <w:abstractNum w:abstractNumId="37" w15:restartNumberingAfterBreak="0">
     <w:nsid w:val="6320087D"/>
     <w:multiLevelType w:val="multilevel"/>
     <w:tmpl w:val="8F2AEAC8"/>
@@ -23147,7 +23350,7 @@
       </w:rPr>
     </w:lvl>
   </w:abstractNum>
-  <w:abstractNum w:abstractNumId="37" w15:restartNumberingAfterBreak="0">
+  <w:abstractNum w:abstractNumId="38" w15:restartNumberingAfterBreak="0">
     <w:nsid w:val="659E19C7"/>
     <w:multiLevelType w:val="hybridMultilevel"/>
     <w:tmpl w:val="338C01D6"/>
@@ -23260,7 +23463,7 @@
       </w:rPr>
     </w:lvl>
   </w:abstractNum>
-  <w:abstractNum w:abstractNumId="38" w15:restartNumberingAfterBreak="0">
+  <w:abstractNum w:abstractNumId="39" w15:restartNumberingAfterBreak="0">
     <w:nsid w:val="67E636D4"/>
     <w:multiLevelType w:val="multilevel"/>
     <w:tmpl w:val="254074A0"/>
@@ -23409,7 +23612,7 @@
       </w:rPr>
     </w:lvl>
   </w:abstractNum>
-  <w:abstractNum w:abstractNumId="39" w15:restartNumberingAfterBreak="0">
+  <w:abstractNum w:abstractNumId="40" w15:restartNumberingAfterBreak="0">
     <w:nsid w:val="6AF91E67"/>
     <w:multiLevelType w:val="multilevel"/>
     <w:tmpl w:val="03ECE7A6"/>
@@ -23558,7 +23761,7 @@
       </w:rPr>
     </w:lvl>
   </w:abstractNum>
-  <w:abstractNum w:abstractNumId="40" w15:restartNumberingAfterBreak="0">
+  <w:abstractNum w:abstractNumId="41" w15:restartNumberingAfterBreak="0">
     <w:nsid w:val="6D4248D3"/>
     <w:multiLevelType w:val="multilevel"/>
     <w:tmpl w:val="26A4D100"/>
@@ -23707,7 +23910,7 @@
       </w:rPr>
     </w:lvl>
   </w:abstractNum>
-  <w:abstractNum w:abstractNumId="41" w15:restartNumberingAfterBreak="0">
+  <w:abstractNum w:abstractNumId="42" w15:restartNumberingAfterBreak="0">
     <w:nsid w:val="726C5BEA"/>
     <w:multiLevelType w:val="multilevel"/>
     <w:tmpl w:val="BC1AA15C"/>
@@ -23820,7 +24023,7 @@
       </w:pPr>
     </w:lvl>
   </w:abstractNum>
-  <w:abstractNum w:abstractNumId="42" w15:restartNumberingAfterBreak="0">
+  <w:abstractNum w:abstractNumId="43" w15:restartNumberingAfterBreak="0">
     <w:nsid w:val="762008A4"/>
     <w:multiLevelType w:val="hybridMultilevel"/>
     <w:tmpl w:val="6EF299AA"/>
@@ -23941,7 +24144,7 @@
       </w:rPr>
     </w:lvl>
   </w:abstractNum>
-  <w:abstractNum w:abstractNumId="43" w15:restartNumberingAfterBreak="0">
+  <w:abstractNum w:abstractNumId="44" w15:restartNumberingAfterBreak="0">
     <w:nsid w:val="77944D1F"/>
     <w:multiLevelType w:val="hybridMultilevel"/>
     <w:tmpl w:val="8D047982"/>
@@ -24063,7 +24266,7 @@
       </w:rPr>
     </w:lvl>
   </w:abstractNum>
-  <w:abstractNum w:abstractNumId="44" w15:restartNumberingAfterBreak="0">
+  <w:abstractNum w:abstractNumId="45" w15:restartNumberingAfterBreak="0">
     <w:nsid w:val="79A203C0"/>
     <w:multiLevelType w:val="multilevel"/>
     <w:tmpl w:val="F6C46EFE"/>
@@ -24212,7 +24415,7 @@
       </w:rPr>
     </w:lvl>
   </w:abstractNum>
-  <w:abstractNum w:abstractNumId="45" w15:restartNumberingAfterBreak="0">
+  <w:abstractNum w:abstractNumId="46" w15:restartNumberingAfterBreak="0">
     <w:nsid w:val="7B4152CC"/>
     <w:multiLevelType w:val="multilevel"/>
     <w:tmpl w:val="AAB44EC0"/>
@@ -24361,7 +24564,7 @@
       </w:rPr>
     </w:lvl>
   </w:abstractNum>
-  <w:abstractNum w:abstractNumId="46" w15:restartNumberingAfterBreak="0">
+  <w:abstractNum w:abstractNumId="47" w15:restartNumberingAfterBreak="0">
     <w:nsid w:val="7CD66453"/>
     <w:multiLevelType w:val="hybridMultilevel"/>
     <w:tmpl w:val="DBE4549E"/>
@@ -24474,7 +24677,7 @@
       </w:rPr>
     </w:lvl>
   </w:abstractNum>
-  <w:abstractNum w:abstractNumId="47" w15:restartNumberingAfterBreak="0">
+  <w:abstractNum w:abstractNumId="48" w15:restartNumberingAfterBreak="0">
     <w:nsid w:val="7F4A1346"/>
     <w:multiLevelType w:val="multilevel"/>
     <w:tmpl w:val="2FA2E506"/>
@@ -24587,7 +24790,7 @@
       </w:pPr>
     </w:lvl>
   </w:abstractNum>
-  <w:abstractNum w:abstractNumId="48" w15:restartNumberingAfterBreak="0">
+  <w:abstractNum w:abstractNumId="49" w15:restartNumberingAfterBreak="0">
     <w:nsid w:val="7F89001A"/>
     <w:multiLevelType w:val="hybridMultilevel"/>
     <w:tmpl w:val="3B9C4B86"/>
@@ -24701,13 +24904,13 @@
     </w:lvl>
   </w:abstractNum>
   <w:num w:numId="1" w16cid:durableId="877090183">
-    <w:abstractNumId w:val="29"/>
+    <w:abstractNumId w:val="30"/>
   </w:num>
   <w:num w:numId="2" w16cid:durableId="2026899589">
     <w:abstractNumId w:val="17"/>
   </w:num>
   <w:num w:numId="3" w16cid:durableId="957681745">
-    <w:abstractNumId w:val="42"/>
+    <w:abstractNumId w:val="43"/>
   </w:num>
   <w:num w:numId="4" w16cid:durableId="1191380890">
     <w:abstractNumId w:val="23"/>
@@ -24716,22 +24919,22 @@
     <w:abstractNumId w:val="19"/>
   </w:num>
   <w:num w:numId="6" w16cid:durableId="306206851">
-    <w:abstractNumId w:val="28"/>
+    <w:abstractNumId w:val="29"/>
   </w:num>
   <w:num w:numId="7" w16cid:durableId="1938176548">
     <w:abstractNumId w:val="11"/>
   </w:num>
   <w:num w:numId="8" w16cid:durableId="1563715896">
-    <w:abstractNumId w:val="26"/>
+    <w:abstractNumId w:val="27"/>
   </w:num>
   <w:num w:numId="9" w16cid:durableId="491608981">
-    <w:abstractNumId w:val="37"/>
+    <w:abstractNumId w:val="38"/>
   </w:num>
   <w:num w:numId="10" w16cid:durableId="677997391">
-    <w:abstractNumId w:val="34"/>
+    <w:abstractNumId w:val="35"/>
   </w:num>
   <w:num w:numId="11" w16cid:durableId="1859807580">
-    <w:abstractNumId w:val="43"/>
+    <w:abstractNumId w:val="44"/>
   </w:num>
   <w:num w:numId="12" w16cid:durableId="1628438625">
     <w:abstractNumId w:val="18"/>
@@ -24740,25 +24943,25 @@
     <w:abstractNumId w:val="10"/>
   </w:num>
   <w:num w:numId="14" w16cid:durableId="313415315">
+    <w:abstractNumId w:val="26"/>
+  </w:num>
+  <w:num w:numId="15" w16cid:durableId="446507316">
+    <w:abstractNumId w:val="28"/>
+  </w:num>
+  <w:num w:numId="16" w16cid:durableId="1092774637">
     <w:abstractNumId w:val="25"/>
   </w:num>
-  <w:num w:numId="15" w16cid:durableId="446507316">
-    <w:abstractNumId w:val="27"/>
-  </w:num>
-  <w:num w:numId="16" w16cid:durableId="1092774637">
-    <w:abstractNumId w:val="24"/>
-  </w:num>
   <w:num w:numId="17" w16cid:durableId="1290671947">
-    <w:abstractNumId w:val="47"/>
+    <w:abstractNumId w:val="48"/>
   </w:num>
   <w:num w:numId="18" w16cid:durableId="595139654">
-    <w:abstractNumId w:val="46"/>
+    <w:abstractNumId w:val="47"/>
   </w:num>
   <w:num w:numId="19" w16cid:durableId="1343555217">
     <w:abstractNumId w:val="12"/>
   </w:num>
   <w:num w:numId="20" w16cid:durableId="1750034677">
-    <w:abstractNumId w:val="41"/>
+    <w:abstractNumId w:val="42"/>
   </w:num>
   <w:num w:numId="21" w16cid:durableId="94830986">
     <w:abstractNumId w:val="13"/>
@@ -24776,16 +24979,16 @@
     <w:abstractNumId w:val="16"/>
   </w:num>
   <w:num w:numId="26" w16cid:durableId="1795752369">
-    <w:abstractNumId w:val="48"/>
+    <w:abstractNumId w:val="49"/>
   </w:num>
   <w:num w:numId="27" w16cid:durableId="647443832">
-    <w:abstractNumId w:val="39"/>
+    <w:abstractNumId w:val="40"/>
   </w:num>
   <w:num w:numId="28" w16cid:durableId="970327364">
     <w:abstractNumId w:val="6"/>
   </w:num>
   <w:num w:numId="29" w16cid:durableId="1454594311">
-    <w:abstractNumId w:val="36"/>
+    <w:abstractNumId w:val="37"/>
   </w:num>
   <w:num w:numId="30" w16cid:durableId="497572655">
     <w:abstractNumId w:val="15"/>
@@ -24794,13 +24997,13 @@
     <w:abstractNumId w:val="1"/>
   </w:num>
   <w:num w:numId="32" w16cid:durableId="1403524853">
-    <w:abstractNumId w:val="35"/>
+    <w:abstractNumId w:val="36"/>
   </w:num>
   <w:num w:numId="33" w16cid:durableId="632562901">
-    <w:abstractNumId w:val="31"/>
+    <w:abstractNumId w:val="32"/>
   </w:num>
   <w:num w:numId="34" w16cid:durableId="1209612196">
-    <w:abstractNumId w:val="44"/>
+    <w:abstractNumId w:val="45"/>
   </w:num>
   <w:num w:numId="35" w16cid:durableId="1999066127">
     <w:abstractNumId w:val="5"/>
@@ -24809,22 +25012,22 @@
     <w:abstractNumId w:val="2"/>
   </w:num>
   <w:num w:numId="37" w16cid:durableId="730737495">
-    <w:abstractNumId w:val="45"/>
+    <w:abstractNumId w:val="46"/>
   </w:num>
   <w:num w:numId="38" w16cid:durableId="1408268161">
-    <w:abstractNumId w:val="40"/>
+    <w:abstractNumId w:val="41"/>
   </w:num>
   <w:num w:numId="39" w16cid:durableId="1021592611">
     <w:abstractNumId w:val="3"/>
   </w:num>
   <w:num w:numId="40" w16cid:durableId="1820807341">
-    <w:abstractNumId w:val="30"/>
+    <w:abstractNumId w:val="31"/>
   </w:num>
   <w:num w:numId="41" w16cid:durableId="1175413996">
-    <w:abstractNumId w:val="38"/>
+    <w:abstractNumId w:val="39"/>
   </w:num>
   <w:num w:numId="42" w16cid:durableId="50153702">
-    <w:abstractNumId w:val="33"/>
+    <w:abstractNumId w:val="34"/>
   </w:num>
   <w:num w:numId="43" w16cid:durableId="674840036">
     <w:abstractNumId w:val="4"/>
@@ -24836,7 +25039,7 @@
     <w:abstractNumId w:val="14"/>
   </w:num>
   <w:num w:numId="46" w16cid:durableId="1539583976">
-    <w:abstractNumId w:val="32"/>
+    <w:abstractNumId w:val="33"/>
   </w:num>
   <w:num w:numId="47" w16cid:durableId="1090085024">
     <w:abstractNumId w:val="8"/>
@@ -24846,6 +25049,9 @@
   </w:num>
   <w:num w:numId="49" w16cid:durableId="766771996">
     <w:abstractNumId w:val="20"/>
+  </w:num>
+  <w:num w:numId="50" w16cid:durableId="1216895073">
+    <w:abstractNumId w:val="24"/>
   </w:num>
   <w:numIdMacAtCleanup w:val="22"/>
 </w:numbering>

</xml_diff>

<commit_message>
finished subject + reto module 06
</commit_message>
<xml_diff>
--- a/subjects/subject_words/java06_es_subject.docx
+++ b/subjects/subject_words/java06_es_subject.docx
@@ -430,7 +430,7 @@
           </mc:Choice>
           <mc:Fallback>
             <w:pict>
-              <v:shape w14:anchorId="61BD0004" id="Graphic 3" o:spid="_x0000_s1026" style="position:absolute;margin-left:86.45pt;margin-top:20.05pt;width:476.5pt;height:25.2pt;z-index:-251659264;visibility:visible;mso-wrap-style:square;mso-wrap-distance-left:0;mso-wrap-distance-top:0;mso-wrap-distance-right:0;mso-wrap-distance-bottom:0;mso-position-horizontal:absolute;mso-position-horizontal-relative:page;mso-position-vertical:absolute;mso-position-vertical-relative:text;v-text-anchor:top" coordsize="6051550,320040" o:gfxdata="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" path="m6051397,l5594197,,,12,,18605r5594197,l5594197,320040r457200,l6051397,xe" fillcolor="black" stroked="f">
+              <v:shape w14:anchorId="550A2B94" id="Graphic 3" o:spid="_x0000_s1026" style="position:absolute;margin-left:86.45pt;margin-top:20.05pt;width:476.5pt;height:25.2pt;z-index:-251659264;visibility:visible;mso-wrap-style:square;mso-wrap-distance-left:0;mso-wrap-distance-top:0;mso-wrap-distance-right:0;mso-wrap-distance-bottom:0;mso-position-horizontal:absolute;mso-position-horizontal-relative:page;mso-position-vertical:absolute;mso-position-vertical-relative:text;v-text-anchor:top" coordsize="6051550,320040" o:gfxdata="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" path="m6051397,l5594197,,,12,,18605r5594197,l5594197,320040r457200,l6051397,xe" fillcolor="black" stroked="f">
                 <v:path arrowok="t"/>
                 <w10:wrap type="topAndBottom" anchorx="page"/>
               </v:shape>
@@ -456,7 +456,7 @@
         </w:sectPr>
       </w:pPr>
     </w:p>
-    <w:bookmarkStart w:id="0" w:name="_Toc236321492" w:displacedByCustomXml="next"/>
+    <w:bookmarkStart w:id="0" w:name="_Toc236740689" w:displacedByCustomXml="next"/>
     <w:sdt>
       <w:sdtPr>
         <w:rPr>
@@ -515,7 +515,7 @@
           <w:r>
             <w:fldChar w:fldCharType="separate"/>
           </w:r>
-          <w:hyperlink w:anchor="_Toc236321492" w:history="1">
+          <w:hyperlink w:anchor="_Toc236740689" w:history="1">
             <w:r>
               <w:rPr>
                 <w:rStyle w:val="Hipervnculo"/>
@@ -542,7 +542,7 @@
                 <w:noProof/>
                 <w:webHidden/>
               </w:rPr>
-              <w:instrText xml:space="preserve"> PAGEREF _Toc236321492 \h </w:instrText>
+              <w:instrText xml:space="preserve"> PAGEREF _Toc236740689 \h </w:instrText>
             </w:r>
             <w:r>
               <w:rPr>
@@ -588,7 +588,7 @@
               <w14:ligatures w14:val="standardContextual"/>
             </w:rPr>
           </w:pPr>
-          <w:hyperlink w:anchor="_Toc236321493" w:history="1">
+          <w:hyperlink w:anchor="_Toc236740690" w:history="1">
             <w:r>
               <w:rPr>
                 <w:rStyle w:val="Hipervnculo"/>
@@ -632,7 +632,7 @@
                 <w:noProof/>
                 <w:webHidden/>
               </w:rPr>
-              <w:instrText xml:space="preserve"> PAGEREF _Toc236321493 \h </w:instrText>
+              <w:instrText xml:space="preserve"> PAGEREF _Toc236740690 \h </w:instrText>
             </w:r>
             <w:r>
               <w:rPr>
@@ -678,7 +678,7 @@
               <w14:ligatures w14:val="standardContextual"/>
             </w:rPr>
           </w:pPr>
-          <w:hyperlink w:anchor="_Toc236321494" w:history="1">
+          <w:hyperlink w:anchor="_Toc236740691" w:history="1">
             <w:r>
               <w:rPr>
                 <w:rStyle w:val="Hipervnculo"/>
@@ -722,7 +722,7 @@
                 <w:noProof/>
                 <w:webHidden/>
               </w:rPr>
-              <w:instrText xml:space="preserve"> PAGEREF _Toc236321494 \h </w:instrText>
+              <w:instrText xml:space="preserve"> PAGEREF _Toc236740691 \h </w:instrText>
             </w:r>
             <w:r>
               <w:rPr>
@@ -768,7 +768,7 @@
               <w14:ligatures w14:val="standardContextual"/>
             </w:rPr>
           </w:pPr>
-          <w:hyperlink w:anchor="_Toc236321495" w:history="1">
+          <w:hyperlink w:anchor="_Toc236740692" w:history="1">
             <w:r>
               <w:rPr>
                 <w:rStyle w:val="Hipervnculo"/>
@@ -812,7 +812,7 @@
                 <w:noProof/>
                 <w:webHidden/>
               </w:rPr>
-              <w:instrText xml:space="preserve"> PAGEREF _Toc236321495 \h </w:instrText>
+              <w:instrText xml:space="preserve"> PAGEREF _Toc236740692 \h </w:instrText>
             </w:r>
             <w:r>
               <w:rPr>
@@ -858,7 +858,7 @@
               <w14:ligatures w14:val="standardContextual"/>
             </w:rPr>
           </w:pPr>
-          <w:hyperlink w:anchor="_Toc236321496" w:history="1">
+          <w:hyperlink w:anchor="_Toc236740693" w:history="1">
             <w:r>
               <w:rPr>
                 <w:rStyle w:val="Hipervnculo"/>
@@ -937,7 +937,7 @@
                 <w:noProof/>
                 <w:webHidden/>
               </w:rPr>
-              <w:instrText xml:space="preserve"> PAGEREF _Toc236321496 \h </w:instrText>
+              <w:instrText xml:space="preserve"> PAGEREF _Toc236740693 \h </w:instrText>
             </w:r>
             <w:r>
               <w:rPr>
@@ -983,7 +983,7 @@
               <w14:ligatures w14:val="standardContextual"/>
             </w:rPr>
           </w:pPr>
-          <w:hyperlink w:anchor="_Toc236321497" w:history="1">
+          <w:hyperlink w:anchor="_Toc236740694" w:history="1">
             <w:r>
               <w:rPr>
                 <w:rStyle w:val="Hipervnculo"/>
@@ -1054,7 +1054,7 @@
                 <w:noProof/>
                 <w:webHidden/>
               </w:rPr>
-              <w:instrText xml:space="preserve"> PAGEREF _Toc236321497 \h </w:instrText>
+              <w:instrText xml:space="preserve"> PAGEREF _Toc236740694 \h </w:instrText>
             </w:r>
             <w:r>
               <w:rPr>
@@ -1100,7 +1100,7 @@
               <w14:ligatures w14:val="standardContextual"/>
             </w:rPr>
           </w:pPr>
-          <w:hyperlink w:anchor="_Toc236321498" w:history="1">
+          <w:hyperlink w:anchor="_Toc236740695" w:history="1">
             <w:r>
               <w:rPr>
                 <w:rStyle w:val="Hipervnculo"/>
@@ -1190,7 +1190,7 @@
                 <w:noProof/>
                 <w:webHidden/>
               </w:rPr>
-              <w:instrText xml:space="preserve"> PAGEREF _Toc236321498 \h </w:instrText>
+              <w:instrText xml:space="preserve"> PAGEREF _Toc236740695 \h </w:instrText>
             </w:r>
             <w:r>
               <w:rPr>
@@ -1236,7 +1236,7 @@
               <w14:ligatures w14:val="standardContextual"/>
             </w:rPr>
           </w:pPr>
-          <w:hyperlink w:anchor="_Toc236321499" w:history="1">
+          <w:hyperlink w:anchor="_Toc236740696" w:history="1">
             <w:r>
               <w:rPr>
                 <w:rStyle w:val="Hipervnculo"/>
@@ -1315,7 +1315,7 @@
                 <w:noProof/>
                 <w:webHidden/>
               </w:rPr>
-              <w:instrText xml:space="preserve"> PAGEREF _Toc236321499 \h </w:instrText>
+              <w:instrText xml:space="preserve"> PAGEREF _Toc236740696 \h </w:instrText>
             </w:r>
             <w:r>
               <w:rPr>
@@ -1361,7 +1361,7 @@
               <w14:ligatures w14:val="standardContextual"/>
             </w:rPr>
           </w:pPr>
-          <w:hyperlink w:anchor="_Toc236321500" w:history="1">
+          <w:hyperlink w:anchor="_Toc236740697" w:history="1">
             <w:r>
               <w:rPr>
                 <w:rStyle w:val="Hipervnculo"/>
@@ -1432,7 +1432,7 @@
                 <w:noProof/>
                 <w:webHidden/>
               </w:rPr>
-              <w:instrText xml:space="preserve"> PAGEREF _Toc236321500 \h </w:instrText>
+              <w:instrText xml:space="preserve"> PAGEREF _Toc236740697 \h </w:instrText>
             </w:r>
             <w:r>
               <w:rPr>
@@ -1478,7 +1478,7 @@
               <w14:ligatures w14:val="standardContextual"/>
             </w:rPr>
           </w:pPr>
-          <w:hyperlink w:anchor="_Toc236321501" w:history="1">
+          <w:hyperlink w:anchor="_Toc236740698" w:history="1">
             <w:r>
               <w:rPr>
                 <w:rStyle w:val="Hipervnculo"/>
@@ -1557,7 +1557,7 @@
                 <w:noProof/>
                 <w:webHidden/>
               </w:rPr>
-              <w:instrText xml:space="preserve"> PAGEREF _Toc236321501 \h </w:instrText>
+              <w:instrText xml:space="preserve"> PAGEREF _Toc236740698 \h </w:instrText>
             </w:r>
             <w:r>
               <w:rPr>
@@ -1603,7 +1603,7 @@
               <w14:ligatures w14:val="standardContextual"/>
             </w:rPr>
           </w:pPr>
-          <w:hyperlink w:anchor="_Toc236321502" w:history="1">
+          <w:hyperlink w:anchor="_Toc236740699" w:history="1">
             <w:r>
               <w:rPr>
                 <w:rStyle w:val="Hipervnculo"/>
@@ -1674,7 +1674,7 @@
                 <w:noProof/>
                 <w:webHidden/>
               </w:rPr>
-              <w:instrText xml:space="preserve"> PAGEREF _Toc236321502 \h </w:instrText>
+              <w:instrText xml:space="preserve"> PAGEREF _Toc236740699 \h </w:instrText>
             </w:r>
             <w:r>
               <w:rPr>
@@ -1720,7 +1720,7 @@
               <w14:ligatures w14:val="standardContextual"/>
             </w:rPr>
           </w:pPr>
-          <w:hyperlink w:anchor="_Toc236321503" w:history="1">
+          <w:hyperlink w:anchor="_Toc236740700" w:history="1">
             <w:r>
               <w:rPr>
                 <w:rStyle w:val="Hipervnculo"/>
@@ -1791,7 +1791,7 @@
                 <w:noProof/>
                 <w:webHidden/>
               </w:rPr>
-              <w:instrText xml:space="preserve"> PAGEREF _Toc236321503 \h </w:instrText>
+              <w:instrText xml:space="preserve"> PAGEREF _Toc236740700 \h </w:instrText>
             </w:r>
             <w:r>
               <w:rPr>
@@ -1836,7 +1836,7 @@
               <w14:ligatures w14:val="standardContextual"/>
             </w:rPr>
           </w:pPr>
-          <w:hyperlink w:anchor="_Toc236321504" w:history="1">
+          <w:hyperlink w:anchor="_Toc236740701" w:history="1">
             <w:r>
               <w:rPr>
                 <w:rStyle w:val="Hipervnculo"/>
@@ -1863,7 +1863,7 @@
                 <w:noProof/>
                 <w:webHidden/>
               </w:rPr>
-              <w:instrText xml:space="preserve"> PAGEREF _Toc236321504 \h </w:instrText>
+              <w:instrText xml:space="preserve"> PAGEREF _Toc236740701 \h </w:instrText>
             </w:r>
             <w:r>
               <w:rPr>
@@ -1908,7 +1908,7 @@
               <w14:ligatures w14:val="standardContextual"/>
             </w:rPr>
           </w:pPr>
-          <w:hyperlink w:anchor="_Toc236321505" w:history="1">
+          <w:hyperlink w:anchor="_Toc236740702" w:history="1">
             <w:r>
               <w:rPr>
                 <w:rStyle w:val="Hipervnculo"/>
@@ -1935,7 +1935,7 @@
                 <w:noProof/>
                 <w:webHidden/>
               </w:rPr>
-              <w:instrText xml:space="preserve"> PAGEREF _Toc236321505 \h </w:instrText>
+              <w:instrText xml:space="preserve"> PAGEREF _Toc236740702 \h </w:instrText>
             </w:r>
             <w:r>
               <w:rPr>
@@ -1997,7 +1997,7 @@
           <w:numId w:val="5"/>
         </w:numPr>
       </w:pPr>
-      <w:bookmarkStart w:id="1" w:name="_Toc236321493"/>
+      <w:bookmarkStart w:id="1" w:name="_Toc236740690"/>
       <w:r>
         <w:lastRenderedPageBreak/>
         <w:t>Los Archivos de Asgard</w:t>
@@ -2022,7 +2022,7 @@
           <w:noProof/>
         </w:rPr>
         <w:drawing>
-          <wp:anchor distT="0" distB="0" distL="114300" distR="114300" simplePos="0" relativeHeight="251660288" behindDoc="0" locked="0" layoutInCell="1" allowOverlap="1" wp14:anchorId="23707DFA" wp14:editId="0C4B9D7F">
+          <wp:anchor distT="0" distB="0" distL="114300" distR="114300" simplePos="0" relativeHeight="251662336" behindDoc="0" locked="0" layoutInCell="1" allowOverlap="1" wp14:anchorId="23707DFA" wp14:editId="0C4B9D7F">
             <wp:simplePos x="0" y="0"/>
             <wp:positionH relativeFrom="column">
               <wp:posOffset>5081905</wp:posOffset>
@@ -3260,7 +3260,7 @@
         </w:numPr>
       </w:pPr>
       <w:bookmarkStart w:id="2" w:name="_bookmark1"/>
-      <w:bookmarkStart w:id="3" w:name="_Toc236321494"/>
+      <w:bookmarkStart w:id="3" w:name="_Toc236740691"/>
       <w:bookmarkEnd w:id="2"/>
       <w:r>
         <w:t>Prólogo</w:t>
@@ -3282,7 +3282,7 @@
           <w:noProof/>
         </w:rPr>
         <w:drawing>
-          <wp:anchor distT="0" distB="0" distL="114300" distR="114300" simplePos="0" relativeHeight="251654144" behindDoc="0" locked="0" layoutInCell="1" allowOverlap="1" wp14:anchorId="50D4895B" wp14:editId="7EFB4F3E">
+          <wp:anchor distT="0" distB="0" distL="114300" distR="114300" simplePos="0" relativeHeight="251652096" behindDoc="0" locked="0" layoutInCell="1" allowOverlap="1" wp14:anchorId="50D4895B" wp14:editId="7EFB4F3E">
             <wp:simplePos x="0" y="0"/>
             <wp:positionH relativeFrom="column">
               <wp:posOffset>3154680</wp:posOffset>
@@ -3669,7 +3669,7 @@
         </w:numPr>
       </w:pPr>
       <w:bookmarkStart w:id="4" w:name="_bookmark2"/>
-      <w:bookmarkStart w:id="5" w:name="_Toc236321495"/>
+      <w:bookmarkStart w:id="5" w:name="_Toc236740692"/>
       <w:bookmarkEnd w:id="4"/>
       <w:r>
         <w:lastRenderedPageBreak/>
@@ -4483,7 +4483,7 @@
           </mc:Choice>
           <mc:Fallback>
             <w:pict>
-              <v:group w14:anchorId="16F2FA17" id="Group 15" o:spid="_x0000_s1026" style="width:442.05pt;height:1.6pt;mso-position-horizontal-relative:char;mso-position-vertical-relative:line" coordsize="56140,203" o:gfxdata="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">
+              <v:group w14:anchorId="37CC6613" id="Group 15" o:spid="_x0000_s1026" style="width:442.05pt;height:1.6pt;mso-position-horizontal-relative:char;mso-position-vertical-relative:line" coordsize="56140,203" o:gfxdata="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">
                 <v:shape id="Graphic 16" o:spid="_x0000_s1027" style="position:absolute;width:56127;height:196;visibility:visible;mso-wrap-style:square;v-text-anchor:top" coordsize="5612765,19685" o:gfxdata="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" path="m5612765,l,,,19685r5612765,l5612765,xe" fillcolor="#9f9f9f" stroked="f">
                   <v:path arrowok="t"/>
                 </v:shape>
@@ -4528,7 +4528,7 @@
         </w:numPr>
         <w:jc w:val="left"/>
       </w:pPr>
-      <w:bookmarkStart w:id="7" w:name="_Toc236321496"/>
+      <w:bookmarkStart w:id="7" w:name="_Toc236740693"/>
       <w:r>
         <w:rPr>
           <w:w w:val="90"/>
@@ -5371,7 +5371,7 @@
         <mc:AlternateContent>
           <mc:Choice Requires="wps">
             <w:drawing>
-              <wp:anchor distT="0" distB="0" distL="114300" distR="114300" simplePos="0" relativeHeight="251652096" behindDoc="0" locked="0" layoutInCell="1" allowOverlap="1" wp14:anchorId="1C4D31BE" wp14:editId="21273C28">
+              <wp:anchor distT="0" distB="0" distL="114300" distR="114300" simplePos="0" relativeHeight="251648000" behindDoc="0" locked="0" layoutInCell="1" allowOverlap="1" wp14:anchorId="1C4D31BE" wp14:editId="21273C28">
                 <wp:simplePos x="0" y="0"/>
                 <wp:positionH relativeFrom="margin">
                   <wp:posOffset>400050</wp:posOffset>
@@ -5533,7 +5533,7 @@
           </mc:Choice>
           <mc:Fallback>
             <w:pict>
-              <v:rect w14:anchorId="1C4D31BE" id="Rectángulo 2" o:spid="_x0000_s1026" style="position:absolute;left:0;text-align:left;margin-left:31.5pt;margin-top:6pt;width:434.25pt;height:33pt;z-index:251652096;visibility:visible;mso-wrap-style:square;mso-width-percent:0;mso-height-percent:0;mso-wrap-distance-left:9pt;mso-wrap-distance-top:0;mso-wrap-distance-right:9pt;mso-wrap-distance-bottom:0;mso-position-horizontal:absolute;mso-position-horizontal-relative:margin;mso-position-vertical:absolute;mso-position-vertical-relative:text;mso-width-percent:0;mso-height-percent:0;mso-width-relative:margin;mso-height-relative:margin;v-text-anchor:middle" o:gfxdata="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" fillcolor="black [3213]" strokecolor="black [3213]" strokeweight="2pt">
+              <v:rect w14:anchorId="1C4D31BE" id="Rectángulo 2" o:spid="_x0000_s1026" style="position:absolute;left:0;text-align:left;margin-left:31.5pt;margin-top:6pt;width:434.25pt;height:33pt;z-index:251648000;visibility:visible;mso-wrap-style:square;mso-width-percent:0;mso-height-percent:0;mso-wrap-distance-left:9pt;mso-wrap-distance-top:0;mso-wrap-distance-right:9pt;mso-wrap-distance-bottom:0;mso-position-horizontal:absolute;mso-position-horizontal-relative:margin;mso-position-vertical:absolute;mso-position-vertical-relative:text;mso-width-percent:0;mso-height-percent:0;mso-width-relative:margin;mso-height-relative:margin;v-text-anchor:middle" o:gfxdata="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" fillcolor="black [3213]" strokecolor="black [3213]" strokeweight="2pt">
                 <v:textbox>
                   <w:txbxContent>
                     <w:p>
@@ -5675,7 +5675,7 @@
         <w:jc w:val="left"/>
       </w:pPr>
       <w:bookmarkStart w:id="8" w:name="_bookmark4"/>
-      <w:bookmarkStart w:id="9" w:name="_Toc236321497"/>
+      <w:bookmarkStart w:id="9" w:name="_Toc236740694"/>
       <w:bookmarkEnd w:id="8"/>
       <w:r>
         <w:rPr>
@@ -6549,7 +6549,7 @@
         <mc:AlternateContent>
           <mc:Choice Requires="wps">
             <w:drawing>
-              <wp:anchor distT="0" distB="0" distL="114300" distR="114300" simplePos="0" relativeHeight="251653120" behindDoc="0" locked="0" layoutInCell="1" allowOverlap="1" wp14:anchorId="6EEA5942" wp14:editId="793B9CCD">
+              <wp:anchor distT="0" distB="0" distL="114300" distR="114300" simplePos="0" relativeHeight="251650048" behindDoc="0" locked="0" layoutInCell="1" allowOverlap="1" wp14:anchorId="6EEA5942" wp14:editId="793B9CCD">
                 <wp:simplePos x="0" y="0"/>
                 <wp:positionH relativeFrom="margin">
                   <wp:posOffset>402771</wp:posOffset>
@@ -6665,7 +6665,7 @@
           </mc:Choice>
           <mc:Fallback>
             <w:pict>
-              <v:rect w14:anchorId="6EEA5942" id="_x0000_s1027" style="position:absolute;left:0;text-align:left;margin-left:31.7pt;margin-top:5.7pt;width:434.5pt;height:23.15pt;z-index:251653120;visibility:visible;mso-wrap-style:square;mso-width-percent:0;mso-height-percent:0;mso-wrap-distance-left:9pt;mso-wrap-distance-top:0;mso-wrap-distance-right:9pt;mso-wrap-distance-bottom:0;mso-position-horizontal:absolute;mso-position-horizontal-relative:margin;mso-position-vertical:absolute;mso-position-vertical-relative:text;mso-width-percent:0;mso-height-percent:0;mso-width-relative:margin;mso-height-relative:margin;v-text-anchor:middle" o:gfxdata="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" fillcolor="black [3213]" strokecolor="black [3213]" strokeweight="2pt">
+              <v:rect w14:anchorId="6EEA5942" id="_x0000_s1027" style="position:absolute;left:0;text-align:left;margin-left:31.7pt;margin-top:5.7pt;width:434.5pt;height:23.15pt;z-index:251650048;visibility:visible;mso-wrap-style:square;mso-width-percent:0;mso-height-percent:0;mso-wrap-distance-left:9pt;mso-wrap-distance-top:0;mso-wrap-distance-right:9pt;mso-wrap-distance-bottom:0;mso-position-horizontal:absolute;mso-position-horizontal-relative:margin;mso-position-vertical:absolute;mso-position-vertical-relative:text;mso-width-percent:0;mso-height-percent:0;mso-width-relative:margin;mso-height-relative:margin;v-text-anchor:middle" o:gfxdata="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" fillcolor="black [3213]" strokecolor="black [3213]" strokeweight="2pt">
                 <v:textbox>
                   <w:txbxContent>
                     <w:p>
@@ -6761,7 +6761,7 @@
         <w:jc w:val="left"/>
       </w:pPr>
       <w:bookmarkStart w:id="10" w:name="_bookmark5"/>
-      <w:bookmarkStart w:id="11" w:name="_Toc236321498"/>
+      <w:bookmarkStart w:id="11" w:name="_Toc236740695"/>
       <w:bookmarkEnd w:id="10"/>
       <w:r>
         <w:rPr>
@@ -7940,7 +7940,7 @@
         <mc:AlternateContent>
           <mc:Choice Requires="wps">
             <w:drawing>
-              <wp:anchor distT="0" distB="0" distL="114300" distR="114300" simplePos="0" relativeHeight="251656192" behindDoc="0" locked="0" layoutInCell="1" allowOverlap="1" wp14:anchorId="58BA83F3" wp14:editId="38FBACBB">
+              <wp:anchor distT="0" distB="0" distL="114300" distR="114300" simplePos="0" relativeHeight="251655168" behindDoc="0" locked="0" layoutInCell="1" allowOverlap="1" wp14:anchorId="58BA83F3" wp14:editId="38FBACBB">
                 <wp:simplePos x="0" y="0"/>
                 <wp:positionH relativeFrom="margin">
                   <wp:posOffset>390525</wp:posOffset>
@@ -8108,7 +8108,7 @@
           </mc:Choice>
           <mc:Fallback>
             <w:pict>
-              <v:rect w14:anchorId="58BA83F3" id="_x0000_s1028" style="position:absolute;left:0;text-align:left;margin-left:30.75pt;margin-top:6.3pt;width:434.5pt;height:58.5pt;z-index:251656192;visibility:visible;mso-wrap-style:square;mso-width-percent:0;mso-height-percent:0;mso-wrap-distance-left:9pt;mso-wrap-distance-top:0;mso-wrap-distance-right:9pt;mso-wrap-distance-bottom:0;mso-position-horizontal:absolute;mso-position-horizontal-relative:margin;mso-position-vertical:absolute;mso-position-vertical-relative:text;mso-width-percent:0;mso-height-percent:0;mso-width-relative:margin;mso-height-relative:margin;v-text-anchor:middle" o:gfxdata="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" fillcolor="black [3213]" strokecolor="black [3213]" strokeweight="2pt">
+              <v:rect w14:anchorId="58BA83F3" id="_x0000_s1028" style="position:absolute;left:0;text-align:left;margin-left:30.75pt;margin-top:6.3pt;width:434.5pt;height:58.5pt;z-index:251655168;visibility:visible;mso-wrap-style:square;mso-width-percent:0;mso-height-percent:0;mso-wrap-distance-left:9pt;mso-wrap-distance-top:0;mso-wrap-distance-right:9pt;mso-wrap-distance-bottom:0;mso-position-horizontal:absolute;mso-position-horizontal-relative:margin;mso-position-vertical:absolute;mso-position-vertical-relative:text;mso-width-percent:0;mso-height-percent:0;mso-width-relative:margin;mso-height-relative:margin;v-text-anchor:middle" o:gfxdata="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" fillcolor="black [3213]" strokecolor="black [3213]" strokeweight="2pt">
                 <v:textbox>
                   <w:txbxContent>
                     <w:p>
@@ -8256,7 +8256,7 @@
         <w:jc w:val="left"/>
       </w:pPr>
       <w:bookmarkStart w:id="12" w:name="_bookmark6"/>
-      <w:bookmarkStart w:id="13" w:name="_Toc236321499"/>
+      <w:bookmarkStart w:id="13" w:name="_Toc236740696"/>
       <w:bookmarkEnd w:id="12"/>
       <w:r>
         <w:rPr>
@@ -9094,7 +9094,7 @@
         <mc:AlternateContent>
           <mc:Choice Requires="wps">
             <w:drawing>
-              <wp:anchor distT="0" distB="0" distL="114300" distR="114300" simplePos="0" relativeHeight="251658240" behindDoc="0" locked="0" layoutInCell="1" allowOverlap="1" wp14:anchorId="3E5A6502" wp14:editId="0D5C0AC1">
+              <wp:anchor distT="0" distB="0" distL="114300" distR="114300" simplePos="0" relativeHeight="251657216" behindDoc="0" locked="0" layoutInCell="1" allowOverlap="1" wp14:anchorId="3E5A6502" wp14:editId="0D5C0AC1">
                 <wp:simplePos x="0" y="0"/>
                 <wp:positionH relativeFrom="margin">
                   <wp:posOffset>391886</wp:posOffset>
@@ -9218,7 +9218,7 @@
           </mc:Choice>
           <mc:Fallback>
             <w:pict>
-              <v:rect w14:anchorId="3E5A6502" id="_x0000_s1029" style="position:absolute;left:0;text-align:left;margin-left:30.85pt;margin-top:6.15pt;width:434.5pt;height:39pt;z-index:251658240;visibility:visible;mso-wrap-style:square;mso-width-percent:0;mso-height-percent:0;mso-wrap-distance-left:9pt;mso-wrap-distance-top:0;mso-wrap-distance-right:9pt;mso-wrap-distance-bottom:0;mso-position-horizontal:absolute;mso-position-horizontal-relative:margin;mso-position-vertical:absolute;mso-position-vertical-relative:text;mso-width-percent:0;mso-height-percent:0;mso-width-relative:margin;mso-height-relative:margin;v-text-anchor:middle" o:gfxdata="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" fillcolor="black [3213]" strokecolor="black [3213]" strokeweight="2pt">
+              <v:rect w14:anchorId="3E5A6502" id="_x0000_s1029" style="position:absolute;left:0;text-align:left;margin-left:30.85pt;margin-top:6.15pt;width:434.5pt;height:39pt;z-index:251657216;visibility:visible;mso-wrap-style:square;mso-width-percent:0;mso-height-percent:0;mso-wrap-distance-left:9pt;mso-wrap-distance-top:0;mso-wrap-distance-right:9pt;mso-wrap-distance-bottom:0;mso-position-horizontal:absolute;mso-position-horizontal-relative:margin;mso-position-vertical:absolute;mso-position-vertical-relative:text;mso-width-percent:0;mso-height-percent:0;mso-width-relative:margin;mso-height-relative:margin;v-text-anchor:middle" o:gfxdata="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" fillcolor="black [3213]" strokecolor="black [3213]" strokeweight="2pt">
                 <v:textbox>
                   <w:txbxContent>
                     <w:p>
@@ -9320,7 +9320,7 @@
         <w:jc w:val="left"/>
       </w:pPr>
       <w:bookmarkStart w:id="14" w:name="_bookmark7"/>
-      <w:bookmarkStart w:id="15" w:name="_Toc236321500"/>
+      <w:bookmarkStart w:id="15" w:name="_Toc236740697"/>
       <w:bookmarkEnd w:id="14"/>
       <w:r>
         <w:rPr>
@@ -10218,7 +10218,7 @@
         <mc:AlternateContent>
           <mc:Choice Requires="wps">
             <w:drawing>
-              <wp:anchor distT="0" distB="0" distL="114300" distR="114300" simplePos="0" relativeHeight="251651072" behindDoc="0" locked="0" layoutInCell="1" allowOverlap="1" wp14:anchorId="07DEF22C" wp14:editId="0CB7864E">
+              <wp:anchor distT="0" distB="0" distL="114300" distR="114300" simplePos="0" relativeHeight="251645952" behindDoc="0" locked="0" layoutInCell="1" allowOverlap="1" wp14:anchorId="07DEF22C" wp14:editId="0CB7864E">
                 <wp:simplePos x="0" y="0"/>
                 <wp:positionH relativeFrom="margin">
                   <wp:posOffset>340743</wp:posOffset>
@@ -10378,7 +10378,7 @@
           </mc:Choice>
           <mc:Fallback>
             <w:pict>
-              <v:rect w14:anchorId="07DEF22C" id="_x0000_s1030" style="position:absolute;margin-left:26.85pt;margin-top:.75pt;width:441.4pt;height:84.25pt;z-index:251651072;visibility:visible;mso-wrap-style:square;mso-width-percent:0;mso-height-percent:0;mso-wrap-distance-left:9pt;mso-wrap-distance-top:0;mso-wrap-distance-right:9pt;mso-wrap-distance-bottom:0;mso-position-horizontal:absolute;mso-position-horizontal-relative:margin;mso-position-vertical:absolute;mso-position-vertical-relative:text;mso-width-percent:0;mso-height-percent:0;mso-width-relative:margin;mso-height-relative:margin;v-text-anchor:middle" o:gfxdata="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" fillcolor="black [3213]" strokecolor="black [3213]" strokeweight="2pt">
+              <v:rect w14:anchorId="07DEF22C" id="_x0000_s1030" style="position:absolute;margin-left:26.85pt;margin-top:.75pt;width:441.4pt;height:84.25pt;z-index:251645952;visibility:visible;mso-wrap-style:square;mso-width-percent:0;mso-height-percent:0;mso-wrap-distance-left:9pt;mso-wrap-distance-top:0;mso-wrap-distance-right:9pt;mso-wrap-distance-bottom:0;mso-position-horizontal:absolute;mso-position-horizontal-relative:margin;mso-position-vertical:absolute;mso-position-vertical-relative:text;mso-width-percent:0;mso-height-percent:0;mso-width-relative:margin;mso-height-relative:margin;v-text-anchor:middle" o:gfxdata="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" fillcolor="black [3213]" strokecolor="black [3213]" strokeweight="2pt">
                 <v:textbox>
                   <w:txbxContent>
                     <w:p>
@@ -10507,7 +10507,7 @@
         <w:jc w:val="left"/>
       </w:pPr>
       <w:bookmarkStart w:id="16" w:name="_bookmark8"/>
-      <w:bookmarkStart w:id="17" w:name="_Toc236321501"/>
+      <w:bookmarkStart w:id="17" w:name="_Toc236740698"/>
       <w:bookmarkEnd w:id="16"/>
       <w:r>
         <w:rPr>
@@ -11446,7 +11446,7 @@
         <mc:AlternateContent>
           <mc:Choice Requires="wps">
             <w:drawing>
-              <wp:anchor distT="0" distB="0" distL="114300" distR="114300" simplePos="0" relativeHeight="251663360" behindDoc="0" locked="0" layoutInCell="1" allowOverlap="1" wp14:anchorId="6925DDC6" wp14:editId="235421CE">
+              <wp:anchor distT="0" distB="0" distL="114300" distR="114300" simplePos="0" relativeHeight="251668480" behindDoc="0" locked="0" layoutInCell="1" allowOverlap="1" wp14:anchorId="6925DDC6" wp14:editId="235421CE">
                 <wp:simplePos x="0" y="0"/>
                 <wp:positionH relativeFrom="margin">
                   <wp:posOffset>4313</wp:posOffset>
@@ -11534,7 +11534,7 @@
           </mc:Choice>
           <mc:Fallback>
             <w:pict>
-              <v:rect w14:anchorId="6925DDC6" id="_x0000_s1031" style="position:absolute;margin-left:.35pt;margin-top:9.75pt;width:499.9pt;height:35.3pt;z-index:251663360;visibility:visible;mso-wrap-style:square;mso-width-percent:0;mso-height-percent:0;mso-wrap-distance-left:9pt;mso-wrap-distance-top:0;mso-wrap-distance-right:9pt;mso-wrap-distance-bottom:0;mso-position-horizontal:absolute;mso-position-horizontal-relative:margin;mso-position-vertical:absolute;mso-position-vertical-relative:text;mso-width-percent:0;mso-height-percent:0;mso-width-relative:margin;mso-height-relative:margin;v-text-anchor:middle" o:gfxdata="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" fillcolor="black [3213]" strokecolor="black [3213]" strokeweight="2pt">
+              <v:rect w14:anchorId="6925DDC6" id="_x0000_s1031" style="position:absolute;margin-left:.35pt;margin-top:9.75pt;width:499.9pt;height:35.3pt;z-index:251668480;visibility:visible;mso-wrap-style:square;mso-width-percent:0;mso-height-percent:0;mso-wrap-distance-left:9pt;mso-wrap-distance-top:0;mso-wrap-distance-right:9pt;mso-wrap-distance-bottom:0;mso-position-horizontal:absolute;mso-position-horizontal-relative:margin;mso-position-vertical:absolute;mso-position-vertical-relative:text;mso-width-percent:0;mso-height-percent:0;mso-width-relative:margin;mso-height-relative:margin;v-text-anchor:middle" o:gfxdata="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" fillcolor="black [3213]" strokecolor="black [3213]" strokeweight="2pt">
                 <v:textbox>
                   <w:txbxContent>
                     <w:p>
@@ -11658,7 +11658,7 @@
         <w:lastRenderedPageBreak/>
         <w:tab/>
       </w:r>
-      <w:bookmarkStart w:id="18" w:name="_Toc236321502"/>
+      <w:bookmarkStart w:id="18" w:name="_Toc236740699"/>
       <w:r>
         <w:rPr>
           <w:w w:val="90"/>
@@ -12548,7 +12548,7 @@
         <mc:AlternateContent>
           <mc:Choice Requires="wps">
             <w:drawing>
-              <wp:anchor distT="0" distB="0" distL="114300" distR="114300" simplePos="0" relativeHeight="251664384" behindDoc="0" locked="0" layoutInCell="1" allowOverlap="1" wp14:anchorId="63253069" wp14:editId="20B257E7">
+              <wp:anchor distT="0" distB="0" distL="114300" distR="114300" simplePos="0" relativeHeight="251670528" behindDoc="0" locked="0" layoutInCell="1" allowOverlap="1" wp14:anchorId="63253069" wp14:editId="20B257E7">
                 <wp:simplePos x="0" y="0"/>
                 <wp:positionH relativeFrom="margin">
                   <wp:posOffset>337457</wp:posOffset>
@@ -12668,7 +12668,7 @@
           </mc:Choice>
           <mc:Fallback>
             <w:pict>
-              <v:rect w14:anchorId="63253069" id="_x0000_s1032" style="position:absolute;margin-left:26.55pt;margin-top:.65pt;width:441.4pt;height:43.7pt;z-index:251664384;visibility:visible;mso-wrap-style:square;mso-width-percent:0;mso-height-percent:0;mso-wrap-distance-left:9pt;mso-wrap-distance-top:0;mso-wrap-distance-right:9pt;mso-wrap-distance-bottom:0;mso-position-horizontal:absolute;mso-position-horizontal-relative:margin;mso-position-vertical:absolute;mso-position-vertical-relative:text;mso-width-percent:0;mso-height-percent:0;mso-width-relative:margin;mso-height-relative:margin;v-text-anchor:middle" o:gfxdata="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" fillcolor="black [3213]" strokecolor="black [3213]" strokeweight="2pt">
+              <v:rect w14:anchorId="63253069" id="_x0000_s1032" style="position:absolute;margin-left:26.55pt;margin-top:.65pt;width:441.4pt;height:43.7pt;z-index:251670528;visibility:visible;mso-wrap-style:square;mso-width-percent:0;mso-height-percent:0;mso-wrap-distance-left:9pt;mso-wrap-distance-top:0;mso-wrap-distance-right:9pt;mso-wrap-distance-bottom:0;mso-position-horizontal:absolute;mso-position-horizontal-relative:margin;mso-position-vertical:absolute;mso-position-vertical-relative:text;mso-width-percent:0;mso-height-percent:0;mso-width-relative:margin;mso-height-relative:margin;v-text-anchor:middle" o:gfxdata="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" fillcolor="black [3213]" strokecolor="black [3213]" strokeweight="2pt">
                 <v:textbox>
                   <w:txbxContent>
                     <w:p>
@@ -12792,7 +12792,7 @@
         <w:lastRenderedPageBreak/>
         <w:tab/>
       </w:r>
-      <w:bookmarkStart w:id="19" w:name="_Toc236321503"/>
+      <w:bookmarkStart w:id="19" w:name="_Toc236740700"/>
       <w:r>
         <w:rPr>
           <w:w w:val="90"/>
@@ -14124,7 +14124,7 @@
         <mc:AlternateContent>
           <mc:Choice Requires="wps">
             <w:drawing>
-              <wp:anchor distT="0" distB="0" distL="114300" distR="114300" simplePos="0" relativeHeight="251655168" behindDoc="0" locked="0" layoutInCell="1" allowOverlap="1" wp14:anchorId="326B5D78" wp14:editId="6877A15F">
+              <wp:anchor distT="0" distB="0" distL="114300" distR="114300" simplePos="0" relativeHeight="251654144" behindDoc="0" locked="0" layoutInCell="1" allowOverlap="1" wp14:anchorId="326B5D78" wp14:editId="6877A15F">
                 <wp:simplePos x="0" y="0"/>
                 <wp:positionH relativeFrom="margin">
                   <wp:posOffset>332117</wp:posOffset>
@@ -14262,7 +14262,7 @@
           </mc:Choice>
           <mc:Fallback>
             <w:pict>
-              <v:rect w14:anchorId="326B5D78" id="_x0000_s1033" style="position:absolute;margin-left:26.15pt;margin-top:.9pt;width:441.4pt;height:67.25pt;z-index:251655168;visibility:visible;mso-wrap-style:square;mso-width-percent:0;mso-height-percent:0;mso-wrap-distance-left:9pt;mso-wrap-distance-top:0;mso-wrap-distance-right:9pt;mso-wrap-distance-bottom:0;mso-position-horizontal:absolute;mso-position-horizontal-relative:margin;mso-position-vertical:absolute;mso-position-vertical-relative:text;mso-width-percent:0;mso-height-percent:0;mso-width-relative:margin;mso-height-relative:margin;v-text-anchor:middle" o:gfxdata="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" fillcolor="black [3213]" strokecolor="black [3213]" strokeweight="2pt">
+              <v:rect w14:anchorId="326B5D78" id="_x0000_s1033" style="position:absolute;margin-left:26.15pt;margin-top:.9pt;width:441.4pt;height:67.25pt;z-index:251654144;visibility:visible;mso-wrap-style:square;mso-width-percent:0;mso-height-percent:0;mso-wrap-distance-left:9pt;mso-wrap-distance-top:0;mso-wrap-distance-right:9pt;mso-wrap-distance-bottom:0;mso-position-horizontal:absolute;mso-position-horizontal-relative:margin;mso-position-vertical:absolute;mso-position-vertical-relative:text;mso-width-percent:0;mso-height-percent:0;mso-width-relative:margin;mso-height-relative:margin;v-text-anchor:middle" o:gfxdata="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" fillcolor="black [3213]" strokecolor="black [3213]" strokeweight="2pt">
                 <v:textbox>
                   <w:txbxContent>
                     <w:p>
@@ -14383,7 +14383,7 @@
       </w:pPr>
       <w:bookmarkStart w:id="20" w:name="_bookmark9"/>
       <w:bookmarkStart w:id="21" w:name="_Toc234568067"/>
-      <w:bookmarkStart w:id="22" w:name="_Toc236321504"/>
+      <w:bookmarkStart w:id="22" w:name="_Toc236740701"/>
       <w:bookmarkEnd w:id="20"/>
       <w:r>
         <w:lastRenderedPageBreak/>
@@ -14561,6 +14561,10 @@
       <w:proofErr w:type="spellStart"/>
       <w:r>
         <w:rPr>
+          <w:b/>
+          <w:bCs/>
+          <w:i/>
+          <w:iCs/>
           <w:lang w:val="es-ES"/>
         </w:rPr>
         <w:t>endpoint</w:t>
@@ -14568,6 +14572,10 @@
       <w:proofErr w:type="spellEnd"/>
       <w:r>
         <w:rPr>
+          <w:b/>
+          <w:bCs/>
+          <w:i/>
+          <w:iCs/>
           <w:lang w:val="es-ES"/>
         </w:rPr>
         <w:t xml:space="preserve"> que guarda un registro de "avistamiento del </w:t>
@@ -14575,6 +14583,10 @@
       <w:proofErr w:type="spellStart"/>
       <w:r>
         <w:rPr>
+          <w:b/>
+          <w:bCs/>
+          <w:i/>
+          <w:iCs/>
           <w:lang w:val="es-ES"/>
         </w:rPr>
         <w:t>Bifröst</w:t>
@@ -14582,9 +14594,19 @@
       <w:proofErr w:type="spellEnd"/>
       <w:r>
         <w:rPr>
-          <w:lang w:val="es-ES"/>
-        </w:rPr>
-        <w:t>" y lo devuelve en formato JSON, aunque internamente lo guarde también en binario para comparar.</w:t>
+          <w:b/>
+          <w:bCs/>
+          <w:i/>
+          <w:iCs/>
+          <w:lang w:val="es-ES"/>
+        </w:rPr>
+        <w:t>"</w:t>
+      </w:r>
+      <w:r>
+        <w:rPr>
+          <w:lang w:val="es-ES"/>
+        </w:rPr>
+        <w:t xml:space="preserve"> y lo devuelve en formato JSON, aunque internamente lo guarde también en binario para comparar.</w:t>
       </w:r>
     </w:p>
     <w:p>
@@ -14686,16 +14708,16 @@
         <mc:AlternateContent>
           <mc:Choice Requires="wps">
             <w:drawing>
-              <wp:anchor distT="0" distB="0" distL="114300" distR="114300" simplePos="0" relativeHeight="251661312" behindDoc="0" locked="0" layoutInCell="1" allowOverlap="1" wp14:anchorId="0E8D1A1D" wp14:editId="4BE5DB3E">
+              <wp:anchor distT="0" distB="0" distL="114300" distR="114300" simplePos="0" relativeHeight="251664384" behindDoc="0" locked="0" layoutInCell="1" allowOverlap="1" wp14:anchorId="0E8D1A1D" wp14:editId="40DA8A4B">
                 <wp:simplePos x="0" y="0"/>
                 <wp:positionH relativeFrom="margin">
-                  <wp:posOffset>523875</wp:posOffset>
+                  <wp:posOffset>448574</wp:posOffset>
                 </wp:positionH>
                 <wp:positionV relativeFrom="paragraph">
-                  <wp:posOffset>187324</wp:posOffset>
+                  <wp:posOffset>184785</wp:posOffset>
                 </wp:positionV>
-                <wp:extent cx="6417310" cy="3114675"/>
-                <wp:effectExtent l="0" t="0" r="21590" b="28575"/>
+                <wp:extent cx="6178442" cy="2225615"/>
+                <wp:effectExtent l="0" t="0" r="13335" b="22860"/>
                 <wp:wrapNone/>
                 <wp:docPr id="2081936232" name="Rectángulo 2"/>
                 <wp:cNvGraphicFramePr/>
@@ -14706,7 +14728,7 @@
                       <wps:spPr>
                         <a:xfrm>
                           <a:off x="0" y="0"/>
-                          <a:ext cx="6417310" cy="3114675"/>
+                          <a:ext cx="6178442" cy="2225615"/>
                         </a:xfrm>
                         <a:prstGeom prst="rect">
                           <a:avLst/>
@@ -14743,11 +14765,15 @@
                               <w:pStyle w:val="Sinespaciado"/>
                               <w:rPr>
                                 <w:rFonts w:ascii="Cascadia Mono SemiBold" w:hAnsi="Cascadia Mono SemiBold" w:cs="Cascadia Mono SemiBold"/>
+                                <w:sz w:val="18"/>
+                                <w:szCs w:val="18"/>
                               </w:rPr>
                             </w:pPr>
                             <w:r>
                               <w:rPr>
                                 <w:rFonts w:ascii="Cascadia Mono SemiBold" w:hAnsi="Cascadia Mono SemiBold" w:cs="Cascadia Mono SemiBold"/>
+                                <w:sz w:val="18"/>
+                                <w:szCs w:val="18"/>
                               </w:rPr>
                               <w:t xml:space="preserve">import </w:t>
                             </w:r>
@@ -14756,6 +14782,8 @@
                             <w:r>
                               <w:rPr>
                                 <w:rFonts w:ascii="Cascadia Mono SemiBold" w:hAnsi="Cascadia Mono SemiBold" w:cs="Cascadia Mono SemiBold"/>
+                                <w:sz w:val="18"/>
+                                <w:szCs w:val="18"/>
                               </w:rPr>
                               <w:t>java.io.Serializable</w:t>
                             </w:r>
@@ -14764,6 +14792,8 @@
                             <w:r>
                               <w:rPr>
                                 <w:rFonts w:ascii="Cascadia Mono SemiBold" w:hAnsi="Cascadia Mono SemiBold" w:cs="Cascadia Mono SemiBold"/>
+                                <w:sz w:val="18"/>
+                                <w:szCs w:val="18"/>
                               </w:rPr>
                               <w:t>;</w:t>
                             </w:r>
@@ -14773,6 +14803,8 @@
                               <w:pStyle w:val="Sinespaciado"/>
                               <w:rPr>
                                 <w:rFonts w:ascii="Cascadia Mono SemiBold" w:hAnsi="Cascadia Mono SemiBold" w:cs="Cascadia Mono SemiBold"/>
+                                <w:sz w:val="18"/>
+                                <w:szCs w:val="18"/>
                               </w:rPr>
                             </w:pPr>
                           </w:p>
@@ -14781,18 +14813,42 @@
                               <w:pStyle w:val="Sinespaciado"/>
                               <w:rPr>
                                 <w:rFonts w:ascii="Cascadia Mono SemiBold" w:hAnsi="Cascadia Mono SemiBold" w:cs="Cascadia Mono SemiBold"/>
+                                <w:sz w:val="18"/>
+                                <w:szCs w:val="18"/>
                               </w:rPr>
                             </w:pPr>
+                            <w:proofErr w:type="spellStart"/>
                             <w:r>
                               <w:rPr>
                                 <w:rFonts w:ascii="Cascadia Mono SemiBold" w:hAnsi="Cascadia Mono SemiBold" w:cs="Cascadia Mono SemiBold"/>
+                                <w:sz w:val="18"/>
+                                <w:szCs w:val="18"/>
                               </w:rPr>
-                              <w:t xml:space="preserve">class </w:t>
+                              <w:t>sta</w:t>
+                            </w:r>
+                            <w:r>
+                              <w:rPr>
+                                <w:rFonts w:ascii="Cascadia Mono SemiBold" w:hAnsi="Cascadia Mono SemiBold" w:cs="Cascadia Mono SemiBold"/>
+                                <w:sz w:val="18"/>
+                                <w:szCs w:val="18"/>
+                              </w:rPr>
+                              <w:t>class</w:t>
+                            </w:r>
+                            <w:proofErr w:type="spellEnd"/>
+                            <w:r>
+                              <w:rPr>
+                                <w:rFonts w:ascii="Cascadia Mono SemiBold" w:hAnsi="Cascadia Mono SemiBold" w:cs="Cascadia Mono SemiBold"/>
+                                <w:sz w:val="18"/>
+                                <w:szCs w:val="18"/>
+                              </w:rPr>
+                              <w:t xml:space="preserve"> </w:t>
                             </w:r>
                             <w:proofErr w:type="spellStart"/>
                             <w:r>
                               <w:rPr>
                                 <w:rFonts w:ascii="Cascadia Mono SemiBold" w:hAnsi="Cascadia Mono SemiBold" w:cs="Cascadia Mono SemiBold"/>
+                                <w:sz w:val="18"/>
+                                <w:szCs w:val="18"/>
                               </w:rPr>
                               <w:t>BifrostSighting</w:t>
                             </w:r>
@@ -14800,6 +14856,8 @@
                             <w:r>
                               <w:rPr>
                                 <w:rFonts w:ascii="Cascadia Mono SemiBold" w:hAnsi="Cascadia Mono SemiBold" w:cs="Cascadia Mono SemiBold"/>
+                                <w:sz w:val="18"/>
+                                <w:szCs w:val="18"/>
                               </w:rPr>
                               <w:t xml:space="preserve"> implements Serializable {</w:t>
                             </w:r>
@@ -14809,11 +14867,15 @@
                               <w:pStyle w:val="Sinespaciado"/>
                               <w:rPr>
                                 <w:rFonts w:ascii="Cascadia Mono SemiBold" w:hAnsi="Cascadia Mono SemiBold" w:cs="Cascadia Mono SemiBold"/>
+                                <w:sz w:val="18"/>
+                                <w:szCs w:val="18"/>
                               </w:rPr>
                             </w:pPr>
                             <w:r>
                               <w:rPr>
                                 <w:rFonts w:ascii="Cascadia Mono SemiBold" w:hAnsi="Cascadia Mono SemiBold" w:cs="Cascadia Mono SemiBold"/>
+                                <w:sz w:val="18"/>
+                                <w:szCs w:val="18"/>
                               </w:rPr>
                               <w:t xml:space="preserve">    private static final long </w:t>
                             </w:r>
@@ -14821,6 +14883,8 @@
                             <w:r>
                               <w:rPr>
                                 <w:rFonts w:ascii="Cascadia Mono SemiBold" w:hAnsi="Cascadia Mono SemiBold" w:cs="Cascadia Mono SemiBold"/>
+                                <w:sz w:val="18"/>
+                                <w:szCs w:val="18"/>
                               </w:rPr>
                               <w:t>serialVersionUID</w:t>
                             </w:r>
@@ -14828,6 +14892,8 @@
                             <w:r>
                               <w:rPr>
                                 <w:rFonts w:ascii="Cascadia Mono SemiBold" w:hAnsi="Cascadia Mono SemiBold" w:cs="Cascadia Mono SemiBold"/>
+                                <w:sz w:val="18"/>
+                                <w:szCs w:val="18"/>
                               </w:rPr>
                               <w:t xml:space="preserve"> = 1L;</w:t>
                             </w:r>
@@ -14837,11 +14903,15 @@
                               <w:pStyle w:val="Sinespaciado"/>
                               <w:rPr>
                                 <w:rFonts w:ascii="Cascadia Mono SemiBold" w:hAnsi="Cascadia Mono SemiBold" w:cs="Cascadia Mono SemiBold"/>
+                                <w:sz w:val="18"/>
+                                <w:szCs w:val="18"/>
                               </w:rPr>
                             </w:pPr>
                             <w:r>
                               <w:rPr>
                                 <w:rFonts w:ascii="Cascadia Mono SemiBold" w:hAnsi="Cascadia Mono SemiBold" w:cs="Cascadia Mono SemiBold"/>
+                                <w:sz w:val="18"/>
+                                <w:szCs w:val="18"/>
                               </w:rPr>
                               <w:t xml:space="preserve">    private String location;</w:t>
                             </w:r>
@@ -14851,11 +14921,15 @@
                               <w:pStyle w:val="Sinespaciado"/>
                               <w:rPr>
                                 <w:rFonts w:ascii="Cascadia Mono SemiBold" w:hAnsi="Cascadia Mono SemiBold" w:cs="Cascadia Mono SemiBold"/>
+                                <w:sz w:val="18"/>
+                                <w:szCs w:val="18"/>
                               </w:rPr>
                             </w:pPr>
                             <w:r>
                               <w:rPr>
                                 <w:rFonts w:ascii="Cascadia Mono SemiBold" w:hAnsi="Cascadia Mono SemiBold" w:cs="Cascadia Mono SemiBold"/>
+                                <w:sz w:val="18"/>
+                                <w:szCs w:val="18"/>
                               </w:rPr>
                               <w:t xml:space="preserve">    private int intensity;</w:t>
                             </w:r>
@@ -14865,6 +14939,8 @@
                               <w:pStyle w:val="Sinespaciado"/>
                               <w:rPr>
                                 <w:rFonts w:ascii="Cascadia Mono SemiBold" w:hAnsi="Cascadia Mono SemiBold" w:cs="Cascadia Mono SemiBold"/>
+                                <w:sz w:val="18"/>
+                                <w:szCs w:val="18"/>
                               </w:rPr>
                             </w:pPr>
                           </w:p>
@@ -14873,11 +14949,15 @@
                               <w:pStyle w:val="Sinespaciado"/>
                               <w:rPr>
                                 <w:rFonts w:ascii="Cascadia Mono SemiBold" w:hAnsi="Cascadia Mono SemiBold" w:cs="Cascadia Mono SemiBold"/>
+                                <w:sz w:val="18"/>
+                                <w:szCs w:val="18"/>
                               </w:rPr>
                             </w:pPr>
                             <w:r>
                               <w:rPr>
                                 <w:rFonts w:ascii="Cascadia Mono SemiBold" w:hAnsi="Cascadia Mono SemiBold" w:cs="Cascadia Mono SemiBold"/>
+                                <w:sz w:val="18"/>
+                                <w:szCs w:val="18"/>
                               </w:rPr>
                               <w:t xml:space="preserve">    public </w:t>
                             </w:r>
@@ -14886,6 +14966,8 @@
                             <w:r>
                               <w:rPr>
                                 <w:rFonts w:ascii="Cascadia Mono SemiBold" w:hAnsi="Cascadia Mono SemiBold" w:cs="Cascadia Mono SemiBold"/>
+                                <w:sz w:val="18"/>
+                                <w:szCs w:val="18"/>
                               </w:rPr>
                               <w:t>BifrostSighting</w:t>
                             </w:r>
@@ -14893,6 +14975,8 @@
                             <w:r>
                               <w:rPr>
                                 <w:rFonts w:ascii="Cascadia Mono SemiBold" w:hAnsi="Cascadia Mono SemiBold" w:cs="Cascadia Mono SemiBold"/>
+                                <w:sz w:val="18"/>
+                                <w:szCs w:val="18"/>
                               </w:rPr>
                               <w:t>(</w:t>
                             </w:r>
@@ -14900,6 +14984,8 @@
                             <w:r>
                               <w:rPr>
                                 <w:rFonts w:ascii="Cascadia Mono SemiBold" w:hAnsi="Cascadia Mono SemiBold" w:cs="Cascadia Mono SemiBold"/>
+                                <w:sz w:val="18"/>
+                                <w:szCs w:val="18"/>
                               </w:rPr>
                               <w:t>String location, int intensity) {</w:t>
                             </w:r>
@@ -14909,11 +14995,15 @@
                               <w:pStyle w:val="Sinespaciado"/>
                               <w:rPr>
                                 <w:rFonts w:ascii="Cascadia Mono SemiBold" w:hAnsi="Cascadia Mono SemiBold" w:cs="Cascadia Mono SemiBold"/>
+                                <w:sz w:val="18"/>
+                                <w:szCs w:val="18"/>
                               </w:rPr>
                             </w:pPr>
                             <w:r>
                               <w:rPr>
                                 <w:rFonts w:ascii="Cascadia Mono SemiBold" w:hAnsi="Cascadia Mono SemiBold" w:cs="Cascadia Mono SemiBold"/>
+                                <w:sz w:val="18"/>
+                                <w:szCs w:val="18"/>
                               </w:rPr>
                               <w:t xml:space="preserve">        </w:t>
                             </w:r>
@@ -14922,6 +15012,8 @@
                             <w:r>
                               <w:rPr>
                                 <w:rFonts w:ascii="Cascadia Mono SemiBold" w:hAnsi="Cascadia Mono SemiBold" w:cs="Cascadia Mono SemiBold"/>
+                                <w:sz w:val="18"/>
+                                <w:szCs w:val="18"/>
                               </w:rPr>
                               <w:t>this.location</w:t>
                             </w:r>
@@ -14930,6 +15022,8 @@
                             <w:r>
                               <w:rPr>
                                 <w:rFonts w:ascii="Cascadia Mono SemiBold" w:hAnsi="Cascadia Mono SemiBold" w:cs="Cascadia Mono SemiBold"/>
+                                <w:sz w:val="18"/>
+                                <w:szCs w:val="18"/>
                               </w:rPr>
                               <w:t xml:space="preserve"> = location;</w:t>
                             </w:r>
@@ -14939,11 +15033,15 @@
                               <w:pStyle w:val="Sinespaciado"/>
                               <w:rPr>
                                 <w:rFonts w:ascii="Cascadia Mono SemiBold" w:hAnsi="Cascadia Mono SemiBold" w:cs="Cascadia Mono SemiBold"/>
+                                <w:sz w:val="18"/>
+                                <w:szCs w:val="18"/>
                               </w:rPr>
                             </w:pPr>
                             <w:r>
                               <w:rPr>
                                 <w:rFonts w:ascii="Cascadia Mono SemiBold" w:hAnsi="Cascadia Mono SemiBold" w:cs="Cascadia Mono SemiBold"/>
+                                <w:sz w:val="18"/>
+                                <w:szCs w:val="18"/>
                               </w:rPr>
                               <w:t xml:space="preserve">        </w:t>
                             </w:r>
@@ -14952,6 +15050,8 @@
                             <w:r>
                               <w:rPr>
                                 <w:rFonts w:ascii="Cascadia Mono SemiBold" w:hAnsi="Cascadia Mono SemiBold" w:cs="Cascadia Mono SemiBold"/>
+                                <w:sz w:val="18"/>
+                                <w:szCs w:val="18"/>
                               </w:rPr>
                               <w:t>this.intensity</w:t>
                             </w:r>
@@ -14960,6 +15060,8 @@
                             <w:r>
                               <w:rPr>
                                 <w:rFonts w:ascii="Cascadia Mono SemiBold" w:hAnsi="Cascadia Mono SemiBold" w:cs="Cascadia Mono SemiBold"/>
+                                <w:sz w:val="18"/>
+                                <w:szCs w:val="18"/>
                               </w:rPr>
                               <w:t xml:space="preserve"> = intensity;</w:t>
                             </w:r>
@@ -14969,11 +15071,15 @@
                               <w:pStyle w:val="Sinespaciado"/>
                               <w:rPr>
                                 <w:rFonts w:ascii="Cascadia Mono SemiBold" w:hAnsi="Cascadia Mono SemiBold" w:cs="Cascadia Mono SemiBold"/>
+                                <w:sz w:val="18"/>
+                                <w:szCs w:val="18"/>
                               </w:rPr>
                             </w:pPr>
                             <w:r>
                               <w:rPr>
                                 <w:rFonts w:ascii="Cascadia Mono SemiBold" w:hAnsi="Cascadia Mono SemiBold" w:cs="Cascadia Mono SemiBold"/>
+                                <w:sz w:val="18"/>
+                                <w:szCs w:val="18"/>
                               </w:rPr>
                               <w:t xml:space="preserve">    }</w:t>
                             </w:r>
@@ -14983,6 +15089,8 @@
                               <w:pStyle w:val="Sinespaciado"/>
                               <w:rPr>
                                 <w:rFonts w:ascii="Cascadia Mono SemiBold" w:hAnsi="Cascadia Mono SemiBold" w:cs="Cascadia Mono SemiBold"/>
+                                <w:sz w:val="18"/>
+                                <w:szCs w:val="18"/>
                               </w:rPr>
                             </w:pPr>
                           </w:p>
@@ -14991,11 +15099,15 @@
                               <w:pStyle w:val="Sinespaciado"/>
                               <w:rPr>
                                 <w:rFonts w:ascii="Cascadia Mono SemiBold" w:hAnsi="Cascadia Mono SemiBold" w:cs="Cascadia Mono SemiBold"/>
+                                <w:sz w:val="18"/>
+                                <w:szCs w:val="18"/>
                               </w:rPr>
                             </w:pPr>
                             <w:r>
                               <w:rPr>
                                 <w:rFonts w:ascii="Cascadia Mono SemiBold" w:hAnsi="Cascadia Mono SemiBold" w:cs="Cascadia Mono SemiBold"/>
+                                <w:sz w:val="18"/>
+                                <w:szCs w:val="18"/>
                               </w:rPr>
                               <w:t xml:space="preserve">    public String </w:t>
                             </w:r>
@@ -15004,6 +15116,8 @@
                             <w:r>
                               <w:rPr>
                                 <w:rFonts w:ascii="Cascadia Mono SemiBold" w:hAnsi="Cascadia Mono SemiBold" w:cs="Cascadia Mono SemiBold"/>
+                                <w:sz w:val="18"/>
+                                <w:szCs w:val="18"/>
                               </w:rPr>
                               <w:t>toJson</w:t>
                             </w:r>
@@ -15011,6 +15125,8 @@
                             <w:r>
                               <w:rPr>
                                 <w:rFonts w:ascii="Cascadia Mono SemiBold" w:hAnsi="Cascadia Mono SemiBold" w:cs="Cascadia Mono SemiBold"/>
+                                <w:sz w:val="18"/>
+                                <w:szCs w:val="18"/>
                               </w:rPr>
                               <w:t>(</w:t>
                             </w:r>
@@ -15018,6 +15134,8 @@
                             <w:r>
                               <w:rPr>
                                 <w:rFonts w:ascii="Cascadia Mono SemiBold" w:hAnsi="Cascadia Mono SemiBold" w:cs="Cascadia Mono SemiBold"/>
+                                <w:sz w:val="18"/>
+                                <w:szCs w:val="18"/>
                               </w:rPr>
                               <w:t>) {</w:t>
                             </w:r>
@@ -15027,11 +15145,15 @@
                               <w:pStyle w:val="Sinespaciado"/>
                               <w:rPr>
                                 <w:rFonts w:ascii="Cascadia Mono SemiBold" w:hAnsi="Cascadia Mono SemiBold" w:cs="Cascadia Mono SemiBold"/>
+                                <w:sz w:val="18"/>
+                                <w:szCs w:val="18"/>
                               </w:rPr>
                             </w:pPr>
                             <w:r>
                               <w:rPr>
                                 <w:rFonts w:ascii="Cascadia Mono SemiBold" w:hAnsi="Cascadia Mono SemiBold" w:cs="Cascadia Mono SemiBold"/>
+                                <w:sz w:val="18"/>
+                                <w:szCs w:val="18"/>
                               </w:rPr>
                               <w:t xml:space="preserve">        return "{\"location\": \"" + location + "\", \"intensity\": " + intensity + "}";</w:t>
                             </w:r>
@@ -15041,11 +15163,15 @@
                               <w:pStyle w:val="Sinespaciado"/>
                               <w:rPr>
                                 <w:rFonts w:ascii="Cascadia Mono SemiBold" w:hAnsi="Cascadia Mono SemiBold" w:cs="Cascadia Mono SemiBold"/>
+                                <w:sz w:val="18"/>
+                                <w:szCs w:val="18"/>
                               </w:rPr>
                             </w:pPr>
                             <w:r>
                               <w:rPr>
                                 <w:rFonts w:ascii="Cascadia Mono SemiBold" w:hAnsi="Cascadia Mono SemiBold" w:cs="Cascadia Mono SemiBold"/>
+                                <w:sz w:val="18"/>
+                                <w:szCs w:val="18"/>
                               </w:rPr>
                               <w:t xml:space="preserve">    }</w:t>
                             </w:r>
@@ -15055,12 +15181,16 @@
                               <w:pStyle w:val="Sinespaciado"/>
                               <w:rPr>
                                 <w:rFonts w:ascii="Cascadia Mono SemiBold" w:hAnsi="Cascadia Mono SemiBold" w:cs="Cascadia Mono SemiBold"/>
+                                <w:sz w:val="18"/>
+                                <w:szCs w:val="18"/>
                                 <w:lang w:val="es-ES"/>
                               </w:rPr>
                             </w:pPr>
                             <w:r>
                               <w:rPr>
                                 <w:rFonts w:ascii="Cascadia Mono SemiBold" w:hAnsi="Cascadia Mono SemiBold" w:cs="Cascadia Mono SemiBold"/>
+                                <w:sz w:val="18"/>
+                                <w:szCs w:val="18"/>
                               </w:rPr>
                               <w:t>}</w:t>
                             </w:r>
@@ -15087,7 +15217,7 @@
           </mc:Choice>
           <mc:Fallback>
             <w:pict>
-              <v:rect w14:anchorId="0E8D1A1D" id="_x0000_s1034" style="position:absolute;left:0;text-align:left;margin-left:41.25pt;margin-top:14.75pt;width:505.3pt;height:245.25pt;z-index:251661312;visibility:visible;mso-wrap-style:square;mso-width-percent:0;mso-height-percent:0;mso-wrap-distance-left:9pt;mso-wrap-distance-top:0;mso-wrap-distance-right:9pt;mso-wrap-distance-bottom:0;mso-position-horizontal:absolute;mso-position-horizontal-relative:margin;mso-position-vertical:absolute;mso-position-vertical-relative:text;mso-width-percent:0;mso-height-percent:0;mso-width-relative:margin;mso-height-relative:margin;v-text-anchor:middle" o:gfxdata="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" fillcolor="black [3213]" strokecolor="black [3213]" strokeweight="2pt">
+              <v:rect w14:anchorId="0E8D1A1D" id="_x0000_s1034" style="position:absolute;left:0;text-align:left;margin-left:35.3pt;margin-top:14.55pt;width:486.5pt;height:175.25pt;z-index:251664384;visibility:visible;mso-wrap-style:square;mso-width-percent:0;mso-height-percent:0;mso-wrap-distance-left:9pt;mso-wrap-distance-top:0;mso-wrap-distance-right:9pt;mso-wrap-distance-bottom:0;mso-position-horizontal:absolute;mso-position-horizontal-relative:margin;mso-position-vertical:absolute;mso-position-vertical-relative:text;mso-width-percent:0;mso-height-percent:0;mso-width-relative:margin;mso-height-relative:margin;v-text-anchor:middle" o:gfxdata="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" fillcolor="black [3213]" strokecolor="black [3213]" strokeweight="2pt">
                 <v:textbox>
                   <w:txbxContent>
                     <w:p>
@@ -15095,11 +15225,15 @@
                         <w:pStyle w:val="Sinespaciado"/>
                         <w:rPr>
                           <w:rFonts w:ascii="Cascadia Mono SemiBold" w:hAnsi="Cascadia Mono SemiBold" w:cs="Cascadia Mono SemiBold"/>
+                          <w:sz w:val="18"/>
+                          <w:szCs w:val="18"/>
                         </w:rPr>
                       </w:pPr>
                       <w:r>
                         <w:rPr>
                           <w:rFonts w:ascii="Cascadia Mono SemiBold" w:hAnsi="Cascadia Mono SemiBold" w:cs="Cascadia Mono SemiBold"/>
+                          <w:sz w:val="18"/>
+                          <w:szCs w:val="18"/>
                         </w:rPr>
                         <w:t xml:space="preserve">import </w:t>
                       </w:r>
@@ -15108,6 +15242,8 @@
                       <w:r>
                         <w:rPr>
                           <w:rFonts w:ascii="Cascadia Mono SemiBold" w:hAnsi="Cascadia Mono SemiBold" w:cs="Cascadia Mono SemiBold"/>
+                          <w:sz w:val="18"/>
+                          <w:szCs w:val="18"/>
                         </w:rPr>
                         <w:t>java.io.Serializable</w:t>
                       </w:r>
@@ -15116,6 +15252,8 @@
                       <w:r>
                         <w:rPr>
                           <w:rFonts w:ascii="Cascadia Mono SemiBold" w:hAnsi="Cascadia Mono SemiBold" w:cs="Cascadia Mono SemiBold"/>
+                          <w:sz w:val="18"/>
+                          <w:szCs w:val="18"/>
                         </w:rPr>
                         <w:t>;</w:t>
                       </w:r>
@@ -15125,6 +15263,8 @@
                         <w:pStyle w:val="Sinespaciado"/>
                         <w:rPr>
                           <w:rFonts w:ascii="Cascadia Mono SemiBold" w:hAnsi="Cascadia Mono SemiBold" w:cs="Cascadia Mono SemiBold"/>
+                          <w:sz w:val="18"/>
+                          <w:szCs w:val="18"/>
                         </w:rPr>
                       </w:pPr>
                     </w:p>
@@ -15133,18 +15273,42 @@
                         <w:pStyle w:val="Sinespaciado"/>
                         <w:rPr>
                           <w:rFonts w:ascii="Cascadia Mono SemiBold" w:hAnsi="Cascadia Mono SemiBold" w:cs="Cascadia Mono SemiBold"/>
+                          <w:sz w:val="18"/>
+                          <w:szCs w:val="18"/>
                         </w:rPr>
                       </w:pPr>
+                      <w:proofErr w:type="spellStart"/>
                       <w:r>
                         <w:rPr>
                           <w:rFonts w:ascii="Cascadia Mono SemiBold" w:hAnsi="Cascadia Mono SemiBold" w:cs="Cascadia Mono SemiBold"/>
+                          <w:sz w:val="18"/>
+                          <w:szCs w:val="18"/>
                         </w:rPr>
-                        <w:t xml:space="preserve">class </w:t>
+                        <w:t>sta</w:t>
+                      </w:r>
+                      <w:r>
+                        <w:rPr>
+                          <w:rFonts w:ascii="Cascadia Mono SemiBold" w:hAnsi="Cascadia Mono SemiBold" w:cs="Cascadia Mono SemiBold"/>
+                          <w:sz w:val="18"/>
+                          <w:szCs w:val="18"/>
+                        </w:rPr>
+                        <w:t>class</w:t>
+                      </w:r>
+                      <w:proofErr w:type="spellEnd"/>
+                      <w:r>
+                        <w:rPr>
+                          <w:rFonts w:ascii="Cascadia Mono SemiBold" w:hAnsi="Cascadia Mono SemiBold" w:cs="Cascadia Mono SemiBold"/>
+                          <w:sz w:val="18"/>
+                          <w:szCs w:val="18"/>
+                        </w:rPr>
+                        <w:t xml:space="preserve"> </w:t>
                       </w:r>
                       <w:proofErr w:type="spellStart"/>
                       <w:r>
                         <w:rPr>
                           <w:rFonts w:ascii="Cascadia Mono SemiBold" w:hAnsi="Cascadia Mono SemiBold" w:cs="Cascadia Mono SemiBold"/>
+                          <w:sz w:val="18"/>
+                          <w:szCs w:val="18"/>
                         </w:rPr>
                         <w:t>BifrostSighting</w:t>
                       </w:r>
@@ -15152,6 +15316,8 @@
                       <w:r>
                         <w:rPr>
                           <w:rFonts w:ascii="Cascadia Mono SemiBold" w:hAnsi="Cascadia Mono SemiBold" w:cs="Cascadia Mono SemiBold"/>
+                          <w:sz w:val="18"/>
+                          <w:szCs w:val="18"/>
                         </w:rPr>
                         <w:t xml:space="preserve"> implements Serializable {</w:t>
                       </w:r>
@@ -15161,11 +15327,15 @@
                         <w:pStyle w:val="Sinespaciado"/>
                         <w:rPr>
                           <w:rFonts w:ascii="Cascadia Mono SemiBold" w:hAnsi="Cascadia Mono SemiBold" w:cs="Cascadia Mono SemiBold"/>
+                          <w:sz w:val="18"/>
+                          <w:szCs w:val="18"/>
                         </w:rPr>
                       </w:pPr>
                       <w:r>
                         <w:rPr>
                           <w:rFonts w:ascii="Cascadia Mono SemiBold" w:hAnsi="Cascadia Mono SemiBold" w:cs="Cascadia Mono SemiBold"/>
+                          <w:sz w:val="18"/>
+                          <w:szCs w:val="18"/>
                         </w:rPr>
                         <w:t xml:space="preserve">    private static final long </w:t>
                       </w:r>
@@ -15173,6 +15343,8 @@
                       <w:r>
                         <w:rPr>
                           <w:rFonts w:ascii="Cascadia Mono SemiBold" w:hAnsi="Cascadia Mono SemiBold" w:cs="Cascadia Mono SemiBold"/>
+                          <w:sz w:val="18"/>
+                          <w:szCs w:val="18"/>
                         </w:rPr>
                         <w:t>serialVersionUID</w:t>
                       </w:r>
@@ -15180,6 +15352,8 @@
                       <w:r>
                         <w:rPr>
                           <w:rFonts w:ascii="Cascadia Mono SemiBold" w:hAnsi="Cascadia Mono SemiBold" w:cs="Cascadia Mono SemiBold"/>
+                          <w:sz w:val="18"/>
+                          <w:szCs w:val="18"/>
                         </w:rPr>
                         <w:t xml:space="preserve"> = 1L;</w:t>
                       </w:r>
@@ -15189,11 +15363,15 @@
                         <w:pStyle w:val="Sinespaciado"/>
                         <w:rPr>
                           <w:rFonts w:ascii="Cascadia Mono SemiBold" w:hAnsi="Cascadia Mono SemiBold" w:cs="Cascadia Mono SemiBold"/>
+                          <w:sz w:val="18"/>
+                          <w:szCs w:val="18"/>
                         </w:rPr>
                       </w:pPr>
                       <w:r>
                         <w:rPr>
                           <w:rFonts w:ascii="Cascadia Mono SemiBold" w:hAnsi="Cascadia Mono SemiBold" w:cs="Cascadia Mono SemiBold"/>
+                          <w:sz w:val="18"/>
+                          <w:szCs w:val="18"/>
                         </w:rPr>
                         <w:t xml:space="preserve">    private String location;</w:t>
                       </w:r>
@@ -15203,11 +15381,15 @@
                         <w:pStyle w:val="Sinespaciado"/>
                         <w:rPr>
                           <w:rFonts w:ascii="Cascadia Mono SemiBold" w:hAnsi="Cascadia Mono SemiBold" w:cs="Cascadia Mono SemiBold"/>
+                          <w:sz w:val="18"/>
+                          <w:szCs w:val="18"/>
                         </w:rPr>
                       </w:pPr>
                       <w:r>
                         <w:rPr>
                           <w:rFonts w:ascii="Cascadia Mono SemiBold" w:hAnsi="Cascadia Mono SemiBold" w:cs="Cascadia Mono SemiBold"/>
+                          <w:sz w:val="18"/>
+                          <w:szCs w:val="18"/>
                         </w:rPr>
                         <w:t xml:space="preserve">    private int intensity;</w:t>
                       </w:r>
@@ -15217,6 +15399,8 @@
                         <w:pStyle w:val="Sinespaciado"/>
                         <w:rPr>
                           <w:rFonts w:ascii="Cascadia Mono SemiBold" w:hAnsi="Cascadia Mono SemiBold" w:cs="Cascadia Mono SemiBold"/>
+                          <w:sz w:val="18"/>
+                          <w:szCs w:val="18"/>
                         </w:rPr>
                       </w:pPr>
                     </w:p>
@@ -15225,11 +15409,15 @@
                         <w:pStyle w:val="Sinespaciado"/>
                         <w:rPr>
                           <w:rFonts w:ascii="Cascadia Mono SemiBold" w:hAnsi="Cascadia Mono SemiBold" w:cs="Cascadia Mono SemiBold"/>
+                          <w:sz w:val="18"/>
+                          <w:szCs w:val="18"/>
                         </w:rPr>
                       </w:pPr>
                       <w:r>
                         <w:rPr>
                           <w:rFonts w:ascii="Cascadia Mono SemiBold" w:hAnsi="Cascadia Mono SemiBold" w:cs="Cascadia Mono SemiBold"/>
+                          <w:sz w:val="18"/>
+                          <w:szCs w:val="18"/>
                         </w:rPr>
                         <w:t xml:space="preserve">    public </w:t>
                       </w:r>
@@ -15238,6 +15426,8 @@
                       <w:r>
                         <w:rPr>
                           <w:rFonts w:ascii="Cascadia Mono SemiBold" w:hAnsi="Cascadia Mono SemiBold" w:cs="Cascadia Mono SemiBold"/>
+                          <w:sz w:val="18"/>
+                          <w:szCs w:val="18"/>
                         </w:rPr>
                         <w:t>BifrostSighting</w:t>
                       </w:r>
@@ -15245,6 +15435,8 @@
                       <w:r>
                         <w:rPr>
                           <w:rFonts w:ascii="Cascadia Mono SemiBold" w:hAnsi="Cascadia Mono SemiBold" w:cs="Cascadia Mono SemiBold"/>
+                          <w:sz w:val="18"/>
+                          <w:szCs w:val="18"/>
                         </w:rPr>
                         <w:t>(</w:t>
                       </w:r>
@@ -15252,6 +15444,8 @@
                       <w:r>
                         <w:rPr>
                           <w:rFonts w:ascii="Cascadia Mono SemiBold" w:hAnsi="Cascadia Mono SemiBold" w:cs="Cascadia Mono SemiBold"/>
+                          <w:sz w:val="18"/>
+                          <w:szCs w:val="18"/>
                         </w:rPr>
                         <w:t>String location, int intensity) {</w:t>
                       </w:r>
@@ -15261,11 +15455,15 @@
                         <w:pStyle w:val="Sinespaciado"/>
                         <w:rPr>
                           <w:rFonts w:ascii="Cascadia Mono SemiBold" w:hAnsi="Cascadia Mono SemiBold" w:cs="Cascadia Mono SemiBold"/>
+                          <w:sz w:val="18"/>
+                          <w:szCs w:val="18"/>
                         </w:rPr>
                       </w:pPr>
                       <w:r>
                         <w:rPr>
                           <w:rFonts w:ascii="Cascadia Mono SemiBold" w:hAnsi="Cascadia Mono SemiBold" w:cs="Cascadia Mono SemiBold"/>
+                          <w:sz w:val="18"/>
+                          <w:szCs w:val="18"/>
                         </w:rPr>
                         <w:t xml:space="preserve">        </w:t>
                       </w:r>
@@ -15274,6 +15472,8 @@
                       <w:r>
                         <w:rPr>
                           <w:rFonts w:ascii="Cascadia Mono SemiBold" w:hAnsi="Cascadia Mono SemiBold" w:cs="Cascadia Mono SemiBold"/>
+                          <w:sz w:val="18"/>
+                          <w:szCs w:val="18"/>
                         </w:rPr>
                         <w:t>this.location</w:t>
                       </w:r>
@@ -15282,6 +15482,8 @@
                       <w:r>
                         <w:rPr>
                           <w:rFonts w:ascii="Cascadia Mono SemiBold" w:hAnsi="Cascadia Mono SemiBold" w:cs="Cascadia Mono SemiBold"/>
+                          <w:sz w:val="18"/>
+                          <w:szCs w:val="18"/>
                         </w:rPr>
                         <w:t xml:space="preserve"> = location;</w:t>
                       </w:r>
@@ -15291,11 +15493,15 @@
                         <w:pStyle w:val="Sinespaciado"/>
                         <w:rPr>
                           <w:rFonts w:ascii="Cascadia Mono SemiBold" w:hAnsi="Cascadia Mono SemiBold" w:cs="Cascadia Mono SemiBold"/>
+                          <w:sz w:val="18"/>
+                          <w:szCs w:val="18"/>
                         </w:rPr>
                       </w:pPr>
                       <w:r>
                         <w:rPr>
                           <w:rFonts w:ascii="Cascadia Mono SemiBold" w:hAnsi="Cascadia Mono SemiBold" w:cs="Cascadia Mono SemiBold"/>
+                          <w:sz w:val="18"/>
+                          <w:szCs w:val="18"/>
                         </w:rPr>
                         <w:t xml:space="preserve">        </w:t>
                       </w:r>
@@ -15304,6 +15510,8 @@
                       <w:r>
                         <w:rPr>
                           <w:rFonts w:ascii="Cascadia Mono SemiBold" w:hAnsi="Cascadia Mono SemiBold" w:cs="Cascadia Mono SemiBold"/>
+                          <w:sz w:val="18"/>
+                          <w:szCs w:val="18"/>
                         </w:rPr>
                         <w:t>this.intensity</w:t>
                       </w:r>
@@ -15312,6 +15520,8 @@
                       <w:r>
                         <w:rPr>
                           <w:rFonts w:ascii="Cascadia Mono SemiBold" w:hAnsi="Cascadia Mono SemiBold" w:cs="Cascadia Mono SemiBold"/>
+                          <w:sz w:val="18"/>
+                          <w:szCs w:val="18"/>
                         </w:rPr>
                         <w:t xml:space="preserve"> = intensity;</w:t>
                       </w:r>
@@ -15321,11 +15531,15 @@
                         <w:pStyle w:val="Sinespaciado"/>
                         <w:rPr>
                           <w:rFonts w:ascii="Cascadia Mono SemiBold" w:hAnsi="Cascadia Mono SemiBold" w:cs="Cascadia Mono SemiBold"/>
+                          <w:sz w:val="18"/>
+                          <w:szCs w:val="18"/>
                         </w:rPr>
                       </w:pPr>
                       <w:r>
                         <w:rPr>
                           <w:rFonts w:ascii="Cascadia Mono SemiBold" w:hAnsi="Cascadia Mono SemiBold" w:cs="Cascadia Mono SemiBold"/>
+                          <w:sz w:val="18"/>
+                          <w:szCs w:val="18"/>
                         </w:rPr>
                         <w:t xml:space="preserve">    }</w:t>
                       </w:r>
@@ -15335,6 +15549,8 @@
                         <w:pStyle w:val="Sinespaciado"/>
                         <w:rPr>
                           <w:rFonts w:ascii="Cascadia Mono SemiBold" w:hAnsi="Cascadia Mono SemiBold" w:cs="Cascadia Mono SemiBold"/>
+                          <w:sz w:val="18"/>
+                          <w:szCs w:val="18"/>
                         </w:rPr>
                       </w:pPr>
                     </w:p>
@@ -15343,11 +15559,15 @@
                         <w:pStyle w:val="Sinespaciado"/>
                         <w:rPr>
                           <w:rFonts w:ascii="Cascadia Mono SemiBold" w:hAnsi="Cascadia Mono SemiBold" w:cs="Cascadia Mono SemiBold"/>
+                          <w:sz w:val="18"/>
+                          <w:szCs w:val="18"/>
                         </w:rPr>
                       </w:pPr>
                       <w:r>
                         <w:rPr>
                           <w:rFonts w:ascii="Cascadia Mono SemiBold" w:hAnsi="Cascadia Mono SemiBold" w:cs="Cascadia Mono SemiBold"/>
+                          <w:sz w:val="18"/>
+                          <w:szCs w:val="18"/>
                         </w:rPr>
                         <w:t xml:space="preserve">    public String </w:t>
                       </w:r>
@@ -15356,6 +15576,8 @@
                       <w:r>
                         <w:rPr>
                           <w:rFonts w:ascii="Cascadia Mono SemiBold" w:hAnsi="Cascadia Mono SemiBold" w:cs="Cascadia Mono SemiBold"/>
+                          <w:sz w:val="18"/>
+                          <w:szCs w:val="18"/>
                         </w:rPr>
                         <w:t>toJson</w:t>
                       </w:r>
@@ -15363,6 +15585,8 @@
                       <w:r>
                         <w:rPr>
                           <w:rFonts w:ascii="Cascadia Mono SemiBold" w:hAnsi="Cascadia Mono SemiBold" w:cs="Cascadia Mono SemiBold"/>
+                          <w:sz w:val="18"/>
+                          <w:szCs w:val="18"/>
                         </w:rPr>
                         <w:t>(</w:t>
                       </w:r>
@@ -15370,6 +15594,8 @@
                       <w:r>
                         <w:rPr>
                           <w:rFonts w:ascii="Cascadia Mono SemiBold" w:hAnsi="Cascadia Mono SemiBold" w:cs="Cascadia Mono SemiBold"/>
+                          <w:sz w:val="18"/>
+                          <w:szCs w:val="18"/>
                         </w:rPr>
                         <w:t>) {</w:t>
                       </w:r>
@@ -15379,11 +15605,15 @@
                         <w:pStyle w:val="Sinespaciado"/>
                         <w:rPr>
                           <w:rFonts w:ascii="Cascadia Mono SemiBold" w:hAnsi="Cascadia Mono SemiBold" w:cs="Cascadia Mono SemiBold"/>
+                          <w:sz w:val="18"/>
+                          <w:szCs w:val="18"/>
                         </w:rPr>
                       </w:pPr>
                       <w:r>
                         <w:rPr>
                           <w:rFonts w:ascii="Cascadia Mono SemiBold" w:hAnsi="Cascadia Mono SemiBold" w:cs="Cascadia Mono SemiBold"/>
+                          <w:sz w:val="18"/>
+                          <w:szCs w:val="18"/>
                         </w:rPr>
                         <w:t xml:space="preserve">        return "{\"location\": \"" + location + "\", \"intensity\": " + intensity + "}";</w:t>
                       </w:r>
@@ -15393,11 +15623,15 @@
                         <w:pStyle w:val="Sinespaciado"/>
                         <w:rPr>
                           <w:rFonts w:ascii="Cascadia Mono SemiBold" w:hAnsi="Cascadia Mono SemiBold" w:cs="Cascadia Mono SemiBold"/>
+                          <w:sz w:val="18"/>
+                          <w:szCs w:val="18"/>
                         </w:rPr>
                       </w:pPr>
                       <w:r>
                         <w:rPr>
                           <w:rFonts w:ascii="Cascadia Mono SemiBold" w:hAnsi="Cascadia Mono SemiBold" w:cs="Cascadia Mono SemiBold"/>
+                          <w:sz w:val="18"/>
+                          <w:szCs w:val="18"/>
                         </w:rPr>
                         <w:t xml:space="preserve">    }</w:t>
                       </w:r>
@@ -15407,12 +15641,16 @@
                         <w:pStyle w:val="Sinespaciado"/>
                         <w:rPr>
                           <w:rFonts w:ascii="Cascadia Mono SemiBold" w:hAnsi="Cascadia Mono SemiBold" w:cs="Cascadia Mono SemiBold"/>
+                          <w:sz w:val="18"/>
+                          <w:szCs w:val="18"/>
                           <w:lang w:val="es-ES"/>
                         </w:rPr>
                       </w:pPr>
                       <w:r>
                         <w:rPr>
                           <w:rFonts w:ascii="Cascadia Mono SemiBold" w:hAnsi="Cascadia Mono SemiBold" w:cs="Cascadia Mono SemiBold"/>
+                          <w:sz w:val="18"/>
+                          <w:szCs w:val="18"/>
                         </w:rPr>
                         <w:t>}</w:t>
                       </w:r>
@@ -15546,11 +15784,17 @@
     <w:p>
       <w:pPr>
         <w:pStyle w:val="Sinespaciado"/>
-        <w:ind w:left="720"/>
-        <w:rPr>
-          <w:lang w:val="es-ES"/>
-        </w:rPr>
-      </w:pPr>
+        <w:ind w:firstLine="720"/>
+        <w:rPr>
+          <w:lang w:val="es-ES"/>
+        </w:rPr>
+      </w:pPr>
+      <w:r>
+        <w:rPr>
+          <w:lang w:val="es-ES"/>
+        </w:rPr>
+        <w:t>Y el nuevo método:</w:t>
+      </w:r>
     </w:p>
     <w:p>
       <w:pPr>
@@ -15560,164 +15804,11 @@
           <w:lang w:val="es-ES"/>
         </w:rPr>
       </w:pPr>
-    </w:p>
-    <w:p>
-      <w:pPr>
-        <w:pStyle w:val="Sinespaciado"/>
-        <w:ind w:left="720"/>
-        <w:rPr>
-          <w:lang w:val="es-ES"/>
-        </w:rPr>
-      </w:pPr>
-    </w:p>
-    <w:p>
-      <w:pPr>
-        <w:pStyle w:val="Sinespaciado"/>
-        <w:ind w:left="720"/>
-        <w:rPr>
-          <w:lang w:val="es-ES"/>
-        </w:rPr>
-      </w:pPr>
-    </w:p>
-    <w:p>
-      <w:pPr>
-        <w:pStyle w:val="Sinespaciado"/>
-        <w:ind w:left="720"/>
-        <w:rPr>
-          <w:lang w:val="es-ES"/>
-        </w:rPr>
-      </w:pPr>
-    </w:p>
-    <w:p>
-      <w:pPr>
-        <w:pStyle w:val="Sinespaciado"/>
-        <w:ind w:firstLine="720"/>
-        <w:rPr>
-          <w:lang w:val="es-ES"/>
-        </w:rPr>
-      </w:pPr>
-    </w:p>
-    <w:p>
-      <w:pPr>
-        <w:pStyle w:val="Sinespaciado"/>
-        <w:ind w:firstLine="720"/>
-        <w:rPr>
-          <w:lang w:val="es-ES"/>
-        </w:rPr>
-      </w:pPr>
-    </w:p>
-    <w:p>
-      <w:pPr>
-        <w:pStyle w:val="Sinespaciado"/>
-        <w:ind w:firstLine="720"/>
-        <w:rPr>
-          <w:lang w:val="es-ES"/>
-        </w:rPr>
-      </w:pPr>
-    </w:p>
-    <w:p>
-      <w:pPr>
-        <w:pStyle w:val="Sinespaciado"/>
-        <w:ind w:firstLine="720"/>
-        <w:rPr>
-          <w:lang w:val="es-ES"/>
-        </w:rPr>
-      </w:pPr>
-    </w:p>
-    <w:p>
-      <w:pPr>
-        <w:pStyle w:val="Sinespaciado"/>
-        <w:ind w:firstLine="720"/>
-        <w:rPr>
-          <w:lang w:val="es-ES"/>
-        </w:rPr>
-      </w:pPr>
-    </w:p>
-    <w:p>
-      <w:pPr>
-        <w:pStyle w:val="Sinespaciado"/>
-        <w:ind w:firstLine="720"/>
-        <w:rPr>
-          <w:lang w:val="es-ES"/>
-        </w:rPr>
-      </w:pPr>
-    </w:p>
-    <w:p>
-      <w:pPr>
-        <w:pStyle w:val="Sinespaciado"/>
-        <w:ind w:firstLine="720"/>
-        <w:rPr>
-          <w:lang w:val="es-ES"/>
-        </w:rPr>
-      </w:pPr>
-    </w:p>
-    <w:p>
-      <w:pPr>
-        <w:pStyle w:val="Sinespaciado"/>
-        <w:ind w:firstLine="720"/>
-        <w:rPr>
-          <w:lang w:val="es-ES"/>
-        </w:rPr>
-      </w:pPr>
-    </w:p>
-    <w:p>
-      <w:pPr>
-        <w:pStyle w:val="Sinespaciado"/>
-        <w:ind w:firstLine="720"/>
-        <w:rPr>
-          <w:lang w:val="es-ES"/>
-        </w:rPr>
-      </w:pPr>
-    </w:p>
-    <w:p>
-      <w:pPr>
-        <w:pStyle w:val="Sinespaciado"/>
-        <w:ind w:firstLine="720"/>
-        <w:rPr>
-          <w:lang w:val="es-ES"/>
-        </w:rPr>
-      </w:pPr>
-    </w:p>
-    <w:p>
-      <w:pPr>
-        <w:pStyle w:val="Sinespaciado"/>
-        <w:ind w:firstLine="720"/>
-        <w:rPr>
-          <w:lang w:val="es-ES"/>
-        </w:rPr>
-      </w:pPr>
-    </w:p>
-    <w:p>
-      <w:pPr>
-        <w:pStyle w:val="Sinespaciado"/>
-        <w:ind w:left="720"/>
-        <w:rPr>
-          <w:lang w:val="es-ES"/>
-        </w:rPr>
-      </w:pPr>
-      <w:r>
-        <w:rPr>
-          <w:lang w:val="es-ES"/>
-        </w:rPr>
-        <w:lastRenderedPageBreak/>
-        <w:t>Y el nuevo método:</w:t>
-      </w:r>
-    </w:p>
-    <w:p>
-      <w:pPr>
-        <w:pStyle w:val="Sinespaciado"/>
-        <w:ind w:left="720"/>
-      </w:pPr>
-      <w:r>
-        <w:t xml:space="preserve">Primero, </w:t>
-      </w:r>
-      <w:proofErr w:type="spellStart"/>
-      <w:r>
-        <w:t>una</w:t>
-      </w:r>
-      <w:proofErr w:type="spellEnd"/>
-      <w:r>
-        <w:t xml:space="preserve"> clase simple:</w:t>
+      <w:r>
+        <w:rPr>
+          <w:lang w:val="es-ES"/>
+        </w:rPr>
+        <w:t>Primero, una clase simple:</w:t>
       </w:r>
     </w:p>
     <w:p>
@@ -15744,16 +15835,16 @@
         <mc:AlternateContent>
           <mc:Choice Requires="wps">
             <w:drawing>
-              <wp:anchor distT="0" distB="0" distL="114300" distR="114300" simplePos="0" relativeHeight="251659264" behindDoc="0" locked="0" layoutInCell="1" allowOverlap="1" wp14:anchorId="3A77B857" wp14:editId="1F153980">
+              <wp:anchor distT="0" distB="0" distL="114300" distR="114300" simplePos="0" relativeHeight="251660288" behindDoc="0" locked="0" layoutInCell="1" allowOverlap="1" wp14:anchorId="3A77B857" wp14:editId="2CA7F91D">
                 <wp:simplePos x="0" y="0"/>
                 <wp:positionH relativeFrom="margin">
-                  <wp:posOffset>457200</wp:posOffset>
+                  <wp:posOffset>431321</wp:posOffset>
                 </wp:positionH>
                 <wp:positionV relativeFrom="paragraph">
-                  <wp:posOffset>5080</wp:posOffset>
+                  <wp:posOffset>6973</wp:posOffset>
                 </wp:positionV>
-                <wp:extent cx="6417310" cy="2809875"/>
-                <wp:effectExtent l="0" t="0" r="21590" b="28575"/>
+                <wp:extent cx="6417310" cy="2053087"/>
+                <wp:effectExtent l="0" t="0" r="21590" b="23495"/>
                 <wp:wrapNone/>
                 <wp:docPr id="317462727" name="Rectángulo 2"/>
                 <wp:cNvGraphicFramePr/>
@@ -15764,7 +15855,7 @@
                       <wps:spPr>
                         <a:xfrm>
                           <a:off x="0" y="0"/>
-                          <a:ext cx="6417310" cy="2809875"/>
+                          <a:ext cx="6417310" cy="2053087"/>
                         </a:xfrm>
                         <a:prstGeom prst="rect">
                           <a:avLst/>
@@ -15801,11 +15892,15 @@
                               <w:pStyle w:val="Sinespaciado"/>
                               <w:rPr>
                                 <w:rFonts w:ascii="Cascadia Mono SemiBold" w:hAnsi="Cascadia Mono SemiBold" w:cs="Cascadia Mono SemiBold"/>
+                                <w:sz w:val="20"/>
+                                <w:szCs w:val="20"/>
                               </w:rPr>
                             </w:pPr>
                             <w:r>
                               <w:rPr>
                                 <w:rFonts w:ascii="Cascadia Mono SemiBold" w:hAnsi="Cascadia Mono SemiBold" w:cs="Cascadia Mono SemiBold"/>
+                                <w:sz w:val="20"/>
+                                <w:szCs w:val="20"/>
                               </w:rPr>
                               <w:t>@GetMapping("/bifrost")</w:t>
                             </w:r>
@@ -15815,11 +15910,15 @@
                               <w:pStyle w:val="Sinespaciado"/>
                               <w:rPr>
                                 <w:rFonts w:ascii="Cascadia Mono SemiBold" w:hAnsi="Cascadia Mono SemiBold" w:cs="Cascadia Mono SemiBold"/>
+                                <w:sz w:val="20"/>
+                                <w:szCs w:val="20"/>
                               </w:rPr>
                             </w:pPr>
                             <w:r>
                               <w:rPr>
                                 <w:rFonts w:ascii="Cascadia Mono SemiBold" w:hAnsi="Cascadia Mono SemiBold" w:cs="Cascadia Mono SemiBold"/>
+                                <w:sz w:val="20"/>
+                                <w:szCs w:val="20"/>
                               </w:rPr>
                               <w:t xml:space="preserve">public String </w:t>
                             </w:r>
@@ -15828,6 +15927,8 @@
                             <w:r>
                               <w:rPr>
                                 <w:rFonts w:ascii="Cascadia Mono SemiBold" w:hAnsi="Cascadia Mono SemiBold" w:cs="Cascadia Mono SemiBold"/>
+                                <w:sz w:val="20"/>
+                                <w:szCs w:val="20"/>
                               </w:rPr>
                               <w:t>bifrostSighting</w:t>
                             </w:r>
@@ -15835,6 +15936,8 @@
                             <w:r>
                               <w:rPr>
                                 <w:rFonts w:ascii="Cascadia Mono SemiBold" w:hAnsi="Cascadia Mono SemiBold" w:cs="Cascadia Mono SemiBold"/>
+                                <w:sz w:val="20"/>
+                                <w:szCs w:val="20"/>
                               </w:rPr>
                               <w:t>(</w:t>
                             </w:r>
@@ -15842,6 +15945,8 @@
                             <w:r>
                               <w:rPr>
                                 <w:rFonts w:ascii="Cascadia Mono SemiBold" w:hAnsi="Cascadia Mono SemiBold" w:cs="Cascadia Mono SemiBold"/>
+                                <w:sz w:val="20"/>
+                                <w:szCs w:val="20"/>
                               </w:rPr>
                               <w:t>@RequestParam String location, @RequestParam int intensity) {</w:t>
                             </w:r>
@@ -15851,11 +15956,15 @@
                               <w:pStyle w:val="Sinespaciado"/>
                               <w:rPr>
                                 <w:rFonts w:ascii="Cascadia Mono SemiBold" w:hAnsi="Cascadia Mono SemiBold" w:cs="Cascadia Mono SemiBold"/>
+                                <w:sz w:val="20"/>
+                                <w:szCs w:val="20"/>
                               </w:rPr>
                             </w:pPr>
                             <w:r>
                               <w:rPr>
                                 <w:rFonts w:ascii="Cascadia Mono SemiBold" w:hAnsi="Cascadia Mono SemiBold" w:cs="Cascadia Mono SemiBold"/>
+                                <w:sz w:val="20"/>
+                                <w:szCs w:val="20"/>
                               </w:rPr>
                               <w:t xml:space="preserve">    try {</w:t>
                             </w:r>
@@ -15865,11 +15974,15 @@
                               <w:pStyle w:val="Sinespaciado"/>
                               <w:rPr>
                                 <w:rFonts w:ascii="Cascadia Mono SemiBold" w:hAnsi="Cascadia Mono SemiBold" w:cs="Cascadia Mono SemiBold"/>
+                                <w:sz w:val="20"/>
+                                <w:szCs w:val="20"/>
                               </w:rPr>
                             </w:pPr>
                             <w:r>
                               <w:rPr>
                                 <w:rFonts w:ascii="Cascadia Mono SemiBold" w:hAnsi="Cascadia Mono SemiBold" w:cs="Cascadia Mono SemiBold"/>
+                                <w:sz w:val="20"/>
+                                <w:szCs w:val="20"/>
                               </w:rPr>
                               <w:t xml:space="preserve">        if (intensity &lt;= 0) {</w:t>
                             </w:r>
@@ -15879,12 +15992,16 @@
                               <w:pStyle w:val="Sinespaciado"/>
                               <w:rPr>
                                 <w:rFonts w:ascii="Cascadia Mono SemiBold" w:hAnsi="Cascadia Mono SemiBold" w:cs="Cascadia Mono SemiBold"/>
+                                <w:sz w:val="20"/>
+                                <w:szCs w:val="20"/>
                                 <w:lang w:val="es-ES"/>
                               </w:rPr>
                             </w:pPr>
                             <w:r>
                               <w:rPr>
                                 <w:rFonts w:ascii="Cascadia Mono SemiBold" w:hAnsi="Cascadia Mono SemiBold" w:cs="Cascadia Mono SemiBold"/>
+                                <w:sz w:val="20"/>
+                                <w:szCs w:val="20"/>
                               </w:rPr>
                               <w:t xml:space="preserve">            </w:t>
                             </w:r>
@@ -15892,6 +16009,8 @@
                             <w:r>
                               <w:rPr>
                                 <w:rFonts w:ascii="Cascadia Mono SemiBold" w:hAnsi="Cascadia Mono SemiBold" w:cs="Cascadia Mono SemiBold"/>
+                                <w:sz w:val="20"/>
+                                <w:szCs w:val="20"/>
                                 <w:lang w:val="es-ES"/>
                               </w:rPr>
                               <w:t>throw</w:t>
@@ -15900,6 +16019,8 @@
                             <w:r>
                               <w:rPr>
                                 <w:rFonts w:ascii="Cascadia Mono SemiBold" w:hAnsi="Cascadia Mono SemiBold" w:cs="Cascadia Mono SemiBold"/>
+                                <w:sz w:val="20"/>
+                                <w:szCs w:val="20"/>
                                 <w:lang w:val="es-ES"/>
                               </w:rPr>
                               <w:t xml:space="preserve"> new </w:t>
@@ -15909,6 +16030,8 @@
                             <w:r>
                               <w:rPr>
                                 <w:rFonts w:ascii="Cascadia Mono SemiBold" w:hAnsi="Cascadia Mono SemiBold" w:cs="Cascadia Mono SemiBold"/>
+                                <w:sz w:val="20"/>
+                                <w:szCs w:val="20"/>
                                 <w:lang w:val="es-ES"/>
                               </w:rPr>
                               <w:t>IllegalArgumentException</w:t>
@@ -15917,6 +16040,8 @@
                             <w:r>
                               <w:rPr>
                                 <w:rFonts w:ascii="Cascadia Mono SemiBold" w:hAnsi="Cascadia Mono SemiBold" w:cs="Cascadia Mono SemiBold"/>
+                                <w:sz w:val="20"/>
+                                <w:szCs w:val="20"/>
                                 <w:lang w:val="es-ES"/>
                               </w:rPr>
                               <w:t>(</w:t>
@@ -15925,6 +16050,8 @@
                             <w:r>
                               <w:rPr>
                                 <w:rFonts w:ascii="Cascadia Mono SemiBold" w:hAnsi="Cascadia Mono SemiBold" w:cs="Cascadia Mono SemiBold"/>
+                                <w:sz w:val="20"/>
+                                <w:szCs w:val="20"/>
                                 <w:lang w:val="es-ES"/>
                               </w:rPr>
                               <w:t>"La intensidad debe ser positiva.");</w:t>
@@ -15935,11 +16062,15 @@
                               <w:pStyle w:val="Sinespaciado"/>
                               <w:rPr>
                                 <w:rFonts w:ascii="Cascadia Mono SemiBold" w:hAnsi="Cascadia Mono SemiBold" w:cs="Cascadia Mono SemiBold"/>
+                                <w:sz w:val="20"/>
+                                <w:szCs w:val="20"/>
                               </w:rPr>
                             </w:pPr>
                             <w:r>
                               <w:rPr>
                                 <w:rFonts w:ascii="Cascadia Mono SemiBold" w:hAnsi="Cascadia Mono SemiBold" w:cs="Cascadia Mono SemiBold"/>
+                                <w:sz w:val="20"/>
+                                <w:szCs w:val="20"/>
                                 <w:lang w:val="es-ES"/>
                               </w:rPr>
                               <w:t xml:space="preserve">        </w:t>
@@ -15947,6 +16078,8 @@
                             <w:r>
                               <w:rPr>
                                 <w:rFonts w:ascii="Cascadia Mono SemiBold" w:hAnsi="Cascadia Mono SemiBold" w:cs="Cascadia Mono SemiBold"/>
+                                <w:sz w:val="20"/>
+                                <w:szCs w:val="20"/>
                               </w:rPr>
                               <w:t>}</w:t>
                             </w:r>
@@ -15956,11 +16089,15 @@
                               <w:pStyle w:val="Sinespaciado"/>
                               <w:rPr>
                                 <w:rFonts w:ascii="Cascadia Mono SemiBold" w:hAnsi="Cascadia Mono SemiBold" w:cs="Cascadia Mono SemiBold"/>
+                                <w:sz w:val="20"/>
+                                <w:szCs w:val="20"/>
                               </w:rPr>
                             </w:pPr>
                             <w:r>
                               <w:rPr>
                                 <w:rFonts w:ascii="Cascadia Mono SemiBold" w:hAnsi="Cascadia Mono SemiBold" w:cs="Cascadia Mono SemiBold"/>
+                                <w:sz w:val="20"/>
+                                <w:szCs w:val="20"/>
                               </w:rPr>
                               <w:t xml:space="preserve">        </w:t>
                             </w:r>
@@ -15968,6 +16105,8 @@
                             <w:r>
                               <w:rPr>
                                 <w:rFonts w:ascii="Cascadia Mono SemiBold" w:hAnsi="Cascadia Mono SemiBold" w:cs="Cascadia Mono SemiBold"/>
+                                <w:sz w:val="20"/>
+                                <w:szCs w:val="20"/>
                               </w:rPr>
                               <w:t>BifrostSighting</w:t>
                             </w:r>
@@ -15975,6 +16114,8 @@
                             <w:r>
                               <w:rPr>
                                 <w:rFonts w:ascii="Cascadia Mono SemiBold" w:hAnsi="Cascadia Mono SemiBold" w:cs="Cascadia Mono SemiBold"/>
+                                <w:sz w:val="20"/>
+                                <w:szCs w:val="20"/>
                               </w:rPr>
                               <w:t xml:space="preserve"> sighting = new </w:t>
                             </w:r>
@@ -15983,6 +16124,8 @@
                             <w:r>
                               <w:rPr>
                                 <w:rFonts w:ascii="Cascadia Mono SemiBold" w:hAnsi="Cascadia Mono SemiBold" w:cs="Cascadia Mono SemiBold"/>
+                                <w:sz w:val="20"/>
+                                <w:szCs w:val="20"/>
                               </w:rPr>
                               <w:t>BifrostSighting</w:t>
                             </w:r>
@@ -15990,6 +16133,8 @@
                             <w:r>
                               <w:rPr>
                                 <w:rFonts w:ascii="Cascadia Mono SemiBold" w:hAnsi="Cascadia Mono SemiBold" w:cs="Cascadia Mono SemiBold"/>
+                                <w:sz w:val="20"/>
+                                <w:szCs w:val="20"/>
                               </w:rPr>
                               <w:t>(</w:t>
                             </w:r>
@@ -15997,6 +16142,8 @@
                             <w:r>
                               <w:rPr>
                                 <w:rFonts w:ascii="Cascadia Mono SemiBold" w:hAnsi="Cascadia Mono SemiBold" w:cs="Cascadia Mono SemiBold"/>
+                                <w:sz w:val="20"/>
+                                <w:szCs w:val="20"/>
                               </w:rPr>
                               <w:t>location, intensity);</w:t>
                             </w:r>
@@ -16006,11 +16153,15 @@
                               <w:pStyle w:val="Sinespaciado"/>
                               <w:rPr>
                                 <w:rFonts w:ascii="Cascadia Mono SemiBold" w:hAnsi="Cascadia Mono SemiBold" w:cs="Cascadia Mono SemiBold"/>
+                                <w:sz w:val="20"/>
+                                <w:szCs w:val="20"/>
                               </w:rPr>
                             </w:pPr>
                             <w:r>
                               <w:rPr>
                                 <w:rFonts w:ascii="Cascadia Mono SemiBold" w:hAnsi="Cascadia Mono SemiBold" w:cs="Cascadia Mono SemiBold"/>
+                                <w:sz w:val="20"/>
+                                <w:szCs w:val="20"/>
                               </w:rPr>
                               <w:t xml:space="preserve">        return "</w:t>
                             </w:r>
@@ -16018,6 +16169,8 @@
                             <w:r>
                               <w:rPr>
                                 <w:rFonts w:ascii="Cascadia Mono SemiBold" w:hAnsi="Cascadia Mono SemiBold" w:cs="Cascadia Mono SemiBold"/>
+                                <w:sz w:val="20"/>
+                                <w:szCs w:val="20"/>
                               </w:rPr>
                               <w:t>Avistamiento</w:t>
                             </w:r>
@@ -16025,6 +16178,8 @@
                             <w:r>
                               <w:rPr>
                                 <w:rFonts w:ascii="Cascadia Mono SemiBold" w:hAnsi="Cascadia Mono SemiBold" w:cs="Cascadia Mono SemiBold"/>
+                                <w:sz w:val="20"/>
+                                <w:szCs w:val="20"/>
                               </w:rPr>
                               <w:t xml:space="preserve"> </w:t>
                             </w:r>
@@ -16032,6 +16187,8 @@
                             <w:r>
                               <w:rPr>
                                 <w:rFonts w:ascii="Cascadia Mono SemiBold" w:hAnsi="Cascadia Mono SemiBold" w:cs="Cascadia Mono SemiBold"/>
+                                <w:sz w:val="20"/>
+                                <w:szCs w:val="20"/>
                               </w:rPr>
                               <w:t>registrado</w:t>
                             </w:r>
@@ -16039,6 +16196,8 @@
                             <w:r>
                               <w:rPr>
                                 <w:rFonts w:ascii="Cascadia Mono SemiBold" w:hAnsi="Cascadia Mono SemiBold" w:cs="Cascadia Mono SemiBold"/>
+                                <w:sz w:val="20"/>
+                                <w:szCs w:val="20"/>
                               </w:rPr>
                               <w:t xml:space="preserve">: " + </w:t>
                             </w:r>
@@ -16047,6 +16206,8 @@
                             <w:r>
                               <w:rPr>
                                 <w:rFonts w:ascii="Cascadia Mono SemiBold" w:hAnsi="Cascadia Mono SemiBold" w:cs="Cascadia Mono SemiBold"/>
+                                <w:sz w:val="20"/>
+                                <w:szCs w:val="20"/>
                               </w:rPr>
                               <w:t>sighting.toJson</w:t>
                             </w:r>
@@ -16055,6 +16216,8 @@
                             <w:r>
                               <w:rPr>
                                 <w:rFonts w:ascii="Cascadia Mono SemiBold" w:hAnsi="Cascadia Mono SemiBold" w:cs="Cascadia Mono SemiBold"/>
+                                <w:sz w:val="20"/>
+                                <w:szCs w:val="20"/>
                               </w:rPr>
                               <w:t>();</w:t>
                             </w:r>
@@ -16064,11 +16227,15 @@
                               <w:pStyle w:val="Sinespaciado"/>
                               <w:rPr>
                                 <w:rFonts w:ascii="Cascadia Mono SemiBold" w:hAnsi="Cascadia Mono SemiBold" w:cs="Cascadia Mono SemiBold"/>
+                                <w:sz w:val="20"/>
+                                <w:szCs w:val="20"/>
                               </w:rPr>
                             </w:pPr>
                             <w:r>
                               <w:rPr>
                                 <w:rFonts w:ascii="Cascadia Mono SemiBold" w:hAnsi="Cascadia Mono SemiBold" w:cs="Cascadia Mono SemiBold"/>
+                                <w:sz w:val="20"/>
+                                <w:szCs w:val="20"/>
                               </w:rPr>
                               <w:t xml:space="preserve">    } catch (</w:t>
                             </w:r>
@@ -16076,6 +16243,8 @@
                             <w:r>
                               <w:rPr>
                                 <w:rFonts w:ascii="Cascadia Mono SemiBold" w:hAnsi="Cascadia Mono SemiBold" w:cs="Cascadia Mono SemiBold"/>
+                                <w:sz w:val="20"/>
+                                <w:szCs w:val="20"/>
                               </w:rPr>
                               <w:t>IllegalArgumentException</w:t>
                             </w:r>
@@ -16083,6 +16252,8 @@
                             <w:r>
                               <w:rPr>
                                 <w:rFonts w:ascii="Cascadia Mono SemiBold" w:hAnsi="Cascadia Mono SemiBold" w:cs="Cascadia Mono SemiBold"/>
+                                <w:sz w:val="20"/>
+                                <w:szCs w:val="20"/>
                               </w:rPr>
                               <w:t xml:space="preserve"> e) {</w:t>
                             </w:r>
@@ -16092,11 +16263,15 @@
                               <w:pStyle w:val="Sinespaciado"/>
                               <w:rPr>
                                 <w:rFonts w:ascii="Cascadia Mono SemiBold" w:hAnsi="Cascadia Mono SemiBold" w:cs="Cascadia Mono SemiBold"/>
+                                <w:sz w:val="20"/>
+                                <w:szCs w:val="20"/>
                               </w:rPr>
                             </w:pPr>
                             <w:r>
                               <w:rPr>
                                 <w:rFonts w:ascii="Cascadia Mono SemiBold" w:hAnsi="Cascadia Mono SemiBold" w:cs="Cascadia Mono SemiBold"/>
+                                <w:sz w:val="20"/>
+                                <w:szCs w:val="20"/>
                               </w:rPr>
                               <w:t xml:space="preserve">        return "Error: " + </w:t>
                             </w:r>
@@ -16105,6 +16280,8 @@
                             <w:r>
                               <w:rPr>
                                 <w:rFonts w:ascii="Cascadia Mono SemiBold" w:hAnsi="Cascadia Mono SemiBold" w:cs="Cascadia Mono SemiBold"/>
+                                <w:sz w:val="20"/>
+                                <w:szCs w:val="20"/>
                               </w:rPr>
                               <w:t>e.getMessage</w:t>
                             </w:r>
@@ -16113,6 +16290,8 @@
                             <w:r>
                               <w:rPr>
                                 <w:rFonts w:ascii="Cascadia Mono SemiBold" w:hAnsi="Cascadia Mono SemiBold" w:cs="Cascadia Mono SemiBold"/>
+                                <w:sz w:val="20"/>
+                                <w:szCs w:val="20"/>
                               </w:rPr>
                               <w:t>();</w:t>
                             </w:r>
@@ -16122,11 +16301,15 @@
                               <w:pStyle w:val="Sinespaciado"/>
                               <w:rPr>
                                 <w:rFonts w:ascii="Cascadia Mono SemiBold" w:hAnsi="Cascadia Mono SemiBold" w:cs="Cascadia Mono SemiBold"/>
+                                <w:sz w:val="20"/>
+                                <w:szCs w:val="20"/>
                               </w:rPr>
                             </w:pPr>
                             <w:r>
                               <w:rPr>
                                 <w:rFonts w:ascii="Cascadia Mono SemiBold" w:hAnsi="Cascadia Mono SemiBold" w:cs="Cascadia Mono SemiBold"/>
+                                <w:sz w:val="20"/>
+                                <w:szCs w:val="20"/>
                               </w:rPr>
                               <w:t xml:space="preserve">    }</w:t>
                             </w:r>
@@ -16136,12 +16319,16 @@
                               <w:pStyle w:val="Sinespaciado"/>
                               <w:rPr>
                                 <w:rFonts w:ascii="Cascadia Mono SemiBold" w:hAnsi="Cascadia Mono SemiBold" w:cs="Cascadia Mono SemiBold"/>
+                                <w:sz w:val="20"/>
+                                <w:szCs w:val="20"/>
                                 <w:lang w:val="es-ES"/>
                               </w:rPr>
                             </w:pPr>
                             <w:r>
                               <w:rPr>
                                 <w:rFonts w:ascii="Cascadia Mono SemiBold" w:hAnsi="Cascadia Mono SemiBold" w:cs="Cascadia Mono SemiBold"/>
+                                <w:sz w:val="20"/>
+                                <w:szCs w:val="20"/>
                               </w:rPr>
                               <w:t>}</w:t>
                             </w:r>
@@ -16168,7 +16355,7 @@
           </mc:Choice>
           <mc:Fallback>
             <w:pict>
-              <v:rect w14:anchorId="3A77B857" id="_x0000_s1035" style="position:absolute;left:0;text-align:left;margin-left:36pt;margin-top:.4pt;width:505.3pt;height:221.25pt;z-index:251659264;visibility:visible;mso-wrap-style:square;mso-width-percent:0;mso-height-percent:0;mso-wrap-distance-left:9pt;mso-wrap-distance-top:0;mso-wrap-distance-right:9pt;mso-wrap-distance-bottom:0;mso-position-horizontal:absolute;mso-position-horizontal-relative:margin;mso-position-vertical:absolute;mso-position-vertical-relative:text;mso-width-percent:0;mso-height-percent:0;mso-width-relative:margin;mso-height-relative:margin;v-text-anchor:middle" o:gfxdata="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" fillcolor="black [3213]" strokecolor="black [3213]" strokeweight="2pt">
+              <v:rect w14:anchorId="3A77B857" id="_x0000_s1035" style="position:absolute;left:0;text-align:left;margin-left:33.95pt;margin-top:.55pt;width:505.3pt;height:161.65pt;z-index:251660288;visibility:visible;mso-wrap-style:square;mso-width-percent:0;mso-height-percent:0;mso-wrap-distance-left:9pt;mso-wrap-distance-top:0;mso-wrap-distance-right:9pt;mso-wrap-distance-bottom:0;mso-position-horizontal:absolute;mso-position-horizontal-relative:margin;mso-position-vertical:absolute;mso-position-vertical-relative:text;mso-width-percent:0;mso-height-percent:0;mso-width-relative:margin;mso-height-relative:margin;v-text-anchor:middle" o:gfxdata="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" fillcolor="black [3213]" strokecolor="black [3213]" strokeweight="2pt">
                 <v:textbox>
                   <w:txbxContent>
                     <w:p>
@@ -16176,11 +16363,15 @@
                         <w:pStyle w:val="Sinespaciado"/>
                         <w:rPr>
                           <w:rFonts w:ascii="Cascadia Mono SemiBold" w:hAnsi="Cascadia Mono SemiBold" w:cs="Cascadia Mono SemiBold"/>
+                          <w:sz w:val="20"/>
+                          <w:szCs w:val="20"/>
                         </w:rPr>
                       </w:pPr>
                       <w:r>
                         <w:rPr>
                           <w:rFonts w:ascii="Cascadia Mono SemiBold" w:hAnsi="Cascadia Mono SemiBold" w:cs="Cascadia Mono SemiBold"/>
+                          <w:sz w:val="20"/>
+                          <w:szCs w:val="20"/>
                         </w:rPr>
                         <w:t>@GetMapping("/bifrost")</w:t>
                       </w:r>
@@ -16190,11 +16381,15 @@
                         <w:pStyle w:val="Sinespaciado"/>
                         <w:rPr>
                           <w:rFonts w:ascii="Cascadia Mono SemiBold" w:hAnsi="Cascadia Mono SemiBold" w:cs="Cascadia Mono SemiBold"/>
+                          <w:sz w:val="20"/>
+                          <w:szCs w:val="20"/>
                         </w:rPr>
                       </w:pPr>
                       <w:r>
                         <w:rPr>
                           <w:rFonts w:ascii="Cascadia Mono SemiBold" w:hAnsi="Cascadia Mono SemiBold" w:cs="Cascadia Mono SemiBold"/>
+                          <w:sz w:val="20"/>
+                          <w:szCs w:val="20"/>
                         </w:rPr>
                         <w:t xml:space="preserve">public String </w:t>
                       </w:r>
@@ -16203,6 +16398,8 @@
                       <w:r>
                         <w:rPr>
                           <w:rFonts w:ascii="Cascadia Mono SemiBold" w:hAnsi="Cascadia Mono SemiBold" w:cs="Cascadia Mono SemiBold"/>
+                          <w:sz w:val="20"/>
+                          <w:szCs w:val="20"/>
                         </w:rPr>
                         <w:t>bifrostSighting</w:t>
                       </w:r>
@@ -16210,6 +16407,8 @@
                       <w:r>
                         <w:rPr>
                           <w:rFonts w:ascii="Cascadia Mono SemiBold" w:hAnsi="Cascadia Mono SemiBold" w:cs="Cascadia Mono SemiBold"/>
+                          <w:sz w:val="20"/>
+                          <w:szCs w:val="20"/>
                         </w:rPr>
                         <w:t>(</w:t>
                       </w:r>
@@ -16217,6 +16416,8 @@
                       <w:r>
                         <w:rPr>
                           <w:rFonts w:ascii="Cascadia Mono SemiBold" w:hAnsi="Cascadia Mono SemiBold" w:cs="Cascadia Mono SemiBold"/>
+                          <w:sz w:val="20"/>
+                          <w:szCs w:val="20"/>
                         </w:rPr>
                         <w:t>@RequestParam String location, @RequestParam int intensity) {</w:t>
                       </w:r>
@@ -16226,11 +16427,15 @@
                         <w:pStyle w:val="Sinespaciado"/>
                         <w:rPr>
                           <w:rFonts w:ascii="Cascadia Mono SemiBold" w:hAnsi="Cascadia Mono SemiBold" w:cs="Cascadia Mono SemiBold"/>
+                          <w:sz w:val="20"/>
+                          <w:szCs w:val="20"/>
                         </w:rPr>
                       </w:pPr>
                       <w:r>
                         <w:rPr>
                           <w:rFonts w:ascii="Cascadia Mono SemiBold" w:hAnsi="Cascadia Mono SemiBold" w:cs="Cascadia Mono SemiBold"/>
+                          <w:sz w:val="20"/>
+                          <w:szCs w:val="20"/>
                         </w:rPr>
                         <w:t xml:space="preserve">    try {</w:t>
                       </w:r>
@@ -16240,11 +16445,15 @@
                         <w:pStyle w:val="Sinespaciado"/>
                         <w:rPr>
                           <w:rFonts w:ascii="Cascadia Mono SemiBold" w:hAnsi="Cascadia Mono SemiBold" w:cs="Cascadia Mono SemiBold"/>
+                          <w:sz w:val="20"/>
+                          <w:szCs w:val="20"/>
                         </w:rPr>
                       </w:pPr>
                       <w:r>
                         <w:rPr>
                           <w:rFonts w:ascii="Cascadia Mono SemiBold" w:hAnsi="Cascadia Mono SemiBold" w:cs="Cascadia Mono SemiBold"/>
+                          <w:sz w:val="20"/>
+                          <w:szCs w:val="20"/>
                         </w:rPr>
                         <w:t xml:space="preserve">        if (intensity &lt;= 0) {</w:t>
                       </w:r>
@@ -16254,12 +16463,16 @@
                         <w:pStyle w:val="Sinespaciado"/>
                         <w:rPr>
                           <w:rFonts w:ascii="Cascadia Mono SemiBold" w:hAnsi="Cascadia Mono SemiBold" w:cs="Cascadia Mono SemiBold"/>
+                          <w:sz w:val="20"/>
+                          <w:szCs w:val="20"/>
                           <w:lang w:val="es-ES"/>
                         </w:rPr>
                       </w:pPr>
                       <w:r>
                         <w:rPr>
                           <w:rFonts w:ascii="Cascadia Mono SemiBold" w:hAnsi="Cascadia Mono SemiBold" w:cs="Cascadia Mono SemiBold"/>
+                          <w:sz w:val="20"/>
+                          <w:szCs w:val="20"/>
                         </w:rPr>
                         <w:t xml:space="preserve">            </w:t>
                       </w:r>
@@ -16267,6 +16480,8 @@
                       <w:r>
                         <w:rPr>
                           <w:rFonts w:ascii="Cascadia Mono SemiBold" w:hAnsi="Cascadia Mono SemiBold" w:cs="Cascadia Mono SemiBold"/>
+                          <w:sz w:val="20"/>
+                          <w:szCs w:val="20"/>
                           <w:lang w:val="es-ES"/>
                         </w:rPr>
                         <w:t>throw</w:t>
@@ -16275,6 +16490,8 @@
                       <w:r>
                         <w:rPr>
                           <w:rFonts w:ascii="Cascadia Mono SemiBold" w:hAnsi="Cascadia Mono SemiBold" w:cs="Cascadia Mono SemiBold"/>
+                          <w:sz w:val="20"/>
+                          <w:szCs w:val="20"/>
                           <w:lang w:val="es-ES"/>
                         </w:rPr>
                         <w:t xml:space="preserve"> new </w:t>
@@ -16284,6 +16501,8 @@
                       <w:r>
                         <w:rPr>
                           <w:rFonts w:ascii="Cascadia Mono SemiBold" w:hAnsi="Cascadia Mono SemiBold" w:cs="Cascadia Mono SemiBold"/>
+                          <w:sz w:val="20"/>
+                          <w:szCs w:val="20"/>
                           <w:lang w:val="es-ES"/>
                         </w:rPr>
                         <w:t>IllegalArgumentException</w:t>
@@ -16292,6 +16511,8 @@
                       <w:r>
                         <w:rPr>
                           <w:rFonts w:ascii="Cascadia Mono SemiBold" w:hAnsi="Cascadia Mono SemiBold" w:cs="Cascadia Mono SemiBold"/>
+                          <w:sz w:val="20"/>
+                          <w:szCs w:val="20"/>
                           <w:lang w:val="es-ES"/>
                         </w:rPr>
                         <w:t>(</w:t>
@@ -16300,6 +16521,8 @@
                       <w:r>
                         <w:rPr>
                           <w:rFonts w:ascii="Cascadia Mono SemiBold" w:hAnsi="Cascadia Mono SemiBold" w:cs="Cascadia Mono SemiBold"/>
+                          <w:sz w:val="20"/>
+                          <w:szCs w:val="20"/>
                           <w:lang w:val="es-ES"/>
                         </w:rPr>
                         <w:t>"La intensidad debe ser positiva.");</w:t>
@@ -16310,11 +16533,15 @@
                         <w:pStyle w:val="Sinespaciado"/>
                         <w:rPr>
                           <w:rFonts w:ascii="Cascadia Mono SemiBold" w:hAnsi="Cascadia Mono SemiBold" w:cs="Cascadia Mono SemiBold"/>
+                          <w:sz w:val="20"/>
+                          <w:szCs w:val="20"/>
                         </w:rPr>
                       </w:pPr>
                       <w:r>
                         <w:rPr>
                           <w:rFonts w:ascii="Cascadia Mono SemiBold" w:hAnsi="Cascadia Mono SemiBold" w:cs="Cascadia Mono SemiBold"/>
+                          <w:sz w:val="20"/>
+                          <w:szCs w:val="20"/>
                           <w:lang w:val="es-ES"/>
                         </w:rPr>
                         <w:t xml:space="preserve">        </w:t>
@@ -16322,6 +16549,8 @@
                       <w:r>
                         <w:rPr>
                           <w:rFonts w:ascii="Cascadia Mono SemiBold" w:hAnsi="Cascadia Mono SemiBold" w:cs="Cascadia Mono SemiBold"/>
+                          <w:sz w:val="20"/>
+                          <w:szCs w:val="20"/>
                         </w:rPr>
                         <w:t>}</w:t>
                       </w:r>
@@ -16331,11 +16560,15 @@
                         <w:pStyle w:val="Sinespaciado"/>
                         <w:rPr>
                           <w:rFonts w:ascii="Cascadia Mono SemiBold" w:hAnsi="Cascadia Mono SemiBold" w:cs="Cascadia Mono SemiBold"/>
+                          <w:sz w:val="20"/>
+                          <w:szCs w:val="20"/>
                         </w:rPr>
                       </w:pPr>
                       <w:r>
                         <w:rPr>
                           <w:rFonts w:ascii="Cascadia Mono SemiBold" w:hAnsi="Cascadia Mono SemiBold" w:cs="Cascadia Mono SemiBold"/>
+                          <w:sz w:val="20"/>
+                          <w:szCs w:val="20"/>
                         </w:rPr>
                         <w:t xml:space="preserve">        </w:t>
                       </w:r>
@@ -16343,6 +16576,8 @@
                       <w:r>
                         <w:rPr>
                           <w:rFonts w:ascii="Cascadia Mono SemiBold" w:hAnsi="Cascadia Mono SemiBold" w:cs="Cascadia Mono SemiBold"/>
+                          <w:sz w:val="20"/>
+                          <w:szCs w:val="20"/>
                         </w:rPr>
                         <w:t>BifrostSighting</w:t>
                       </w:r>
@@ -16350,6 +16585,8 @@
                       <w:r>
                         <w:rPr>
                           <w:rFonts w:ascii="Cascadia Mono SemiBold" w:hAnsi="Cascadia Mono SemiBold" w:cs="Cascadia Mono SemiBold"/>
+                          <w:sz w:val="20"/>
+                          <w:szCs w:val="20"/>
                         </w:rPr>
                         <w:t xml:space="preserve"> sighting = new </w:t>
                       </w:r>
@@ -16358,6 +16595,8 @@
                       <w:r>
                         <w:rPr>
                           <w:rFonts w:ascii="Cascadia Mono SemiBold" w:hAnsi="Cascadia Mono SemiBold" w:cs="Cascadia Mono SemiBold"/>
+                          <w:sz w:val="20"/>
+                          <w:szCs w:val="20"/>
                         </w:rPr>
                         <w:t>BifrostSighting</w:t>
                       </w:r>
@@ -16365,6 +16604,8 @@
                       <w:r>
                         <w:rPr>
                           <w:rFonts w:ascii="Cascadia Mono SemiBold" w:hAnsi="Cascadia Mono SemiBold" w:cs="Cascadia Mono SemiBold"/>
+                          <w:sz w:val="20"/>
+                          <w:szCs w:val="20"/>
                         </w:rPr>
                         <w:t>(</w:t>
                       </w:r>
@@ -16372,6 +16613,8 @@
                       <w:r>
                         <w:rPr>
                           <w:rFonts w:ascii="Cascadia Mono SemiBold" w:hAnsi="Cascadia Mono SemiBold" w:cs="Cascadia Mono SemiBold"/>
+                          <w:sz w:val="20"/>
+                          <w:szCs w:val="20"/>
                         </w:rPr>
                         <w:t>location, intensity);</w:t>
                       </w:r>
@@ -16381,11 +16624,15 @@
                         <w:pStyle w:val="Sinespaciado"/>
                         <w:rPr>
                           <w:rFonts w:ascii="Cascadia Mono SemiBold" w:hAnsi="Cascadia Mono SemiBold" w:cs="Cascadia Mono SemiBold"/>
+                          <w:sz w:val="20"/>
+                          <w:szCs w:val="20"/>
                         </w:rPr>
                       </w:pPr>
                       <w:r>
                         <w:rPr>
                           <w:rFonts w:ascii="Cascadia Mono SemiBold" w:hAnsi="Cascadia Mono SemiBold" w:cs="Cascadia Mono SemiBold"/>
+                          <w:sz w:val="20"/>
+                          <w:szCs w:val="20"/>
                         </w:rPr>
                         <w:t xml:space="preserve">        return "</w:t>
                       </w:r>
@@ -16393,6 +16640,8 @@
                       <w:r>
                         <w:rPr>
                           <w:rFonts w:ascii="Cascadia Mono SemiBold" w:hAnsi="Cascadia Mono SemiBold" w:cs="Cascadia Mono SemiBold"/>
+                          <w:sz w:val="20"/>
+                          <w:szCs w:val="20"/>
                         </w:rPr>
                         <w:t>Avistamiento</w:t>
                       </w:r>
@@ -16400,6 +16649,8 @@
                       <w:r>
                         <w:rPr>
                           <w:rFonts w:ascii="Cascadia Mono SemiBold" w:hAnsi="Cascadia Mono SemiBold" w:cs="Cascadia Mono SemiBold"/>
+                          <w:sz w:val="20"/>
+                          <w:szCs w:val="20"/>
                         </w:rPr>
                         <w:t xml:space="preserve"> </w:t>
                       </w:r>
@@ -16407,6 +16658,8 @@
                       <w:r>
                         <w:rPr>
                           <w:rFonts w:ascii="Cascadia Mono SemiBold" w:hAnsi="Cascadia Mono SemiBold" w:cs="Cascadia Mono SemiBold"/>
+                          <w:sz w:val="20"/>
+                          <w:szCs w:val="20"/>
                         </w:rPr>
                         <w:t>registrado</w:t>
                       </w:r>
@@ -16414,6 +16667,8 @@
                       <w:r>
                         <w:rPr>
                           <w:rFonts w:ascii="Cascadia Mono SemiBold" w:hAnsi="Cascadia Mono SemiBold" w:cs="Cascadia Mono SemiBold"/>
+                          <w:sz w:val="20"/>
+                          <w:szCs w:val="20"/>
                         </w:rPr>
                         <w:t xml:space="preserve">: " + </w:t>
                       </w:r>
@@ -16422,6 +16677,8 @@
                       <w:r>
                         <w:rPr>
                           <w:rFonts w:ascii="Cascadia Mono SemiBold" w:hAnsi="Cascadia Mono SemiBold" w:cs="Cascadia Mono SemiBold"/>
+                          <w:sz w:val="20"/>
+                          <w:szCs w:val="20"/>
                         </w:rPr>
                         <w:t>sighting.toJson</w:t>
                       </w:r>
@@ -16430,6 +16687,8 @@
                       <w:r>
                         <w:rPr>
                           <w:rFonts w:ascii="Cascadia Mono SemiBold" w:hAnsi="Cascadia Mono SemiBold" w:cs="Cascadia Mono SemiBold"/>
+                          <w:sz w:val="20"/>
+                          <w:szCs w:val="20"/>
                         </w:rPr>
                         <w:t>();</w:t>
                       </w:r>
@@ -16439,11 +16698,15 @@
                         <w:pStyle w:val="Sinespaciado"/>
                         <w:rPr>
                           <w:rFonts w:ascii="Cascadia Mono SemiBold" w:hAnsi="Cascadia Mono SemiBold" w:cs="Cascadia Mono SemiBold"/>
+                          <w:sz w:val="20"/>
+                          <w:szCs w:val="20"/>
                         </w:rPr>
                       </w:pPr>
                       <w:r>
                         <w:rPr>
                           <w:rFonts w:ascii="Cascadia Mono SemiBold" w:hAnsi="Cascadia Mono SemiBold" w:cs="Cascadia Mono SemiBold"/>
+                          <w:sz w:val="20"/>
+                          <w:szCs w:val="20"/>
                         </w:rPr>
                         <w:t xml:space="preserve">    } catch (</w:t>
                       </w:r>
@@ -16451,6 +16714,8 @@
                       <w:r>
                         <w:rPr>
                           <w:rFonts w:ascii="Cascadia Mono SemiBold" w:hAnsi="Cascadia Mono SemiBold" w:cs="Cascadia Mono SemiBold"/>
+                          <w:sz w:val="20"/>
+                          <w:szCs w:val="20"/>
                         </w:rPr>
                         <w:t>IllegalArgumentException</w:t>
                       </w:r>
@@ -16458,6 +16723,8 @@
                       <w:r>
                         <w:rPr>
                           <w:rFonts w:ascii="Cascadia Mono SemiBold" w:hAnsi="Cascadia Mono SemiBold" w:cs="Cascadia Mono SemiBold"/>
+                          <w:sz w:val="20"/>
+                          <w:szCs w:val="20"/>
                         </w:rPr>
                         <w:t xml:space="preserve"> e) {</w:t>
                       </w:r>
@@ -16467,11 +16734,15 @@
                         <w:pStyle w:val="Sinespaciado"/>
                         <w:rPr>
                           <w:rFonts w:ascii="Cascadia Mono SemiBold" w:hAnsi="Cascadia Mono SemiBold" w:cs="Cascadia Mono SemiBold"/>
+                          <w:sz w:val="20"/>
+                          <w:szCs w:val="20"/>
                         </w:rPr>
                       </w:pPr>
                       <w:r>
                         <w:rPr>
                           <w:rFonts w:ascii="Cascadia Mono SemiBold" w:hAnsi="Cascadia Mono SemiBold" w:cs="Cascadia Mono SemiBold"/>
+                          <w:sz w:val="20"/>
+                          <w:szCs w:val="20"/>
                         </w:rPr>
                         <w:t xml:space="preserve">        return "Error: " + </w:t>
                       </w:r>
@@ -16480,6 +16751,8 @@
                       <w:r>
                         <w:rPr>
                           <w:rFonts w:ascii="Cascadia Mono SemiBold" w:hAnsi="Cascadia Mono SemiBold" w:cs="Cascadia Mono SemiBold"/>
+                          <w:sz w:val="20"/>
+                          <w:szCs w:val="20"/>
                         </w:rPr>
                         <w:t>e.getMessage</w:t>
                       </w:r>
@@ -16488,6 +16761,8 @@
                       <w:r>
                         <w:rPr>
                           <w:rFonts w:ascii="Cascadia Mono SemiBold" w:hAnsi="Cascadia Mono SemiBold" w:cs="Cascadia Mono SemiBold"/>
+                          <w:sz w:val="20"/>
+                          <w:szCs w:val="20"/>
                         </w:rPr>
                         <w:t>();</w:t>
                       </w:r>
@@ -16497,11 +16772,15 @@
                         <w:pStyle w:val="Sinespaciado"/>
                         <w:rPr>
                           <w:rFonts w:ascii="Cascadia Mono SemiBold" w:hAnsi="Cascadia Mono SemiBold" w:cs="Cascadia Mono SemiBold"/>
+                          <w:sz w:val="20"/>
+                          <w:szCs w:val="20"/>
                         </w:rPr>
                       </w:pPr>
                       <w:r>
                         <w:rPr>
                           <w:rFonts w:ascii="Cascadia Mono SemiBold" w:hAnsi="Cascadia Mono SemiBold" w:cs="Cascadia Mono SemiBold"/>
+                          <w:sz w:val="20"/>
+                          <w:szCs w:val="20"/>
                         </w:rPr>
                         <w:t xml:space="preserve">    }</w:t>
                       </w:r>
@@ -16511,12 +16790,16 @@
                         <w:pStyle w:val="Sinespaciado"/>
                         <w:rPr>
                           <w:rFonts w:ascii="Cascadia Mono SemiBold" w:hAnsi="Cascadia Mono SemiBold" w:cs="Cascadia Mono SemiBold"/>
+                          <w:sz w:val="20"/>
+                          <w:szCs w:val="20"/>
                           <w:lang w:val="es-ES"/>
                         </w:rPr>
                       </w:pPr>
                       <w:r>
                         <w:rPr>
                           <w:rFonts w:ascii="Cascadia Mono SemiBold" w:hAnsi="Cascadia Mono SemiBold" w:cs="Cascadia Mono SemiBold"/>
+                          <w:sz w:val="20"/>
+                          <w:szCs w:val="20"/>
                         </w:rPr>
                         <w:t>}</w:t>
                       </w:r>
@@ -16623,7 +16906,6 @@
     <w:p>
       <w:pPr>
         <w:pStyle w:val="Sinespaciado"/>
-        <w:ind w:left="720"/>
         <w:rPr>
           <w:lang w:val="es-ES"/>
         </w:rPr>
@@ -16646,37 +16928,11 @@
           <w:lang w:val="es-ES"/>
         </w:rPr>
       </w:pPr>
-    </w:p>
-    <w:p>
-      <w:pPr>
-        <w:pStyle w:val="Sinespaciado"/>
-        <w:ind w:left="720"/>
-        <w:rPr>
-          <w:lang w:val="es-ES"/>
-        </w:rPr>
-      </w:pPr>
-    </w:p>
-    <w:p>
-      <w:pPr>
-        <w:pStyle w:val="Sinespaciado"/>
-        <w:ind w:left="720"/>
-        <w:rPr>
-          <w:lang w:val="es-ES"/>
-        </w:rPr>
-      </w:pPr>
-    </w:p>
-    <w:p>
-      <w:pPr>
-        <w:pStyle w:val="Sinespaciado"/>
-        <w:ind w:left="720"/>
-        <w:rPr>
-          <w:lang w:val="es-ES"/>
-        </w:rPr>
-      </w:pPr>
-      <w:r>
-        <w:rPr>
-          <w:lang w:val="es-ES"/>
-        </w:rPr>
+      <w:r>
+        <w:rPr>
+          <w:lang w:val="es-ES"/>
+        </w:rPr>
+        <w:lastRenderedPageBreak/>
         <w:t xml:space="preserve">No necesitas </w:t>
       </w:r>
       <w:proofErr w:type="spellStart"/>
@@ -17111,16 +17367,16 @@
         <mc:AlternateContent>
           <mc:Choice Requires="wps">
             <w:drawing>
-              <wp:anchor distT="0" distB="0" distL="114300" distR="114300" simplePos="0" relativeHeight="251662336" behindDoc="0" locked="0" layoutInCell="1" allowOverlap="1" wp14:anchorId="785DDB1C" wp14:editId="4C18A5A6">
+              <wp:anchor distT="0" distB="0" distL="114300" distR="114300" simplePos="0" relativeHeight="251666432" behindDoc="0" locked="0" layoutInCell="1" allowOverlap="1" wp14:anchorId="785DDB1C" wp14:editId="13003A25">
                 <wp:simplePos x="0" y="0"/>
                 <wp:positionH relativeFrom="margin">
-                  <wp:posOffset>457363</wp:posOffset>
+                  <wp:posOffset>457200</wp:posOffset>
                 </wp:positionH>
                 <wp:positionV relativeFrom="paragraph">
-                  <wp:posOffset>15712</wp:posOffset>
+                  <wp:posOffset>14162</wp:posOffset>
                 </wp:positionV>
-                <wp:extent cx="5923280" cy="571500"/>
-                <wp:effectExtent l="0" t="0" r="20320" b="19050"/>
+                <wp:extent cx="5923280" cy="517585"/>
+                <wp:effectExtent l="0" t="0" r="20320" b="15875"/>
                 <wp:wrapNone/>
                 <wp:docPr id="1607954678" name="Rectángulo 2"/>
                 <wp:cNvGraphicFramePr/>
@@ -17131,7 +17387,7 @@
                       <wps:spPr>
                         <a:xfrm>
                           <a:off x="0" y="0"/>
-                          <a:ext cx="5923280" cy="571500"/>
+                          <a:ext cx="5923280" cy="517585"/>
                         </a:xfrm>
                         <a:prstGeom prst="rect">
                           <a:avLst/>
@@ -17243,7 +17499,7 @@
           </mc:Choice>
           <mc:Fallback>
             <w:pict>
-              <v:rect w14:anchorId="785DDB1C" id="_x0000_s1036" style="position:absolute;margin-left:36pt;margin-top:1.25pt;width:466.4pt;height:45pt;z-index:251662336;visibility:visible;mso-wrap-style:square;mso-width-percent:0;mso-height-percent:0;mso-wrap-distance-left:9pt;mso-wrap-distance-top:0;mso-wrap-distance-right:9pt;mso-wrap-distance-bottom:0;mso-position-horizontal:absolute;mso-position-horizontal-relative:margin;mso-position-vertical:absolute;mso-position-vertical-relative:text;mso-width-percent:0;mso-height-percent:0;mso-width-relative:margin;mso-height-relative:margin;v-text-anchor:middle" o:gfxdata="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" fillcolor="black [3213]" strokecolor="black [3213]" strokeweight="2pt">
+              <v:rect w14:anchorId="785DDB1C" id="_x0000_s1036" style="position:absolute;margin-left:36pt;margin-top:1.1pt;width:466.4pt;height:40.75pt;z-index:251666432;visibility:visible;mso-wrap-style:square;mso-width-percent:0;mso-height-percent:0;mso-wrap-distance-left:9pt;mso-wrap-distance-top:0;mso-wrap-distance-right:9pt;mso-wrap-distance-bottom:0;mso-position-horizontal:absolute;mso-position-horizontal-relative:margin;mso-position-vertical:absolute;mso-position-vertical-relative:text;mso-width-percent:0;mso-height-percent:0;mso-width-relative:margin;mso-height-relative:margin;v-text-anchor:middle" o:gfxdata="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" fillcolor="black [3213]" strokecolor="black [3213]" strokeweight="2pt">
                 <v:textbox>
                   <w:txbxContent>
                     <w:p>
@@ -17349,7 +17605,7 @@
         <w:ind w:left="0" w:firstLine="622"/>
       </w:pPr>
       <w:bookmarkStart w:id="23" w:name="_bookmark11"/>
-      <w:bookmarkStart w:id="24" w:name="_Toc236321505"/>
+      <w:bookmarkStart w:id="24" w:name="_Toc236740702"/>
       <w:bookmarkEnd w:id="23"/>
       <w:r>
         <w:lastRenderedPageBreak/>
@@ -18429,7 +18685,7 @@
       <mc:AlternateContent>
         <mc:Choice Requires="wps">
           <w:drawing>
-            <wp:anchor distT="0" distB="0" distL="0" distR="0" simplePos="0" relativeHeight="251657216" behindDoc="1" locked="0" layoutInCell="1" allowOverlap="1" wp14:anchorId="7F3710B3" wp14:editId="7E88B01D">
+            <wp:anchor distT="0" distB="0" distL="0" distR="0" simplePos="0" relativeHeight="251656192" behindDoc="1" locked="0" layoutInCell="1" allowOverlap="1" wp14:anchorId="7F3710B3" wp14:editId="7E88B01D">
               <wp:simplePos x="0" y="0"/>
               <wp:positionH relativeFrom="page">
                 <wp:posOffset>1098067</wp:posOffset>
@@ -18509,7 +18765,7 @@
         </mc:Choice>
         <mc:Fallback>
           <w:pict>
-            <v:shape w14:anchorId="5679C5D3" id="Graphic 4" o:spid="_x0000_s1026" style="position:absolute;margin-left:86.45pt;margin-top:719.75pt;width:476.5pt;height:25.2pt;z-index:-251659264;visibility:visible;mso-wrap-style:square;mso-wrap-distance-left:0;mso-wrap-distance-top:0;mso-wrap-distance-right:0;mso-wrap-distance-bottom:0;mso-position-horizontal:absolute;mso-position-horizontal-relative:page;mso-position-vertical:absolute;mso-position-vertical-relative:page;v-text-anchor:top" coordsize="6051550,320040" o:gfxdata="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" path="m6051397,l5594197,,,12,,18605r5594197,l5594197,320040r457200,l6051397,xe" fillcolor="black" stroked="f">
+            <v:shape w14:anchorId="7B2ABE5A" id="Graphic 4" o:spid="_x0000_s1026" style="position:absolute;margin-left:86.45pt;margin-top:719.75pt;width:476.5pt;height:25.2pt;z-index:-251660288;visibility:visible;mso-wrap-style:square;mso-wrap-distance-left:0;mso-wrap-distance-top:0;mso-wrap-distance-right:0;mso-wrap-distance-bottom:0;mso-position-horizontal:absolute;mso-position-horizontal-relative:page;mso-position-vertical:absolute;mso-position-vertical-relative:page;v-text-anchor:top" coordsize="6051550,320040" o:gfxdata="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" path="m6051397,l5594197,,,12,,18605r5594197,l5594197,320040r457200,l6051397,xe" fillcolor="black" stroked="f">
               <v:path arrowok="t"/>
               <w10:wrap anchorx="page" anchory="page"/>
             </v:shape>
@@ -18525,7 +18781,7 @@
       <mc:AlternateContent>
         <mc:Choice Requires="wps">
           <w:drawing>
-            <wp:anchor distT="0" distB="0" distL="0" distR="0" simplePos="0" relativeHeight="251658240" behindDoc="1" locked="0" layoutInCell="1" allowOverlap="1" wp14:anchorId="5CD949EF" wp14:editId="16F64A57">
+            <wp:anchor distT="0" distB="0" distL="0" distR="0" simplePos="0" relativeHeight="251659264" behindDoc="1" locked="0" layoutInCell="1" allowOverlap="1" wp14:anchorId="5CD949EF" wp14:editId="16F64A57">
               <wp:simplePos x="0" y="0"/>
               <wp:positionH relativeFrom="page">
                 <wp:posOffset>6837680</wp:posOffset>
@@ -18623,7 +18879,7 @@
               <v:stroke joinstyle="miter"/>
               <v:path gradientshapeok="t" o:connecttype="rect"/>
             </v:shapetype>
-            <v:shape id="Textbox 5" o:spid="_x0000_s1038" type="#_x0000_t202" style="position:absolute;margin-left:538.4pt;margin-top:723.9pt;width:19.9pt;height:19.15pt;z-index:-251658240;visibility:visible;mso-wrap-style:square;mso-wrap-distance-left:0;mso-wrap-distance-top:0;mso-wrap-distance-right:0;mso-wrap-distance-bottom:0;mso-position-horizontal:absolute;mso-position-horizontal-relative:page;mso-position-vertical:absolute;mso-position-vertical-relative:page;v-text-anchor:top" o:gfxdata="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" filled="f" stroked="f">
+            <v:shape id="Textbox 5" o:spid="_x0000_s1038" type="#_x0000_t202" style="position:absolute;margin-left:538.4pt;margin-top:723.9pt;width:19.9pt;height:19.15pt;z-index:-251657216;visibility:visible;mso-wrap-style:square;mso-wrap-distance-left:0;mso-wrap-distance-top:0;mso-wrap-distance-right:0;mso-wrap-distance-bottom:0;mso-position-horizontal:absolute;mso-position-horizontal-relative:page;mso-position-vertical:absolute;mso-position-vertical-relative:page;v-text-anchor:top" o:gfxdata="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" filled="f" stroked="f">
               <v:textbox inset="0,0,0,0">
                 <w:txbxContent>
                   <w:p>

</xml_diff>